<commit_message>
docs(user-education): add "What CSW Solves" section on lateral movement and ransomware
Mirrors the README content directly inside the guide so readers who open
only the DOCX or PDF still get the lateral-movement and ransomware
framing. Existing sections were renumbered 3-12 to keep the new
"What CSW Solves" content as section 2.

Regenerated CSW-User-Education-Guide.docx and .pdf (13 pages).

Co-authored-by: Cursor <cursoragent@cursor.com>
</commit_message>
<xml_diff>
--- a/docs/user-education/CSW-User-Education-Guide.docx
+++ b/docs/user-education/CSW-User-Education-Guide.docx
@@ -60,7 +60,7 @@
         </w:p>
       </w:sdtContent>
     </w:sdt>
-    <w:bookmarkStart w:id="34" w:name="X92ee979ebdbb38d988228e1ce971d57f1b349ff"/>
+    <w:bookmarkStart w:id="38" w:name="X92ee979ebdbb38d988228e1ce971d57f1b349ff"/>
     <w:p>
       <w:pPr>
         <w:pStyle w:val="Heading1"/>
@@ -240,13 +240,13 @@
       </w:r>
     </w:p>
     <w:bookmarkEnd w:id="10"/>
-    <w:bookmarkStart w:id="11" w:name="X6cc877f24cfeb3d1bbeead4279318f963eb9e0d"/>
+    <w:bookmarkStart w:id="14" w:name="X65a3ca2c4eb11e28f1c01acdfed178fb2c5bbdd"/>
     <w:p>
       <w:pPr>
         <w:pStyle w:val="Heading2"/>
       </w:pPr>
       <w:r>
-        <w:t xml:space="preserve">2. Why Customers Care</w:t>
+        <w:t xml:space="preserve">2. What CSW Solves: Lateral Movement and Ransomware</w:t>
       </w:r>
     </w:p>
     <w:p>
@@ -254,7 +254,7 @@
         <w:pStyle w:val="FirstParagraph"/>
       </w:pPr>
       <w:r>
-        <w:t xml:space="preserve">Customers usually evaluate CSW because they need to reduce lateral movement risk without breaking applications. Traditional network segmentation often depends on VLANs, subnets, firewall zones, or static IP lists. That model becomes difficult when applications span data centers, public cloud, containers, and shared services.</w:t>
+        <w:t xml:space="preserve">Cisco Secure Workload exists to break the assumption that an attacker who gets inside the network can move freely. Most enterprise networks are still relatively flat at the workload layer — once one server is compromised through a phishing link, an exposed admin port, a vulnerable web app, or a stolen credential, the attacker can usually reach hundreds of other servers, file shares, and databases over the same internal network paths that legitimate applications use.</w:t>
       </w:r>
     </w:p>
     <w:p>
@@ -262,7 +262,53 @@
         <w:pStyle w:val="BodyText"/>
       </w:pPr>
       <w:r>
-        <w:t xml:space="preserve">CSW helps customers:</w:t>
+        <w:t xml:space="preserve">CSW reduces the</w:t>
+      </w:r>
+      <w:r>
+        <w:t xml:space="preserve"> </w:t>
+      </w:r>
+      <w:r>
+        <w:rPr>
+          <w:b/>
+          <w:bCs/>
+        </w:rPr>
+        <w:t xml:space="preserve">blast radius</w:t>
+      </w:r>
+      <w:r>
+        <w:t xml:space="preserve"> </w:t>
+      </w:r>
+      <w:r>
+        <w:t xml:space="preserve">of an intrusion by limiting each workload to</w:t>
+      </w:r>
+      <w:r>
+        <w:t xml:space="preserve"> </w:t>
+      </w:r>
+      <w:r>
+        <w:rPr>
+          <w:b/>
+          <w:bCs/>
+        </w:rPr>
+        <w:t xml:space="preserve">only the communication it actually needs</w:t>
+      </w:r>
+      <w:r>
+        <w:t xml:space="preserve">, based on real observed application behavior.</w:t>
+      </w:r>
+    </w:p>
+    <w:bookmarkStart w:id="11" w:name="X2ac810635cc91a37a9eb992deb3575abc311cf5"/>
+    <w:p>
+      <w:pPr>
+        <w:pStyle w:val="Heading3"/>
+      </w:pPr>
+      <w:r>
+        <w:t xml:space="preserve">2.1 The Lateral Movement Problem</w:t>
+      </w:r>
+    </w:p>
+    <w:p>
+      <w:pPr>
+        <w:pStyle w:val="FirstParagraph"/>
+      </w:pPr>
+      <w:r>
+        <w:t xml:space="preserve">After initial access, modern attackers and most ransomware operators follow a predictable pattern:</w:t>
       </w:r>
     </w:p>
     <w:p>
@@ -274,7 +320,17 @@
         </w:numPr>
       </w:pPr>
       <w:r>
-        <w:t xml:space="preserve">Discover application dependencies before enforcing policy.</w:t>
+        <w:rPr>
+          <w:b/>
+          <w:bCs/>
+        </w:rPr>
+        <w:t xml:space="preserve">Land on one workload</w:t>
+      </w:r>
+      <w:r>
+        <w:t xml:space="preserve"> </w:t>
+      </w:r>
+      <w:r>
+        <w:t xml:space="preserve">— phishing, exposed RDP / SSH, exploited service, supply chain.</w:t>
       </w:r>
     </w:p>
     <w:p>
@@ -286,7 +342,17 @@
         </w:numPr>
       </w:pPr>
       <w:r>
-        <w:t xml:space="preserve">Build policies based on labels and application intent, not only IP addresses.</w:t>
+        <w:rPr>
+          <w:b/>
+          <w:bCs/>
+        </w:rPr>
+        <w:t xml:space="preserve">Discover the internal network</w:t>
+      </w:r>
+      <w:r>
+        <w:t xml:space="preserve"> </w:t>
+      </w:r>
+      <w:r>
+        <w:t xml:space="preserve">— port scans, SMB enumeration, Active Directory reconnaissance.</w:t>
       </w:r>
     </w:p>
     <w:p>
@@ -298,7 +364,17 @@
         </w:numPr>
       </w:pPr>
       <w:r>
-        <w:t xml:space="preserve">Protect high-value or vulnerable applications with tighter controls.</w:t>
+        <w:rPr>
+          <w:b/>
+          <w:bCs/>
+        </w:rPr>
+        <w:t xml:space="preserve">Steal credentials</w:t>
+      </w:r>
+      <w:r>
+        <w:t xml:space="preserve"> </w:t>
+      </w:r>
+      <w:r>
+        <w:t xml:space="preserve">— Mimikatz, LSASS dumps, Kerberoasting.</w:t>
       </w:r>
     </w:p>
     <w:p>
@@ -310,7 +386,17 @@
         </w:numPr>
       </w:pPr>
       <w:r>
-        <w:t xml:space="preserve">Align policy with CMDB data, cloud tags, application ownership, and observed behavior.</w:t>
+        <w:rPr>
+          <w:b/>
+          <w:bCs/>
+        </w:rPr>
+        <w:t xml:space="preserve">Move laterally</w:t>
+      </w:r>
+      <w:r>
+        <w:t xml:space="preserve"> </w:t>
+      </w:r>
+      <w:r>
+        <w:t xml:space="preserve">— RDP, SMB, WinRM, WMI, PsExec, SSH, RPC, and other lateral admin tools.</w:t>
       </w:r>
     </w:p>
     <w:p>
@@ -322,7 +408,17 @@
         </w:numPr>
       </w:pPr>
       <w:r>
-        <w:t xml:space="preserve">Roll out segmentation in phases, starting with visibility and policy modeling.</w:t>
+        <w:rPr>
+          <w:b/>
+          <w:bCs/>
+        </w:rPr>
+        <w:t xml:space="preserve">Escalate to high-value targets</w:t>
+      </w:r>
+      <w:r>
+        <w:t xml:space="preserve"> </w:t>
+      </w:r>
+      <w:r>
+        <w:t xml:space="preserve">— domain controllers, backup servers, file servers, databases, hypervisors.</w:t>
       </w:r>
     </w:p>
     <w:p>
@@ -334,24 +430,176 @@
         </w:numPr>
       </w:pPr>
       <w:r>
-        <w:t xml:space="preserve">Produce evidence for security, audit, and architecture teams.</w:t>
-      </w:r>
-    </w:p>
-    <w:p>
-      <w:r>
-        <w:pict>
-          <v:rect style="width:0;height:1.5pt" o:hralign="center" o:hrstd="t" o:hr="t"/>
-        </w:pict>
+        <w:rPr>
+          <w:b/>
+          <w:bCs/>
+        </w:rPr>
+        <w:t xml:space="preserve">Stage and detonate the payload</w:t>
+      </w:r>
+      <w:r>
+        <w:t xml:space="preserve"> </w:t>
+      </w:r>
+      <w:r>
+        <w:t xml:space="preserve">— ransomware, data exfiltration, destruction.</w:t>
+      </w:r>
+    </w:p>
+    <w:p>
+      <w:pPr>
+        <w:pStyle w:val="FirstParagraph"/>
+      </w:pPr>
+      <w:r>
+        <w:t xml:space="preserve">Steps 2 through 5</w:t>
+      </w:r>
+      <w:r>
+        <w:t xml:space="preserve"> </w:t>
+      </w:r>
+      <w:r>
+        <w:rPr>
+          <w:b/>
+          <w:bCs/>
+        </w:rPr>
+        <w:t xml:space="preserve">all depend on the network allowing workload-to-workload traffic that no business application actually requires</w:t>
+      </w:r>
+      <w:r>
+        <w:t xml:space="preserve">. That is exactly the layer CSW controls.</w:t>
       </w:r>
     </w:p>
     <w:bookmarkEnd w:id="11"/>
-    <w:bookmarkStart w:id="12" w:name="Xf8bc4f7f09210fb294f9c5a98ec0e3893a381b9"/>
-    <w:p>
-      <w:pPr>
-        <w:pStyle w:val="Heading2"/>
-      </w:pPr>
-      <w:r>
-        <w:t xml:space="preserve">3. Core CSW Concepts for Users</w:t>
+    <w:bookmarkStart w:id="12" w:name="Xb1d8714a4ed6d6d7ec0c5c8c1f72995bb9cb45d"/>
+    <w:p>
+      <w:pPr>
+        <w:pStyle w:val="Heading3"/>
+      </w:pPr>
+      <w:r>
+        <w:t xml:space="preserve">2.2 How CSW Stops or Slows Ransomware</w:t>
+      </w:r>
+    </w:p>
+    <w:p>
+      <w:pPr>
+        <w:pStyle w:val="FirstParagraph"/>
+      </w:pPr>
+      <w:r>
+        <w:t xml:space="preserve">Ransomware groups make money by encrypting many systems in a short time window. They depend on:</w:t>
+      </w:r>
+    </w:p>
+    <w:p>
+      <w:pPr>
+        <w:pStyle w:val="Compact"/>
+        <w:numPr>
+          <w:ilvl w:val="0"/>
+          <w:numId w:val="1003"/>
+        </w:numPr>
+      </w:pPr>
+      <w:r>
+        <w:t xml:space="preserve">Unrestricted</w:t>
+      </w:r>
+      <w:r>
+        <w:t xml:space="preserve"> </w:t>
+      </w:r>
+      <w:r>
+        <w:rPr>
+          <w:b/>
+          <w:bCs/>
+        </w:rPr>
+        <w:t xml:space="preserve">SMB / file share access</w:t>
+      </w:r>
+      <w:r>
+        <w:t xml:space="preserve"> </w:t>
+      </w:r>
+      <w:r>
+        <w:t xml:space="preserve">between workstations and servers.</w:t>
+      </w:r>
+    </w:p>
+    <w:p>
+      <w:pPr>
+        <w:pStyle w:val="Compact"/>
+        <w:numPr>
+          <w:ilvl w:val="0"/>
+          <w:numId w:val="1003"/>
+        </w:numPr>
+      </w:pPr>
+      <w:r>
+        <w:t xml:space="preserve">Open</w:t>
+      </w:r>
+      <w:r>
+        <w:t xml:space="preserve"> </w:t>
+      </w:r>
+      <w:r>
+        <w:rPr>
+          <w:b/>
+          <w:bCs/>
+        </w:rPr>
+        <w:t xml:space="preserve">RDP / WinRM / WMI / PsExec</w:t>
+      </w:r>
+      <w:r>
+        <w:t xml:space="preserve"> </w:t>
+      </w:r>
+      <w:r>
+        <w:t xml:space="preserve">paths between servers.</w:t>
+      </w:r>
+    </w:p>
+    <w:p>
+      <w:pPr>
+        <w:pStyle w:val="Compact"/>
+        <w:numPr>
+          <w:ilvl w:val="0"/>
+          <w:numId w:val="1003"/>
+        </w:numPr>
+      </w:pPr>
+      <w:r>
+        <w:t xml:space="preserve">Reachable</w:t>
+      </w:r>
+      <w:r>
+        <w:t xml:space="preserve"> </w:t>
+      </w:r>
+      <w:r>
+        <w:rPr>
+          <w:b/>
+          <w:bCs/>
+        </w:rPr>
+        <w:t xml:space="preserve">backup servers, file servers, and hypervisors</w:t>
+      </w:r>
+      <w:r>
+        <w:t xml:space="preserve"> </w:t>
+      </w:r>
+      <w:r>
+        <w:t xml:space="preserve">from compromised endpoints.</w:t>
+      </w:r>
+    </w:p>
+    <w:p>
+      <w:pPr>
+        <w:pStyle w:val="Compact"/>
+        <w:numPr>
+          <w:ilvl w:val="0"/>
+          <w:numId w:val="1003"/>
+        </w:numPr>
+      </w:pPr>
+      <w:r>
+        <w:t xml:space="preserve">Free</w:t>
+      </w:r>
+      <w:r>
+        <w:t xml:space="preserve"> </w:t>
+      </w:r>
+      <w:r>
+        <w:rPr>
+          <w:b/>
+          <w:bCs/>
+        </w:rPr>
+        <w:t xml:space="preserve">east-west traffic</w:t>
+      </w:r>
+      <w:r>
+        <w:t xml:space="preserve"> </w:t>
+      </w:r>
+      <w:r>
+        <w:t xml:space="preserve">that lets the malware fan out before defenders can react.</w:t>
+      </w:r>
+    </w:p>
+    <w:p>
+      <w:pPr>
+        <w:pStyle w:val="FirstParagraph"/>
+      </w:pPr>
+      <w:r>
+        <w:t xml:space="preserve">CSW directly attacks each of those preconditions:</w:t>
       </w:r>
     </w:p>
     <w:tbl>
@@ -375,6 +623,494 @@
               <w:pStyle w:val="Compact"/>
             </w:pPr>
             <w:r>
+              <w:t xml:space="preserve">Ransomware behavior</w:t>
+            </w:r>
+          </w:p>
+        </w:tc>
+        <w:tc>
+          <w:tcPr/>
+          <w:p>
+            <w:pPr>
+              <w:pStyle w:val="Compact"/>
+            </w:pPr>
+            <w:r>
+              <w:t xml:space="preserve">What CSW does about it</w:t>
+            </w:r>
+          </w:p>
+        </w:tc>
+      </w:tr>
+      <w:tr>
+        <w:tc>
+          <w:tcPr/>
+          <w:p>
+            <w:pPr>
+              <w:pStyle w:val="Compact"/>
+            </w:pPr>
+            <w:r>
+              <w:t xml:space="preserve">SMB / RDP / WinRM fan-out from a compromised workload</w:t>
+            </w:r>
+          </w:p>
+        </w:tc>
+        <w:tc>
+          <w:tcPr/>
+          <w:p>
+            <w:pPr>
+              <w:pStyle w:val="Compact"/>
+            </w:pPr>
+            <w:r>
+              <w:t xml:space="preserve">Allow only application-required ports between specific workload groups; deny lateral admin protocols by default.</w:t>
+            </w:r>
+          </w:p>
+        </w:tc>
+      </w:tr>
+      <w:tr>
+        <w:tc>
+          <w:tcPr/>
+          <w:p>
+            <w:pPr>
+              <w:pStyle w:val="Compact"/>
+            </w:pPr>
+            <w:r>
+              <w:t xml:space="preserve">Mass file-share encryption</w:t>
+            </w:r>
+          </w:p>
+        </w:tc>
+        <w:tc>
+          <w:tcPr/>
+          <w:p>
+            <w:pPr>
+              <w:pStyle w:val="Compact"/>
+            </w:pPr>
+            <w:r>
+              <w:t xml:space="preserve">Restrict file-server access to the specific workloads, users, and processes that genuinely need it.</w:t>
+            </w:r>
+          </w:p>
+        </w:tc>
+      </w:tr>
+      <w:tr>
+        <w:tc>
+          <w:tcPr/>
+          <w:p>
+            <w:pPr>
+              <w:pStyle w:val="Compact"/>
+            </w:pPr>
+            <w:r>
+              <w:t xml:space="preserve">Reaching backup or recovery systems</w:t>
+            </w:r>
+          </w:p>
+        </w:tc>
+        <w:tc>
+          <w:tcPr/>
+          <w:p>
+            <w:pPr>
+              <w:pStyle w:val="Compact"/>
+            </w:pPr>
+            <w:r>
+              <w:t xml:space="preserve">Place backup servers in their own scope; permit traffic only from backup agents, not from general workloads.</w:t>
+            </w:r>
+          </w:p>
+        </w:tc>
+      </w:tr>
+      <w:tr>
+        <w:tc>
+          <w:tcPr/>
+          <w:p>
+            <w:pPr>
+              <w:pStyle w:val="Compact"/>
+            </w:pPr>
+            <w:r>
+              <w:t xml:space="preserve">Reaching domain controllers or identity tier</w:t>
+            </w:r>
+          </w:p>
+        </w:tc>
+        <w:tc>
+          <w:tcPr/>
+          <w:p>
+            <w:pPr>
+              <w:pStyle w:val="Compact"/>
+            </w:pPr>
+            <w:r>
+              <w:t xml:space="preserve">Scope the identity / Active Directory tier so only required clients and admin jump hosts can reach it.</w:t>
+            </w:r>
+          </w:p>
+        </w:tc>
+      </w:tr>
+      <w:tr>
+        <w:tc>
+          <w:tcPr/>
+          <w:p>
+            <w:pPr>
+              <w:pStyle w:val="Compact"/>
+            </w:pPr>
+            <w:r>
+              <w:t xml:space="preserve">Hopping between application tiers</w:t>
+            </w:r>
+          </w:p>
+        </w:tc>
+        <w:tc>
+          <w:tcPr/>
+          <w:p>
+            <w:pPr>
+              <w:pStyle w:val="Compact"/>
+            </w:pPr>
+            <w:r>
+              <w:t xml:space="preserve">Enforce per-app and per-tier policy (web → app → database) so a compromised web tier cannot reach unrelated databases.</w:t>
+            </w:r>
+          </w:p>
+        </w:tc>
+      </w:tr>
+      <w:tr>
+        <w:tc>
+          <w:tcPr/>
+          <w:p>
+            <w:pPr>
+              <w:pStyle w:val="Compact"/>
+            </w:pPr>
+            <w:r>
+              <w:t xml:space="preserve">Spreading from dev / test / lab into prod</w:t>
+            </w:r>
+          </w:p>
+        </w:tc>
+        <w:tc>
+          <w:tcPr/>
+          <w:p>
+            <w:pPr>
+              <w:pStyle w:val="Compact"/>
+            </w:pPr>
+            <w:r>
+              <w:t xml:space="preserve">Hard-segment prod from non-prod so a non-prod compromise cannot pivot into prod.</w:t>
+            </w:r>
+          </w:p>
+        </w:tc>
+      </w:tr>
+      <w:tr>
+        <w:tc>
+          <w:tcPr/>
+          <w:p>
+            <w:pPr>
+              <w:pStyle w:val="Compact"/>
+            </w:pPr>
+            <w:r>
+              <w:t xml:space="preserve">Long undetected dwell time</w:t>
+            </w:r>
+          </w:p>
+        </w:tc>
+        <w:tc>
+          <w:tcPr/>
+          <w:p>
+            <w:pPr>
+              <w:pStyle w:val="Compact"/>
+            </w:pPr>
+            <w:r>
+              <w:t xml:space="preserve">Surface every blocked or anomalous flow as evidence for SOC and incident response.</w:t>
+            </w:r>
+          </w:p>
+        </w:tc>
+      </w:tr>
+    </w:tbl>
+    <w:p>
+      <w:pPr>
+        <w:pStyle w:val="BodyText"/>
+      </w:pPr>
+      <w:r>
+        <w:t xml:space="preserve">The result is that</w:t>
+      </w:r>
+      <w:r>
+        <w:t xml:space="preserve"> </w:t>
+      </w:r>
+      <w:r>
+        <w:rPr>
+          <w:b/>
+          <w:bCs/>
+        </w:rPr>
+        <w:t xml:space="preserve">ransomware that lands on one workload finds the network around it almost empty</w:t>
+      </w:r>
+      <w:r>
+        <w:t xml:space="preserve">: the protocols it needs to spread are blocked by policy, and every attempt is logged.</w:t>
+      </w:r>
+    </w:p>
+    <w:bookmarkEnd w:id="12"/>
+    <w:bookmarkStart w:id="13" w:name="Xf5adb5257dc22157f69a2cf0d0c3c3b107bfbd8"/>
+    <w:p>
+      <w:pPr>
+        <w:pStyle w:val="Heading3"/>
+      </w:pPr>
+      <w:r>
+        <w:t xml:space="preserve">2.3 Why We Need It</w:t>
+      </w:r>
+    </w:p>
+    <w:p>
+      <w:pPr>
+        <w:pStyle w:val="Compact"/>
+        <w:numPr>
+          <w:ilvl w:val="0"/>
+          <w:numId w:val="1004"/>
+        </w:numPr>
+      </w:pPr>
+      <w:r>
+        <w:rPr>
+          <w:b/>
+          <w:bCs/>
+        </w:rPr>
+        <w:t xml:space="preserve">Flat networks no longer match the threat model.</w:t>
+      </w:r>
+      <w:r>
+        <w:t xml:space="preserve"> </w:t>
+      </w:r>
+      <w:r>
+        <w:t xml:space="preserve">Perimeter firewalls do not stop an attacker who is already inside.</w:t>
+      </w:r>
+    </w:p>
+    <w:p>
+      <w:pPr>
+        <w:pStyle w:val="Compact"/>
+        <w:numPr>
+          <w:ilvl w:val="0"/>
+          <w:numId w:val="1004"/>
+        </w:numPr>
+      </w:pPr>
+      <w:r>
+        <w:rPr>
+          <w:b/>
+          <w:bCs/>
+        </w:rPr>
+        <w:t xml:space="preserve">Identity-based and EDR controls are necessary but not sufficient.</w:t>
+      </w:r>
+      <w:r>
+        <w:t xml:space="preserve"> </w:t>
+      </w:r>
+      <w:r>
+        <w:t xml:space="preserve">They catch behavior on the host. CSW removes the network paths the attacker would use between hosts.</w:t>
+      </w:r>
+    </w:p>
+    <w:p>
+      <w:pPr>
+        <w:pStyle w:val="Compact"/>
+        <w:numPr>
+          <w:ilvl w:val="0"/>
+          <w:numId w:val="1004"/>
+        </w:numPr>
+      </w:pPr>
+      <w:r>
+        <w:rPr>
+          <w:b/>
+          <w:bCs/>
+        </w:rPr>
+        <w:t xml:space="preserve">Crown-jewel applications need explicit protection.</w:t>
+      </w:r>
+      <w:r>
+        <w:t xml:space="preserve"> </w:t>
+      </w:r>
+      <w:r>
+        <w:t xml:space="preserve">Payments, claims, customer data, intellectual property, and backup infrastructure should not be reachable from a random user workstation or a low-tier dev server.</w:t>
+      </w:r>
+    </w:p>
+    <w:p>
+      <w:pPr>
+        <w:pStyle w:val="Compact"/>
+        <w:numPr>
+          <w:ilvl w:val="0"/>
+          <w:numId w:val="1004"/>
+        </w:numPr>
+      </w:pPr>
+      <w:r>
+        <w:rPr>
+          <w:b/>
+          <w:bCs/>
+        </w:rPr>
+        <w:t xml:space="preserve">Compliance and audit demand it.</w:t>
+      </w:r>
+      <w:r>
+        <w:t xml:space="preserve"> </w:t>
+      </w:r>
+      <w:r>
+        <w:t xml:space="preserve">PCI, HIPAA, SOX, and most internal security frameworks expect documented segmentation between regulated and non-regulated systems.</w:t>
+      </w:r>
+    </w:p>
+    <w:p>
+      <w:pPr>
+        <w:pStyle w:val="Compact"/>
+        <w:numPr>
+          <w:ilvl w:val="0"/>
+          <w:numId w:val="1004"/>
+        </w:numPr>
+      </w:pPr>
+      <w:r>
+        <w:rPr>
+          <w:b/>
+          <w:bCs/>
+        </w:rPr>
+        <w:t xml:space="preserve">It must not break applications.</w:t>
+      </w:r>
+      <w:r>
+        <w:t xml:space="preserve"> </w:t>
+      </w:r>
+      <w:r>
+        <w:t xml:space="preserve">CSW's discovery-first model (map dependencies → label workloads → model policy → enforce in stages) is what makes segmentation finally feasible in real enterprises.</w:t>
+      </w:r>
+    </w:p>
+    <w:p>
+      <w:pPr>
+        <w:pStyle w:val="FirstParagraph"/>
+      </w:pPr>
+      <w:r>
+        <w:t xml:space="preserve">In one sentence:</w:t>
+      </w:r>
+      <w:r>
+        <w:t xml:space="preserve"> </w:t>
+      </w:r>
+      <w:r>
+        <w:rPr>
+          <w:b/>
+          <w:bCs/>
+        </w:rPr>
+        <w:t xml:space="preserve">CSW exists so that when — not if — one workload is compromised, the attacker cannot reach the next one.</w:t>
+      </w:r>
+    </w:p>
+    <w:p>
+      <w:r>
+        <w:pict>
+          <v:rect style="width:0;height:1.5pt" o:hralign="center" o:hrstd="t" o:hr="t"/>
+        </w:pict>
+      </w:r>
+    </w:p>
+    <w:bookmarkEnd w:id="13"/>
+    <w:bookmarkEnd w:id="14"/>
+    <w:bookmarkStart w:id="15" w:name="Xc93e48c43e4ee8764e63c76fe597d43f46cd2e8"/>
+    <w:p>
+      <w:pPr>
+        <w:pStyle w:val="Heading2"/>
+      </w:pPr>
+      <w:r>
+        <w:t xml:space="preserve">3. Why Customers Care</w:t>
+      </w:r>
+    </w:p>
+    <w:p>
+      <w:pPr>
+        <w:pStyle w:val="FirstParagraph"/>
+      </w:pPr>
+      <w:r>
+        <w:t xml:space="preserve">Customers usually evaluate CSW because they need to reduce lateral movement risk without breaking applications. Traditional network segmentation often depends on VLANs, subnets, firewall zones, or static IP lists. That model becomes difficult when applications span data centers, public cloud, containers, and shared services.</w:t>
+      </w:r>
+    </w:p>
+    <w:p>
+      <w:pPr>
+        <w:pStyle w:val="BodyText"/>
+      </w:pPr>
+      <w:r>
+        <w:t xml:space="preserve">CSW helps customers:</w:t>
+      </w:r>
+    </w:p>
+    <w:p>
+      <w:pPr>
+        <w:pStyle w:val="Compact"/>
+        <w:numPr>
+          <w:ilvl w:val="0"/>
+          <w:numId w:val="1005"/>
+        </w:numPr>
+      </w:pPr>
+      <w:r>
+        <w:t xml:space="preserve">Discover application dependencies before enforcing policy.</w:t>
+      </w:r>
+    </w:p>
+    <w:p>
+      <w:pPr>
+        <w:pStyle w:val="Compact"/>
+        <w:numPr>
+          <w:ilvl w:val="0"/>
+          <w:numId w:val="1005"/>
+        </w:numPr>
+      </w:pPr>
+      <w:r>
+        <w:t xml:space="preserve">Build policies based on labels and application intent, not only IP addresses.</w:t>
+      </w:r>
+    </w:p>
+    <w:p>
+      <w:pPr>
+        <w:pStyle w:val="Compact"/>
+        <w:numPr>
+          <w:ilvl w:val="0"/>
+          <w:numId w:val="1005"/>
+        </w:numPr>
+      </w:pPr>
+      <w:r>
+        <w:t xml:space="preserve">Protect high-value or vulnerable applications with tighter controls.</w:t>
+      </w:r>
+    </w:p>
+    <w:p>
+      <w:pPr>
+        <w:pStyle w:val="Compact"/>
+        <w:numPr>
+          <w:ilvl w:val="0"/>
+          <w:numId w:val="1005"/>
+        </w:numPr>
+      </w:pPr>
+      <w:r>
+        <w:t xml:space="preserve">Align policy with CMDB data, cloud tags, application ownership, and observed behavior.</w:t>
+      </w:r>
+    </w:p>
+    <w:p>
+      <w:pPr>
+        <w:pStyle w:val="Compact"/>
+        <w:numPr>
+          <w:ilvl w:val="0"/>
+          <w:numId w:val="1005"/>
+        </w:numPr>
+      </w:pPr>
+      <w:r>
+        <w:t xml:space="preserve">Roll out segmentation in phases, starting with visibility and policy modeling.</w:t>
+      </w:r>
+    </w:p>
+    <w:p>
+      <w:pPr>
+        <w:pStyle w:val="Compact"/>
+        <w:numPr>
+          <w:ilvl w:val="0"/>
+          <w:numId w:val="1005"/>
+        </w:numPr>
+      </w:pPr>
+      <w:r>
+        <w:t xml:space="preserve">Produce evidence for security, audit, and architecture teams.</w:t>
+      </w:r>
+    </w:p>
+    <w:p>
+      <w:r>
+        <w:pict>
+          <v:rect style="width:0;height:1.5pt" o:hralign="center" o:hrstd="t" o:hr="t"/>
+        </w:pict>
+      </w:r>
+    </w:p>
+    <w:bookmarkEnd w:id="15"/>
+    <w:bookmarkStart w:id="16" w:name="X353429cded0140ab0d779a396742c604dc7c0fe"/>
+    <w:p>
+      <w:pPr>
+        <w:pStyle w:val="Heading2"/>
+      </w:pPr>
+      <w:r>
+        <w:t xml:space="preserve">4. Core CSW Concepts for Users</w:t>
+      </w:r>
+    </w:p>
+    <w:tbl>
+      <w:tblPr>
+        <w:tblStyle w:val="Table"/>
+        <w:tblW w:type="auto" w:w="0"/>
+        <w:tblLook w:firstRow="1" w:lastRow="0" w:firstColumn="0" w:lastColumn="0" w:noHBand="0" w:noVBand="0" w:val="0020"/>
+      </w:tblPr>
+      <w:tblGrid>
+        <w:gridCol w:w="3960"/>
+        <w:gridCol w:w="3960"/>
+      </w:tblGrid>
+      <w:tr>
+        <w:trPr>
+          <w:tblHeader w:val="on"/>
+        </w:trPr>
+        <w:tc>
+          <w:tcPr/>
+          <w:p>
+            <w:pPr>
+              <w:pStyle w:val="Compact"/>
+            </w:pPr>
+            <w:r>
               <w:t xml:space="preserve">Concept</w:t>
             </w:r>
           </w:p>
@@ -735,14 +1471,14 @@
         </w:pict>
       </w:r>
     </w:p>
-    <w:bookmarkEnd w:id="12"/>
-    <w:bookmarkStart w:id="14" w:name="Xbed7fedf9510be5f97c515b43c852f105e23553"/>
+    <w:bookmarkEnd w:id="16"/>
+    <w:bookmarkStart w:id="18" w:name="X8d5d3d2112ceafddda5fdbbde8d9620afd2dc8f"/>
     <w:p>
       <w:pPr>
         <w:pStyle w:val="Heading2"/>
       </w:pPr>
       <w:r>
-        <w:t xml:space="preserve">4. CSW Video Library</w:t>
+        <w:t xml:space="preserve">5. CSW Video Library</w:t>
       </w:r>
     </w:p>
     <w:p>
@@ -1316,7 +2052,7 @@
         </w:tc>
       </w:tr>
     </w:tbl>
-    <w:bookmarkStart w:id="13" w:name="suggested-watch-order"/>
+    <w:bookmarkStart w:id="17" w:name="suggested-watch-order"/>
     <w:p>
       <w:pPr>
         <w:pStyle w:val="Heading3"/>
@@ -1330,7 +2066,7 @@
         <w:pStyle w:val="Compact"/>
         <w:numPr>
           <w:ilvl w:val="0"/>
-          <w:numId w:val="1003"/>
+          <w:numId w:val="1006"/>
         </w:numPr>
       </w:pPr>
       <w:r>
@@ -1355,7 +2091,7 @@
         <w:pStyle w:val="Compact"/>
         <w:numPr>
           <w:ilvl w:val="0"/>
-          <w:numId w:val="1003"/>
+          <w:numId w:val="1006"/>
         </w:numPr>
       </w:pPr>
       <w:r>
@@ -1409,7 +2145,7 @@
         <w:pStyle w:val="Compact"/>
         <w:numPr>
           <w:ilvl w:val="0"/>
-          <w:numId w:val="1003"/>
+          <w:numId w:val="1006"/>
         </w:numPr>
       </w:pPr>
       <w:r>
@@ -1437,7 +2173,7 @@
         <w:pStyle w:val="Compact"/>
         <w:numPr>
           <w:ilvl w:val="0"/>
-          <w:numId w:val="1003"/>
+          <w:numId w:val="1006"/>
         </w:numPr>
       </w:pPr>
       <w:r>
@@ -1491,7 +2227,7 @@
         <w:pStyle w:val="Compact"/>
         <w:numPr>
           <w:ilvl w:val="0"/>
-          <w:numId w:val="1003"/>
+          <w:numId w:val="1006"/>
         </w:numPr>
       </w:pPr>
       <w:r>
@@ -1519,7 +2255,7 @@
         <w:pStyle w:val="Compact"/>
         <w:numPr>
           <w:ilvl w:val="0"/>
-          <w:numId w:val="1003"/>
+          <w:numId w:val="1006"/>
         </w:numPr>
       </w:pPr>
       <w:r>
@@ -1549,18 +2285,18 @@
         </w:pict>
       </w:r>
     </w:p>
-    <w:bookmarkEnd w:id="13"/>
-    <w:bookmarkEnd w:id="14"/>
-    <w:bookmarkStart w:id="18" w:name="X2c22b968be1b469128b1917e3baf2aec78c4995"/>
+    <w:bookmarkEnd w:id="17"/>
+    <w:bookmarkEnd w:id="18"/>
+    <w:bookmarkStart w:id="22" w:name="X58938abf12d931bcad8bdf8cad8c32cf589c2b6"/>
     <w:p>
       <w:pPr>
         <w:pStyle w:val="Heading2"/>
       </w:pPr>
       <w:r>
-        <w:t xml:space="preserve">5. How to Explain CSW in a Customer Meeting</w:t>
-      </w:r>
-    </w:p>
-    <w:bookmarkStart w:id="15" w:name="X02667f004e9d93967c02b53649e8d7704fae290"/>
+        <w:t xml:space="preserve">6. How to Explain CSW in a Customer Meeting</w:t>
+      </w:r>
+    </w:p>
+    <w:bookmarkStart w:id="19" w:name="X02667f004e9d93967c02b53649e8d7704fae290"/>
     <w:p>
       <w:pPr>
         <w:pStyle w:val="Heading3"/>
@@ -1577,8 +2313,8 @@
         <w:t xml:space="preserve">Cisco Secure Workload helps customers discover how applications communicate and then safely enforce least-privilege segmentation policies around those applications. It starts with visibility and dependency mapping, uses labels and observed behavior to create policy, and supports staged enforcement so teams can reduce lateral movement risk without breaking applications.</w:t>
       </w:r>
     </w:p>
-    <w:bookmarkEnd w:id="15"/>
-    <w:bookmarkStart w:id="16" w:name="X245c304b430f838300b4e5d227cae86dea678fa"/>
+    <w:bookmarkEnd w:id="19"/>
+    <w:bookmarkStart w:id="20" w:name="X245c304b430f838300b4e5d227cae86dea678fa"/>
     <w:p>
       <w:pPr>
         <w:pStyle w:val="Heading3"/>
@@ -1595,8 +2331,8 @@
         <w:t xml:space="preserve">Most enterprises want micro-segmentation, but they hesitate because they do not fully know what their applications depend on. CSW starts by collecting workload telemetry, flow visibility, process context, cloud metadata, and CMDB labels. That data helps application teams understand real dependencies. From there, teams can model policy, see what would be blocked, tune the rules, and move selected workloads from monitor mode to enforcement. CSW is especially useful when customers need consistent segmentation across data center and cloud environments.</w:t>
       </w:r>
     </w:p>
-    <w:bookmarkEnd w:id="16"/>
-    <w:bookmarkStart w:id="17" w:name="common-positioning"/>
+    <w:bookmarkEnd w:id="20"/>
+    <w:bookmarkStart w:id="21" w:name="common-positioning"/>
     <w:p>
       <w:pPr>
         <w:pStyle w:val="Heading3"/>
@@ -1610,7 +2346,7 @@
         <w:pStyle w:val="Compact"/>
         <w:numPr>
           <w:ilvl w:val="0"/>
-          <w:numId w:val="1004"/>
+          <w:numId w:val="1007"/>
         </w:numPr>
       </w:pPr>
       <w:r>
@@ -1632,7 +2368,7 @@
         <w:pStyle w:val="Compact"/>
         <w:numPr>
           <w:ilvl w:val="0"/>
-          <w:numId w:val="1004"/>
+          <w:numId w:val="1007"/>
         </w:numPr>
       </w:pPr>
       <w:r>
@@ -1654,7 +2390,7 @@
         <w:pStyle w:val="Compact"/>
         <w:numPr>
           <w:ilvl w:val="0"/>
-          <w:numId w:val="1004"/>
+          <w:numId w:val="1007"/>
         </w:numPr>
       </w:pPr>
       <w:r>
@@ -1676,7 +2412,7 @@
         <w:pStyle w:val="Compact"/>
         <w:numPr>
           <w:ilvl w:val="0"/>
-          <w:numId w:val="1004"/>
+          <w:numId w:val="1007"/>
         </w:numPr>
       </w:pPr>
       <w:r>
@@ -1698,7 +2434,7 @@
         <w:pStyle w:val="Compact"/>
         <w:numPr>
           <w:ilvl w:val="0"/>
-          <w:numId w:val="1004"/>
+          <w:numId w:val="1007"/>
         </w:numPr>
       </w:pPr>
       <w:r>
@@ -1722,18 +2458,18 @@
         </w:pict>
       </w:r>
     </w:p>
-    <w:bookmarkEnd w:id="17"/>
-    <w:bookmarkEnd w:id="18"/>
-    <w:bookmarkStart w:id="28" w:name="X828072c830a10804f309adacc60a96c6d22f0e5"/>
+    <w:bookmarkEnd w:id="21"/>
+    <w:bookmarkEnd w:id="22"/>
+    <w:bookmarkStart w:id="32" w:name="Xa2467de0176a16fa5b9bfc7c341b8db67b47b02"/>
     <w:p>
       <w:pPr>
         <w:pStyle w:val="Heading2"/>
       </w:pPr>
       <w:r>
-        <w:t xml:space="preserve">6. CSW Onboarding Runbook</w:t>
-      </w:r>
-    </w:p>
-    <w:bookmarkStart w:id="19" w:name="phase-0---confirm-scope-and-outcomes"/>
+        <w:t xml:space="preserve">7. CSW Onboarding Runbook</w:t>
+      </w:r>
+    </w:p>
+    <w:bookmarkStart w:id="23" w:name="phase-0---confirm-scope-and-outcomes"/>
     <w:p>
       <w:pPr>
         <w:pStyle w:val="Heading3"/>
@@ -1777,7 +2513,7 @@
         <w:pStyle w:val="Compact"/>
         <w:numPr>
           <w:ilvl w:val="0"/>
-          <w:numId w:val="1005"/>
+          <w:numId w:val="1008"/>
         </w:numPr>
       </w:pPr>
       <w:r>
@@ -1789,7 +2525,7 @@
         <w:pStyle w:val="Compact"/>
         <w:numPr>
           <w:ilvl w:val="0"/>
-          <w:numId w:val="1005"/>
+          <w:numId w:val="1008"/>
         </w:numPr>
       </w:pPr>
       <w:r>
@@ -1801,7 +2537,7 @@
         <w:pStyle w:val="Compact"/>
         <w:numPr>
           <w:ilvl w:val="0"/>
-          <w:numId w:val="1005"/>
+          <w:numId w:val="1008"/>
         </w:numPr>
       </w:pPr>
       <w:r>
@@ -1813,7 +2549,7 @@
         <w:pStyle w:val="Compact"/>
         <w:numPr>
           <w:ilvl w:val="0"/>
-          <w:numId w:val="1005"/>
+          <w:numId w:val="1008"/>
         </w:numPr>
       </w:pPr>
       <w:r>
@@ -1825,7 +2561,7 @@
         <w:pStyle w:val="Compact"/>
         <w:numPr>
           <w:ilvl w:val="1"/>
-          <w:numId w:val="1006"/>
+          <w:numId w:val="1009"/>
         </w:numPr>
       </w:pPr>
       <w:r>
@@ -1837,7 +2573,7 @@
         <w:pStyle w:val="Compact"/>
         <w:numPr>
           <w:ilvl w:val="1"/>
-          <w:numId w:val="1006"/>
+          <w:numId w:val="1009"/>
         </w:numPr>
       </w:pPr>
       <w:r>
@@ -1849,7 +2585,7 @@
         <w:pStyle w:val="Compact"/>
         <w:numPr>
           <w:ilvl w:val="1"/>
-          <w:numId w:val="1006"/>
+          <w:numId w:val="1009"/>
         </w:numPr>
       </w:pPr>
       <w:r>
@@ -1861,7 +2597,7 @@
         <w:pStyle w:val="Compact"/>
         <w:numPr>
           <w:ilvl w:val="1"/>
-          <w:numId w:val="1006"/>
+          <w:numId w:val="1009"/>
         </w:numPr>
       </w:pPr>
       <w:r>
@@ -1873,7 +2609,7 @@
         <w:pStyle w:val="Compact"/>
         <w:numPr>
           <w:ilvl w:val="1"/>
-          <w:numId w:val="1006"/>
+          <w:numId w:val="1009"/>
         </w:numPr>
       </w:pPr>
       <w:r>
@@ -1885,7 +2621,7 @@
         <w:pStyle w:val="Compact"/>
         <w:numPr>
           <w:ilvl w:val="1"/>
-          <w:numId w:val="1006"/>
+          <w:numId w:val="1009"/>
         </w:numPr>
       </w:pPr>
       <w:r>
@@ -1917,8 +2653,8 @@
         </w:pict>
       </w:r>
     </w:p>
-    <w:bookmarkEnd w:id="19"/>
-    <w:bookmarkStart w:id="20" w:name="phase-1---prepare-the-tenant-and-access"/>
+    <w:bookmarkEnd w:id="23"/>
+    <w:bookmarkStart w:id="24" w:name="phase-1---prepare-the-tenant-and-access"/>
     <w:p>
       <w:pPr>
         <w:pStyle w:val="Heading3"/>
@@ -1962,7 +2698,7 @@
         <w:pStyle w:val="Compact"/>
         <w:numPr>
           <w:ilvl w:val="0"/>
-          <w:numId w:val="1007"/>
+          <w:numId w:val="1010"/>
         </w:numPr>
       </w:pPr>
       <w:r>
@@ -1974,7 +2710,7 @@
         <w:pStyle w:val="Compact"/>
         <w:numPr>
           <w:ilvl w:val="0"/>
-          <w:numId w:val="1007"/>
+          <w:numId w:val="1010"/>
         </w:numPr>
       </w:pPr>
       <w:r>
@@ -1986,7 +2722,7 @@
         <w:pStyle w:val="Compact"/>
         <w:numPr>
           <w:ilvl w:val="0"/>
-          <w:numId w:val="1007"/>
+          <w:numId w:val="1010"/>
         </w:numPr>
       </w:pPr>
       <w:r>
@@ -1998,7 +2734,7 @@
         <w:pStyle w:val="Compact"/>
         <w:numPr>
           <w:ilvl w:val="0"/>
-          <w:numId w:val="1007"/>
+          <w:numId w:val="1010"/>
         </w:numPr>
       </w:pPr>
       <w:r>
@@ -2010,7 +2746,7 @@
         <w:pStyle w:val="Compact"/>
         <w:numPr>
           <w:ilvl w:val="0"/>
-          <w:numId w:val="1007"/>
+          <w:numId w:val="1010"/>
         </w:numPr>
       </w:pPr>
       <w:r>
@@ -2042,8 +2778,8 @@
         </w:pict>
       </w:r>
     </w:p>
-    <w:bookmarkEnd w:id="20"/>
-    <w:bookmarkStart w:id="21" w:name="phase-2---build-the-label-strategy"/>
+    <w:bookmarkEnd w:id="24"/>
+    <w:bookmarkStart w:id="25" w:name="phase-2---build-the-label-strategy"/>
     <w:p>
       <w:pPr>
         <w:pStyle w:val="Heading3"/>
@@ -2541,7 +3277,7 @@
         <w:pStyle w:val="Compact"/>
         <w:numPr>
           <w:ilvl w:val="0"/>
-          <w:numId w:val="1008"/>
+          <w:numId w:val="1011"/>
         </w:numPr>
       </w:pPr>
       <w:r>
@@ -2553,7 +3289,7 @@
         <w:pStyle w:val="Compact"/>
         <w:numPr>
           <w:ilvl w:val="0"/>
-          <w:numId w:val="1008"/>
+          <w:numId w:val="1011"/>
         </w:numPr>
       </w:pPr>
       <w:r>
@@ -2565,7 +3301,7 @@
         <w:pStyle w:val="Compact"/>
         <w:numPr>
           <w:ilvl w:val="0"/>
-          <w:numId w:val="1008"/>
+          <w:numId w:val="1011"/>
         </w:numPr>
       </w:pPr>
       <w:r>
@@ -2577,7 +3313,7 @@
         <w:pStyle w:val="Compact"/>
         <w:numPr>
           <w:ilvl w:val="0"/>
-          <w:numId w:val="1008"/>
+          <w:numId w:val="1011"/>
         </w:numPr>
       </w:pPr>
       <w:r>
@@ -2609,8 +3345,8 @@
         </w:pict>
       </w:r>
     </w:p>
-    <w:bookmarkEnd w:id="21"/>
-    <w:bookmarkStart w:id="22" w:name="phase-3---deploy-agents-and-connectors"/>
+    <w:bookmarkEnd w:id="25"/>
+    <w:bookmarkStart w:id="26" w:name="phase-3---deploy-agents-and-connectors"/>
     <w:p>
       <w:pPr>
         <w:pStyle w:val="Heading3"/>
@@ -2654,7 +3390,7 @@
         <w:pStyle w:val="Compact"/>
         <w:numPr>
           <w:ilvl w:val="0"/>
-          <w:numId w:val="1009"/>
+          <w:numId w:val="1012"/>
         </w:numPr>
       </w:pPr>
       <w:r>
@@ -2666,7 +3402,7 @@
         <w:pStyle w:val="Compact"/>
         <w:numPr>
           <w:ilvl w:val="0"/>
-          <w:numId w:val="1009"/>
+          <w:numId w:val="1012"/>
         </w:numPr>
       </w:pPr>
       <w:r>
@@ -2678,7 +3414,7 @@
         <w:pStyle w:val="Compact"/>
         <w:numPr>
           <w:ilvl w:val="0"/>
-          <w:numId w:val="1009"/>
+          <w:numId w:val="1012"/>
         </w:numPr>
       </w:pPr>
       <w:r>
@@ -2690,7 +3426,7 @@
         <w:pStyle w:val="Compact"/>
         <w:numPr>
           <w:ilvl w:val="0"/>
-          <w:numId w:val="1009"/>
+          <w:numId w:val="1012"/>
         </w:numPr>
       </w:pPr>
       <w:r>
@@ -2702,7 +3438,7 @@
         <w:pStyle w:val="Compact"/>
         <w:numPr>
           <w:ilvl w:val="0"/>
-          <w:numId w:val="1009"/>
+          <w:numId w:val="1012"/>
         </w:numPr>
       </w:pPr>
       <w:r>
@@ -2714,7 +3450,7 @@
         <w:pStyle w:val="Compact"/>
         <w:numPr>
           <w:ilvl w:val="0"/>
-          <w:numId w:val="1009"/>
+          <w:numId w:val="1012"/>
         </w:numPr>
       </w:pPr>
       <w:r>
@@ -2746,8 +3482,8 @@
         </w:pict>
       </w:r>
     </w:p>
-    <w:bookmarkEnd w:id="22"/>
-    <w:bookmarkStart w:id="23" w:name="X85d4e4be5891f720f2552e26364a87ec66b02af"/>
+    <w:bookmarkEnd w:id="26"/>
+    <w:bookmarkStart w:id="27" w:name="X85d4e4be5891f720f2552e26364a87ec66b02af"/>
     <w:p>
       <w:pPr>
         <w:pStyle w:val="Heading3"/>
@@ -2791,7 +3527,7 @@
         <w:pStyle w:val="Compact"/>
         <w:numPr>
           <w:ilvl w:val="0"/>
-          <w:numId w:val="1010"/>
+          <w:numId w:val="1013"/>
         </w:numPr>
       </w:pPr>
       <w:r>
@@ -2803,7 +3539,7 @@
         <w:pStyle w:val="Compact"/>
         <w:numPr>
           <w:ilvl w:val="0"/>
-          <w:numId w:val="1010"/>
+          <w:numId w:val="1013"/>
         </w:numPr>
       </w:pPr>
       <w:r>
@@ -2815,7 +3551,7 @@
         <w:pStyle w:val="Compact"/>
         <w:numPr>
           <w:ilvl w:val="0"/>
-          <w:numId w:val="1010"/>
+          <w:numId w:val="1013"/>
         </w:numPr>
       </w:pPr>
       <w:r>
@@ -2827,7 +3563,7 @@
         <w:pStyle w:val="Compact"/>
         <w:numPr>
           <w:ilvl w:val="0"/>
-          <w:numId w:val="1010"/>
+          <w:numId w:val="1013"/>
         </w:numPr>
       </w:pPr>
       <w:r>
@@ -2839,7 +3575,7 @@
         <w:pStyle w:val="Compact"/>
         <w:numPr>
           <w:ilvl w:val="0"/>
-          <w:numId w:val="1010"/>
+          <w:numId w:val="1013"/>
         </w:numPr>
       </w:pPr>
       <w:r>
@@ -2851,7 +3587,7 @@
         <w:pStyle w:val="Compact"/>
         <w:numPr>
           <w:ilvl w:val="0"/>
-          <w:numId w:val="1010"/>
+          <w:numId w:val="1013"/>
         </w:numPr>
       </w:pPr>
       <w:r>
@@ -2883,8 +3619,8 @@
         </w:pict>
       </w:r>
     </w:p>
-    <w:bookmarkEnd w:id="23"/>
-    <w:bookmarkStart w:id="24" w:name="phase-5---model-policy"/>
+    <w:bookmarkEnd w:id="27"/>
+    <w:bookmarkStart w:id="28" w:name="phase-5---model-policy"/>
     <w:p>
       <w:pPr>
         <w:pStyle w:val="Heading3"/>
@@ -2928,7 +3664,7 @@
         <w:pStyle w:val="Compact"/>
         <w:numPr>
           <w:ilvl w:val="0"/>
-          <w:numId w:val="1011"/>
+          <w:numId w:val="1014"/>
         </w:numPr>
       </w:pPr>
       <w:r>
@@ -2940,7 +3676,7 @@
         <w:pStyle w:val="Compact"/>
         <w:numPr>
           <w:ilvl w:val="0"/>
-          <w:numId w:val="1011"/>
+          <w:numId w:val="1014"/>
         </w:numPr>
       </w:pPr>
       <w:r>
@@ -2952,7 +3688,7 @@
         <w:pStyle w:val="Compact"/>
         <w:numPr>
           <w:ilvl w:val="0"/>
-          <w:numId w:val="1011"/>
+          <w:numId w:val="1014"/>
         </w:numPr>
       </w:pPr>
       <w:r>
@@ -2964,7 +3700,7 @@
         <w:pStyle w:val="Compact"/>
         <w:numPr>
           <w:ilvl w:val="0"/>
-          <w:numId w:val="1011"/>
+          <w:numId w:val="1014"/>
         </w:numPr>
       </w:pPr>
       <w:r>
@@ -2976,7 +3712,7 @@
         <w:pStyle w:val="Compact"/>
         <w:numPr>
           <w:ilvl w:val="0"/>
-          <w:numId w:val="1011"/>
+          <w:numId w:val="1014"/>
         </w:numPr>
       </w:pPr>
       <w:r>
@@ -2988,7 +3724,7 @@
         <w:pStyle w:val="Compact"/>
         <w:numPr>
           <w:ilvl w:val="0"/>
-          <w:numId w:val="1011"/>
+          <w:numId w:val="1014"/>
         </w:numPr>
       </w:pPr>
       <w:r>
@@ -3020,8 +3756,8 @@
         </w:pict>
       </w:r>
     </w:p>
-    <w:bookmarkEnd w:id="24"/>
-    <w:bookmarkStart w:id="25" w:name="phase-6---start-in-monitor-mode"/>
+    <w:bookmarkEnd w:id="28"/>
+    <w:bookmarkStart w:id="29" w:name="phase-6---start-in-monitor-mode"/>
     <w:p>
       <w:pPr>
         <w:pStyle w:val="Heading3"/>
@@ -3065,7 +3801,7 @@
         <w:pStyle w:val="Compact"/>
         <w:numPr>
           <w:ilvl w:val="0"/>
-          <w:numId w:val="1012"/>
+          <w:numId w:val="1015"/>
         </w:numPr>
       </w:pPr>
       <w:r>
@@ -3077,7 +3813,7 @@
         <w:pStyle w:val="Compact"/>
         <w:numPr>
           <w:ilvl w:val="0"/>
-          <w:numId w:val="1012"/>
+          <w:numId w:val="1015"/>
         </w:numPr>
       </w:pPr>
       <w:r>
@@ -3089,7 +3825,7 @@
         <w:pStyle w:val="Compact"/>
         <w:numPr>
           <w:ilvl w:val="0"/>
-          <w:numId w:val="1012"/>
+          <w:numId w:val="1015"/>
         </w:numPr>
       </w:pPr>
       <w:r>
@@ -3101,7 +3837,7 @@
         <w:pStyle w:val="Compact"/>
         <w:numPr>
           <w:ilvl w:val="0"/>
-          <w:numId w:val="1012"/>
+          <w:numId w:val="1015"/>
         </w:numPr>
       </w:pPr>
       <w:r>
@@ -3113,7 +3849,7 @@
         <w:pStyle w:val="Compact"/>
         <w:numPr>
           <w:ilvl w:val="0"/>
-          <w:numId w:val="1012"/>
+          <w:numId w:val="1015"/>
         </w:numPr>
       </w:pPr>
       <w:r>
@@ -3145,8 +3881,8 @@
         </w:pict>
       </w:r>
     </w:p>
-    <w:bookmarkEnd w:id="25"/>
-    <w:bookmarkStart w:id="26" w:name="phase-7---enforce-in-a-controlled-scope"/>
+    <w:bookmarkEnd w:id="29"/>
+    <w:bookmarkStart w:id="30" w:name="phase-7---enforce-in-a-controlled-scope"/>
     <w:p>
       <w:pPr>
         <w:pStyle w:val="Heading3"/>
@@ -3190,7 +3926,7 @@
         <w:pStyle w:val="Compact"/>
         <w:numPr>
           <w:ilvl w:val="0"/>
-          <w:numId w:val="1013"/>
+          <w:numId w:val="1016"/>
         </w:numPr>
       </w:pPr>
       <w:r>
@@ -3202,7 +3938,7 @@
         <w:pStyle w:val="Compact"/>
         <w:numPr>
           <w:ilvl w:val="0"/>
-          <w:numId w:val="1013"/>
+          <w:numId w:val="1016"/>
         </w:numPr>
       </w:pPr>
       <w:r>
@@ -3214,7 +3950,7 @@
         <w:pStyle w:val="Compact"/>
         <w:numPr>
           <w:ilvl w:val="0"/>
-          <w:numId w:val="1013"/>
+          <w:numId w:val="1016"/>
         </w:numPr>
       </w:pPr>
       <w:r>
@@ -3226,7 +3962,7 @@
         <w:pStyle w:val="Compact"/>
         <w:numPr>
           <w:ilvl w:val="0"/>
-          <w:numId w:val="1013"/>
+          <w:numId w:val="1016"/>
         </w:numPr>
       </w:pPr>
       <w:r>
@@ -3238,7 +3974,7 @@
         <w:pStyle w:val="Compact"/>
         <w:numPr>
           <w:ilvl w:val="0"/>
-          <w:numId w:val="1013"/>
+          <w:numId w:val="1016"/>
         </w:numPr>
       </w:pPr>
       <w:r>
@@ -3250,7 +3986,7 @@
         <w:pStyle w:val="Compact"/>
         <w:numPr>
           <w:ilvl w:val="0"/>
-          <w:numId w:val="1013"/>
+          <w:numId w:val="1016"/>
         </w:numPr>
       </w:pPr>
       <w:r>
@@ -3262,7 +3998,7 @@
         <w:pStyle w:val="Compact"/>
         <w:numPr>
           <w:ilvl w:val="0"/>
-          <w:numId w:val="1013"/>
+          <w:numId w:val="1016"/>
         </w:numPr>
       </w:pPr>
       <w:r>
@@ -3274,7 +4010,7 @@
         <w:pStyle w:val="Compact"/>
         <w:numPr>
           <w:ilvl w:val="0"/>
-          <w:numId w:val="1013"/>
+          <w:numId w:val="1016"/>
         </w:numPr>
       </w:pPr>
       <w:r>
@@ -3306,8 +4042,8 @@
         </w:pict>
       </w:r>
     </w:p>
-    <w:bookmarkEnd w:id="26"/>
-    <w:bookmarkStart w:id="27" w:name="phase-8---operationalize"/>
+    <w:bookmarkEnd w:id="30"/>
+    <w:bookmarkStart w:id="31" w:name="phase-8---operationalize"/>
     <w:p>
       <w:pPr>
         <w:pStyle w:val="Heading3"/>
@@ -3351,7 +4087,7 @@
         <w:pStyle w:val="Compact"/>
         <w:numPr>
           <w:ilvl w:val="0"/>
-          <w:numId w:val="1014"/>
+          <w:numId w:val="1017"/>
         </w:numPr>
       </w:pPr>
       <w:r>
@@ -3363,7 +4099,7 @@
         <w:pStyle w:val="Compact"/>
         <w:numPr>
           <w:ilvl w:val="0"/>
-          <w:numId w:val="1014"/>
+          <w:numId w:val="1017"/>
         </w:numPr>
       </w:pPr>
       <w:r>
@@ -3375,7 +4111,7 @@
         <w:pStyle w:val="Compact"/>
         <w:numPr>
           <w:ilvl w:val="0"/>
-          <w:numId w:val="1014"/>
+          <w:numId w:val="1017"/>
         </w:numPr>
       </w:pPr>
       <w:r>
@@ -3387,7 +4123,7 @@
         <w:pStyle w:val="Compact"/>
         <w:numPr>
           <w:ilvl w:val="0"/>
-          <w:numId w:val="1014"/>
+          <w:numId w:val="1017"/>
         </w:numPr>
       </w:pPr>
       <w:r>
@@ -3399,7 +4135,7 @@
         <w:pStyle w:val="Compact"/>
         <w:numPr>
           <w:ilvl w:val="0"/>
-          <w:numId w:val="1014"/>
+          <w:numId w:val="1017"/>
         </w:numPr>
       </w:pPr>
       <w:r>
@@ -3411,7 +4147,7 @@
         <w:pStyle w:val="Compact"/>
         <w:numPr>
           <w:ilvl w:val="0"/>
-          <w:numId w:val="1014"/>
+          <w:numId w:val="1017"/>
         </w:numPr>
       </w:pPr>
       <w:r>
@@ -3423,7 +4159,7 @@
         <w:pStyle w:val="Compact"/>
         <w:numPr>
           <w:ilvl w:val="0"/>
-          <w:numId w:val="1014"/>
+          <w:numId w:val="1017"/>
         </w:numPr>
       </w:pPr>
       <w:r>
@@ -3455,15 +4191,15 @@
         </w:pict>
       </w:r>
     </w:p>
-    <w:bookmarkEnd w:id="27"/>
-    <w:bookmarkEnd w:id="28"/>
-    <w:bookmarkStart w:id="29" w:name="X06f8237afb734b40fe3e29155e4ed662b826e55"/>
+    <w:bookmarkEnd w:id="31"/>
+    <w:bookmarkEnd w:id="32"/>
+    <w:bookmarkStart w:id="33" w:name="Xa85d52fc1d13afcd7e08ce3626c3684e19f135a"/>
     <w:p>
       <w:pPr>
         <w:pStyle w:val="Heading2"/>
       </w:pPr>
       <w:r>
-        <w:t xml:space="preserve">7. Discovery Questions</w:t>
+        <w:t xml:space="preserve">8. Discovery Questions</w:t>
       </w:r>
     </w:p>
     <w:p>
@@ -3479,7 +4215,7 @@
         <w:pStyle w:val="Compact"/>
         <w:numPr>
           <w:ilvl w:val="0"/>
-          <w:numId w:val="1015"/>
+          <w:numId w:val="1018"/>
         </w:numPr>
       </w:pPr>
       <w:r>
@@ -3491,7 +4227,7 @@
         <w:pStyle w:val="Compact"/>
         <w:numPr>
           <w:ilvl w:val="0"/>
-          <w:numId w:val="1015"/>
+          <w:numId w:val="1018"/>
         </w:numPr>
       </w:pPr>
       <w:r>
@@ -3503,7 +4239,7 @@
         <w:pStyle w:val="Compact"/>
         <w:numPr>
           <w:ilvl w:val="0"/>
-          <w:numId w:val="1015"/>
+          <w:numId w:val="1018"/>
         </w:numPr>
       </w:pPr>
       <w:r>
@@ -3515,7 +4251,7 @@
         <w:pStyle w:val="Compact"/>
         <w:numPr>
           <w:ilvl w:val="0"/>
-          <w:numId w:val="1015"/>
+          <w:numId w:val="1018"/>
         </w:numPr>
       </w:pPr>
       <w:r>
@@ -3527,7 +4263,7 @@
         <w:pStyle w:val="Compact"/>
         <w:numPr>
           <w:ilvl w:val="0"/>
-          <w:numId w:val="1015"/>
+          <w:numId w:val="1018"/>
         </w:numPr>
       </w:pPr>
       <w:r>
@@ -3539,7 +4275,7 @@
         <w:pStyle w:val="Compact"/>
         <w:numPr>
           <w:ilvl w:val="0"/>
-          <w:numId w:val="1015"/>
+          <w:numId w:val="1018"/>
         </w:numPr>
       </w:pPr>
       <w:r>
@@ -3551,7 +4287,7 @@
         <w:pStyle w:val="Compact"/>
         <w:numPr>
           <w:ilvl w:val="0"/>
-          <w:numId w:val="1015"/>
+          <w:numId w:val="1018"/>
         </w:numPr>
       </w:pPr>
       <w:r>
@@ -3563,7 +4299,7 @@
         <w:pStyle w:val="Compact"/>
         <w:numPr>
           <w:ilvl w:val="0"/>
-          <w:numId w:val="1015"/>
+          <w:numId w:val="1018"/>
         </w:numPr>
       </w:pPr>
       <w:r>
@@ -3575,7 +4311,7 @@
         <w:pStyle w:val="Compact"/>
         <w:numPr>
           <w:ilvl w:val="0"/>
-          <w:numId w:val="1015"/>
+          <w:numId w:val="1018"/>
         </w:numPr>
       </w:pPr>
       <w:r>
@@ -3587,7 +4323,7 @@
         <w:pStyle w:val="Compact"/>
         <w:numPr>
           <w:ilvl w:val="0"/>
-          <w:numId w:val="1015"/>
+          <w:numId w:val="1018"/>
         </w:numPr>
       </w:pPr>
       <w:r>
@@ -3599,7 +4335,7 @@
         <w:pStyle w:val="Compact"/>
         <w:numPr>
           <w:ilvl w:val="0"/>
-          <w:numId w:val="1015"/>
+          <w:numId w:val="1018"/>
         </w:numPr>
       </w:pPr>
       <w:r>
@@ -3611,7 +4347,7 @@
         <w:pStyle w:val="Compact"/>
         <w:numPr>
           <w:ilvl w:val="0"/>
-          <w:numId w:val="1015"/>
+          <w:numId w:val="1018"/>
         </w:numPr>
       </w:pPr>
       <w:r>
@@ -3623,7 +4359,7 @@
         <w:pStyle w:val="Compact"/>
         <w:numPr>
           <w:ilvl w:val="0"/>
-          <w:numId w:val="1015"/>
+          <w:numId w:val="1018"/>
         </w:numPr>
       </w:pPr>
       <w:r>
@@ -3635,7 +4371,7 @@
         <w:pStyle w:val="Compact"/>
         <w:numPr>
           <w:ilvl w:val="0"/>
-          <w:numId w:val="1015"/>
+          <w:numId w:val="1018"/>
         </w:numPr>
       </w:pPr>
       <w:r>
@@ -3647,7 +4383,7 @@
         <w:pStyle w:val="Compact"/>
         <w:numPr>
           <w:ilvl w:val="0"/>
-          <w:numId w:val="1015"/>
+          <w:numId w:val="1018"/>
         </w:numPr>
       </w:pPr>
       <w:r>
@@ -3661,14 +4397,14 @@
         </w:pict>
       </w:r>
     </w:p>
-    <w:bookmarkEnd w:id="29"/>
-    <w:bookmarkStart w:id="30" w:name="Xf3106bf9d46d17183fa56d1277db47135ae0655"/>
+    <w:bookmarkEnd w:id="33"/>
+    <w:bookmarkStart w:id="34" w:name="X841d3ddf16524e5440bfb9de88d5c612795f996"/>
     <w:p>
       <w:pPr>
         <w:pStyle w:val="Heading2"/>
       </w:pPr>
       <w:r>
-        <w:t xml:space="preserve">8. POV Evidence Checklist</w:t>
+        <w:t xml:space="preserve">9. POV Evidence Checklist</w:t>
       </w:r>
     </w:p>
     <w:tbl>
@@ -4100,14 +4836,14 @@
         </w:pict>
       </w:r>
     </w:p>
-    <w:bookmarkEnd w:id="30"/>
-    <w:bookmarkStart w:id="31" w:name="X398b5ac88f8d53bd427267501ce233667557977"/>
+    <w:bookmarkEnd w:id="34"/>
+    <w:bookmarkStart w:id="35" w:name="Xfd7ff628108308dfd9a50ffd2b4ac7b1caefa2e"/>
     <w:p>
       <w:pPr>
         <w:pStyle w:val="Heading2"/>
       </w:pPr>
       <w:r>
-        <w:t xml:space="preserve">9. Common Pitfalls</w:t>
+        <w:t xml:space="preserve">10. Common Pitfalls</w:t>
       </w:r>
     </w:p>
     <w:tbl>
@@ -4323,14 +5059,14 @@
         </w:pict>
       </w:r>
     </w:p>
-    <w:bookmarkEnd w:id="31"/>
-    <w:bookmarkStart w:id="32" w:name="Xf9865d7f8e4a68119793a709bf5953d12f7a8a4"/>
+    <w:bookmarkEnd w:id="35"/>
+    <w:bookmarkStart w:id="36" w:name="X22a57548ad72139412394113736f74a112d1644"/>
     <w:p>
       <w:pPr>
         <w:pStyle w:val="Heading2"/>
       </w:pPr>
       <w:r>
-        <w:t xml:space="preserve">10. Simple CSW Talk Track</w:t>
+        <w:t xml:space="preserve">11. Simple CSW Talk Track</w:t>
       </w:r>
     </w:p>
     <w:p>
@@ -4346,7 +5082,7 @@
         <w:pStyle w:val="Compact"/>
         <w:numPr>
           <w:ilvl w:val="0"/>
-          <w:numId w:val="1016"/>
+          <w:numId w:val="1019"/>
         </w:numPr>
       </w:pPr>
       <w:r>
@@ -4368,7 +5104,7 @@
         <w:pStyle w:val="Compact"/>
         <w:numPr>
           <w:ilvl w:val="0"/>
-          <w:numId w:val="1016"/>
+          <w:numId w:val="1019"/>
         </w:numPr>
       </w:pPr>
       <w:r>
@@ -4390,7 +5126,7 @@
         <w:pStyle w:val="Compact"/>
         <w:numPr>
           <w:ilvl w:val="0"/>
-          <w:numId w:val="1016"/>
+          <w:numId w:val="1019"/>
         </w:numPr>
       </w:pPr>
       <w:r>
@@ -4412,7 +5148,7 @@
         <w:pStyle w:val="Compact"/>
         <w:numPr>
           <w:ilvl w:val="0"/>
-          <w:numId w:val="1016"/>
+          <w:numId w:val="1019"/>
         </w:numPr>
       </w:pPr>
       <w:r>
@@ -4434,7 +5170,7 @@
         <w:pStyle w:val="Compact"/>
         <w:numPr>
           <w:ilvl w:val="0"/>
-          <w:numId w:val="1016"/>
+          <w:numId w:val="1019"/>
         </w:numPr>
       </w:pPr>
       <w:r>
@@ -4458,22 +5194,22 @@
         </w:pict>
       </w:r>
     </w:p>
-    <w:bookmarkEnd w:id="32"/>
-    <w:bookmarkStart w:id="33" w:name="Xfc8fd80be52b3a3b38247257659ce433f42ef6b"/>
+    <w:bookmarkEnd w:id="36"/>
+    <w:bookmarkStart w:id="37" w:name="X04e07666da02c6370e77b96e23144f130a0eed0"/>
     <w:p>
       <w:pPr>
         <w:pStyle w:val="Heading2"/>
       </w:pPr>
       <w:r>
-        <w:t xml:space="preserve">11. Open Items Before Publishing Final Version</w:t>
-      </w:r>
-    </w:p>
-    <w:p>
-      <w:pPr>
-        <w:pStyle w:val="Compact"/>
-        <w:numPr>
-          <w:ilvl w:val="0"/>
-          <w:numId w:val="1017"/>
+        <w:t xml:space="preserve">12. Open Items Before Publishing Final Version</w:t>
+      </w:r>
+    </w:p>
+    <w:p>
+      <w:pPr>
+        <w:pStyle w:val="Compact"/>
+        <w:numPr>
+          <w:ilvl w:val="0"/>
+          <w:numId w:val="1020"/>
         </w:numPr>
       </w:pPr>
       <w:r>
@@ -4500,7 +5236,7 @@
         <w:pStyle w:val="Compact"/>
         <w:numPr>
           <w:ilvl w:val="0"/>
-          <w:numId w:val="1017"/>
+          <w:numId w:val="1020"/>
         </w:numPr>
       </w:pPr>
       <w:r>
@@ -4512,7 +5248,7 @@
         <w:pStyle w:val="Compact"/>
         <w:numPr>
           <w:ilvl w:val="0"/>
-          <w:numId w:val="1017"/>
+          <w:numId w:val="1020"/>
         </w:numPr>
       </w:pPr>
       <w:r>
@@ -4524,7 +5260,7 @@
         <w:pStyle w:val="Compact"/>
         <w:numPr>
           <w:ilvl w:val="0"/>
-          <w:numId w:val="1017"/>
+          <w:numId w:val="1020"/>
         </w:numPr>
       </w:pPr>
       <w:r>
@@ -4536,15 +5272,15 @@
         <w:pStyle w:val="Compact"/>
         <w:numPr>
           <w:ilvl w:val="0"/>
-          <w:numId w:val="1017"/>
+          <w:numId w:val="1020"/>
         </w:numPr>
       </w:pPr>
       <w:r>
         <w:t xml:space="preserve">Validate current release-specific support matrices before presenting platform coverage.</w:t>
       </w:r>
     </w:p>
-    <w:bookmarkEnd w:id="33"/>
-    <w:bookmarkEnd w:id="34"/>
+    <w:bookmarkEnd w:id="37"/>
+    <w:bookmarkEnd w:id="38"/>
     <w:sectPr>
       <w:footnotePr>
         <w:numRestart w:val="eachSect"/>
@@ -4877,42 +5613,45 @@
     </w:lvlOverride>
   </w:num>
   <w:num w:numId="1002">
-    <w:abstractNumId w:val="991"/>
+    <w:abstractNumId w:val="99411"/>
+    <w:lvlOverride w:ilvl="0">
+      <w:startOverride w:val="1"/>
+    </w:lvlOverride>
+    <w:lvlOverride w:ilvl="1">
+      <w:startOverride w:val="1"/>
+    </w:lvlOverride>
+    <w:lvlOverride w:ilvl="2">
+      <w:startOverride w:val="1"/>
+    </w:lvlOverride>
+    <w:lvlOverride w:ilvl="3">
+      <w:startOverride w:val="1"/>
+    </w:lvlOverride>
+    <w:lvlOverride w:ilvl="4">
+      <w:startOverride w:val="1"/>
+    </w:lvlOverride>
+    <w:lvlOverride w:ilvl="5">
+      <w:startOverride w:val="1"/>
+    </w:lvlOverride>
+    <w:lvlOverride w:ilvl="6">
+      <w:startOverride w:val="1"/>
+    </w:lvlOverride>
+    <w:lvlOverride w:ilvl="7">
+      <w:startOverride w:val="1"/>
+    </w:lvlOverride>
+    <w:lvlOverride w:ilvl="8">
+      <w:startOverride w:val="1"/>
+    </w:lvlOverride>
   </w:num>
   <w:num w:numId="1003">
-    <w:abstractNumId w:val="99411"/>
-    <w:lvlOverride w:ilvl="0">
-      <w:startOverride w:val="1"/>
-    </w:lvlOverride>
-    <w:lvlOverride w:ilvl="1">
-      <w:startOverride w:val="1"/>
-    </w:lvlOverride>
-    <w:lvlOverride w:ilvl="2">
-      <w:startOverride w:val="1"/>
-    </w:lvlOverride>
-    <w:lvlOverride w:ilvl="3">
-      <w:startOverride w:val="1"/>
-    </w:lvlOverride>
-    <w:lvlOverride w:ilvl="4">
-      <w:startOverride w:val="1"/>
-    </w:lvlOverride>
-    <w:lvlOverride w:ilvl="5">
-      <w:startOverride w:val="1"/>
-    </w:lvlOverride>
-    <w:lvlOverride w:ilvl="6">
-      <w:startOverride w:val="1"/>
-    </w:lvlOverride>
-    <w:lvlOverride w:ilvl="7">
-      <w:startOverride w:val="1"/>
-    </w:lvlOverride>
-    <w:lvlOverride w:ilvl="8">
-      <w:startOverride w:val="1"/>
-    </w:lvlOverride>
+    <w:abstractNumId w:val="991"/>
   </w:num>
   <w:num w:numId="1004">
     <w:abstractNumId w:val="991"/>
   </w:num>
   <w:num w:numId="1005">
+    <w:abstractNumId w:val="991"/>
+  </w:num>
+  <w:num w:numId="1006">
     <w:abstractNumId w:val="99411"/>
     <w:lvlOverride w:ilvl="0">
       <w:startOverride w:val="1"/>
@@ -4942,38 +5681,8 @@
       <w:startOverride w:val="1"/>
     </w:lvlOverride>
   </w:num>
-  <w:num w:numId="1006">
+  <w:num w:numId="1007">
     <w:abstractNumId w:val="991"/>
-  </w:num>
-  <w:num w:numId="1007">
-    <w:abstractNumId w:val="99411"/>
-    <w:lvlOverride w:ilvl="0">
-      <w:startOverride w:val="1"/>
-    </w:lvlOverride>
-    <w:lvlOverride w:ilvl="1">
-      <w:startOverride w:val="1"/>
-    </w:lvlOverride>
-    <w:lvlOverride w:ilvl="2">
-      <w:startOverride w:val="1"/>
-    </w:lvlOverride>
-    <w:lvlOverride w:ilvl="3">
-      <w:startOverride w:val="1"/>
-    </w:lvlOverride>
-    <w:lvlOverride w:ilvl="4">
-      <w:startOverride w:val="1"/>
-    </w:lvlOverride>
-    <w:lvlOverride w:ilvl="5">
-      <w:startOverride w:val="1"/>
-    </w:lvlOverride>
-    <w:lvlOverride w:ilvl="6">
-      <w:startOverride w:val="1"/>
-    </w:lvlOverride>
-    <w:lvlOverride w:ilvl="7">
-      <w:startOverride w:val="1"/>
-    </w:lvlOverride>
-    <w:lvlOverride w:ilvl="8">
-      <w:startOverride w:val="1"/>
-    </w:lvlOverride>
   </w:num>
   <w:num w:numId="1008">
     <w:abstractNumId w:val="99411"/>
@@ -5006,34 +5715,7 @@
     </w:lvlOverride>
   </w:num>
   <w:num w:numId="1009">
-    <w:abstractNumId w:val="99411"/>
-    <w:lvlOverride w:ilvl="0">
-      <w:startOverride w:val="1"/>
-    </w:lvlOverride>
-    <w:lvlOverride w:ilvl="1">
-      <w:startOverride w:val="1"/>
-    </w:lvlOverride>
-    <w:lvlOverride w:ilvl="2">
-      <w:startOverride w:val="1"/>
-    </w:lvlOverride>
-    <w:lvlOverride w:ilvl="3">
-      <w:startOverride w:val="1"/>
-    </w:lvlOverride>
-    <w:lvlOverride w:ilvl="4">
-      <w:startOverride w:val="1"/>
-    </w:lvlOverride>
-    <w:lvlOverride w:ilvl="5">
-      <w:startOverride w:val="1"/>
-    </w:lvlOverride>
-    <w:lvlOverride w:ilvl="6">
-      <w:startOverride w:val="1"/>
-    </w:lvlOverride>
-    <w:lvlOverride w:ilvl="7">
-      <w:startOverride w:val="1"/>
-    </w:lvlOverride>
-    <w:lvlOverride w:ilvl="8">
-      <w:startOverride w:val="1"/>
-    </w:lvlOverride>
+    <w:abstractNumId w:val="991"/>
   </w:num>
   <w:num w:numId="1010">
     <w:abstractNumId w:val="99411"/>
@@ -5246,6 +5928,96 @@
     </w:lvlOverride>
   </w:num>
   <w:num w:numId="1017">
+    <w:abstractNumId w:val="99411"/>
+    <w:lvlOverride w:ilvl="0">
+      <w:startOverride w:val="1"/>
+    </w:lvlOverride>
+    <w:lvlOverride w:ilvl="1">
+      <w:startOverride w:val="1"/>
+    </w:lvlOverride>
+    <w:lvlOverride w:ilvl="2">
+      <w:startOverride w:val="1"/>
+    </w:lvlOverride>
+    <w:lvlOverride w:ilvl="3">
+      <w:startOverride w:val="1"/>
+    </w:lvlOverride>
+    <w:lvlOverride w:ilvl="4">
+      <w:startOverride w:val="1"/>
+    </w:lvlOverride>
+    <w:lvlOverride w:ilvl="5">
+      <w:startOverride w:val="1"/>
+    </w:lvlOverride>
+    <w:lvlOverride w:ilvl="6">
+      <w:startOverride w:val="1"/>
+    </w:lvlOverride>
+    <w:lvlOverride w:ilvl="7">
+      <w:startOverride w:val="1"/>
+    </w:lvlOverride>
+    <w:lvlOverride w:ilvl="8">
+      <w:startOverride w:val="1"/>
+    </w:lvlOverride>
+  </w:num>
+  <w:num w:numId="1018">
+    <w:abstractNumId w:val="99411"/>
+    <w:lvlOverride w:ilvl="0">
+      <w:startOverride w:val="1"/>
+    </w:lvlOverride>
+    <w:lvlOverride w:ilvl="1">
+      <w:startOverride w:val="1"/>
+    </w:lvlOverride>
+    <w:lvlOverride w:ilvl="2">
+      <w:startOverride w:val="1"/>
+    </w:lvlOverride>
+    <w:lvlOverride w:ilvl="3">
+      <w:startOverride w:val="1"/>
+    </w:lvlOverride>
+    <w:lvlOverride w:ilvl="4">
+      <w:startOverride w:val="1"/>
+    </w:lvlOverride>
+    <w:lvlOverride w:ilvl="5">
+      <w:startOverride w:val="1"/>
+    </w:lvlOverride>
+    <w:lvlOverride w:ilvl="6">
+      <w:startOverride w:val="1"/>
+    </w:lvlOverride>
+    <w:lvlOverride w:ilvl="7">
+      <w:startOverride w:val="1"/>
+    </w:lvlOverride>
+    <w:lvlOverride w:ilvl="8">
+      <w:startOverride w:val="1"/>
+    </w:lvlOverride>
+  </w:num>
+  <w:num w:numId="1019">
+    <w:abstractNumId w:val="99411"/>
+    <w:lvlOverride w:ilvl="0">
+      <w:startOverride w:val="1"/>
+    </w:lvlOverride>
+    <w:lvlOverride w:ilvl="1">
+      <w:startOverride w:val="1"/>
+    </w:lvlOverride>
+    <w:lvlOverride w:ilvl="2">
+      <w:startOverride w:val="1"/>
+    </w:lvlOverride>
+    <w:lvlOverride w:ilvl="3">
+      <w:startOverride w:val="1"/>
+    </w:lvlOverride>
+    <w:lvlOverride w:ilvl="4">
+      <w:startOverride w:val="1"/>
+    </w:lvlOverride>
+    <w:lvlOverride w:ilvl="5">
+      <w:startOverride w:val="1"/>
+    </w:lvlOverride>
+    <w:lvlOverride w:ilvl="6">
+      <w:startOverride w:val="1"/>
+    </w:lvlOverride>
+    <w:lvlOverride w:ilvl="7">
+      <w:startOverride w:val="1"/>
+    </w:lvlOverride>
+    <w:lvlOverride w:ilvl="8">
+      <w:startOverride w:val="1"/>
+    </w:lvlOverride>
+  </w:num>
+  <w:num w:numId="1020">
     <w:abstractNumId w:val="99411"/>
     <w:lvlOverride w:ilvl="0">
       <w:startOverride w:val="1"/>

</xml_diff>

<commit_message>
docs(user-education): add ASCII kill-chain diagram to lateral-movement section
Inserts a Unicode box-drawing flow of the 6-step attack pattern
(Initial Access -> Recon -> Cred Theft -> Lateral Movement ->
Privilege Escalation -> Payload & Impact) plus a callout box
showing where CSW intervenes between steps 4 and 5.

Same diagram is mirrored into README.md so GitHub and the
DOCX/PDF tell an identical visual story. Rebuilt DOCX and PDF
(PDF: 14 pages).

Co-authored-by: Cursor <cursoragent@cursor.com>
</commit_message>
<xml_diff>
--- a/docs/user-education/CSW-User-Education-Guide.docx
+++ b/docs/user-education/CSW-User-Education-Guide.docx
@@ -441,6 +441,190 @@
       </w:r>
       <w:r>
         <w:t xml:space="preserve">— ransomware, data exfiltration, destruction.</w:t>
+      </w:r>
+    </w:p>
+    <w:p>
+      <w:pPr>
+        <w:pStyle w:val="FirstParagraph"/>
+      </w:pPr>
+      <w:r>
+        <w:t xml:space="preserve">Visually, the kill chain looks like this:</w:t>
+      </w:r>
+    </w:p>
+    <w:p>
+      <w:pPr>
+        <w:pStyle w:val="SourceCode"/>
+      </w:pPr>
+      <w:r>
+        <w:rPr>
+          <w:rStyle w:val="VerbatimChar"/>
+        </w:rPr>
+        <w:t xml:space="preserve">   ┌──────────────┐   ┌──────────────┐   ┌──────────────┐</w:t>
+      </w:r>
+      <w:r>
+        <w:br/>
+      </w:r>
+      <w:r>
+        <w:rPr>
+          <w:rStyle w:val="VerbatimChar"/>
+        </w:rPr>
+        <w:t xml:space="preserve">   │ 1. Initial   │──▶│ 2. Recon &amp;   │──▶│ 3. Credential│</w:t>
+      </w:r>
+      <w:r>
+        <w:br/>
+      </w:r>
+      <w:r>
+        <w:rPr>
+          <w:rStyle w:val="VerbatimChar"/>
+        </w:rPr>
+        <w:t xml:space="preserve">   │    Access    │   │    Enum      │   │    Theft     │</w:t>
+      </w:r>
+      <w:r>
+        <w:br/>
+      </w:r>
+      <w:r>
+        <w:rPr>
+          <w:rStyle w:val="VerbatimChar"/>
+        </w:rPr>
+        <w:t xml:space="preserve">   └──────────────┘   └──────────────┘   └──────┬───────┘</w:t>
+      </w:r>
+      <w:r>
+        <w:br/>
+      </w:r>
+      <w:r>
+        <w:rPr>
+          <w:rStyle w:val="VerbatimChar"/>
+        </w:rPr>
+        <w:t xml:space="preserve">                                                │</w:t>
+      </w:r>
+      <w:r>
+        <w:br/>
+      </w:r>
+      <w:r>
+        <w:rPr>
+          <w:rStyle w:val="VerbatimChar"/>
+        </w:rPr>
+        <w:t xml:space="preserve">       ┌────────────────────────────────────────┘</w:t>
+      </w:r>
+      <w:r>
+        <w:br/>
+      </w:r>
+      <w:r>
+        <w:rPr>
+          <w:rStyle w:val="VerbatimChar"/>
+        </w:rPr>
+        <w:t xml:space="preserve">       ▼</w:t>
+      </w:r>
+      <w:r>
+        <w:br/>
+      </w:r>
+      <w:r>
+        <w:rPr>
+          <w:rStyle w:val="VerbatimChar"/>
+        </w:rPr>
+        <w:t xml:space="preserve">   ┌──────────────┐   ┌──────────────┐   ┌──────────────┐</w:t>
+      </w:r>
+      <w:r>
+        <w:br/>
+      </w:r>
+      <w:r>
+        <w:rPr>
+          <w:rStyle w:val="VerbatimChar"/>
+        </w:rPr>
+        <w:t xml:space="preserve">   │ 4. Lateral   │──▶│ 5. Privilege │──▶│ 6. Payload   │</w:t>
+      </w:r>
+      <w:r>
+        <w:br/>
+      </w:r>
+      <w:r>
+        <w:rPr>
+          <w:rStyle w:val="VerbatimChar"/>
+        </w:rPr>
+        <w:t xml:space="preserve">   │    Movement  │   │    Escalation│   │    &amp; Impact  │</w:t>
+      </w:r>
+      <w:r>
+        <w:br/>
+      </w:r>
+      <w:r>
+        <w:rPr>
+          <w:rStyle w:val="VerbatimChar"/>
+        </w:rPr>
+        <w:t xml:space="preserve">   └──────────────┘   └──────────────┘   └──────────────┘</w:t>
+      </w:r>
+      <w:r>
+        <w:br/>
+      </w:r>
+      <w:r>
+        <w:br/>
+      </w:r>
+      <w:r>
+        <w:rPr>
+          <w:rStyle w:val="VerbatimChar"/>
+        </w:rPr>
+        <w:t xml:space="preserve">           ┌──────────────────────────────────────────┐</w:t>
+      </w:r>
+      <w:r>
+        <w:br/>
+      </w:r>
+      <w:r>
+        <w:rPr>
+          <w:rStyle w:val="VerbatimChar"/>
+        </w:rPr>
+        <w:t xml:space="preserve">           │ * CSW intervenes between steps 4 and 5:  │</w:t>
+      </w:r>
+      <w:r>
+        <w:br/>
+      </w:r>
+      <w:r>
+        <w:rPr>
+          <w:rStyle w:val="VerbatimChar"/>
+        </w:rPr>
+        <w:t xml:space="preserve">           │   least-privilege policy removes the     │</w:t>
+      </w:r>
+      <w:r>
+        <w:br/>
+      </w:r>
+      <w:r>
+        <w:rPr>
+          <w:rStyle w:val="VerbatimChar"/>
+        </w:rPr>
+        <w:t xml:space="preserve">           │   workload-to-workload network paths     │</w:t>
+      </w:r>
+      <w:r>
+        <w:br/>
+      </w:r>
+      <w:r>
+        <w:rPr>
+          <w:rStyle w:val="VerbatimChar"/>
+        </w:rPr>
+        <w:t xml:space="preserve">           │   these steps depend on. The attacker    │</w:t>
+      </w:r>
+      <w:r>
+        <w:br/>
+      </w:r>
+      <w:r>
+        <w:rPr>
+          <w:rStyle w:val="VerbatimChar"/>
+        </w:rPr>
+        <w:t xml:space="preserve">           │   can still land on host 1, but cannot   │</w:t>
+      </w:r>
+      <w:r>
+        <w:br/>
+      </w:r>
+      <w:r>
+        <w:rPr>
+          <w:rStyle w:val="VerbatimChar"/>
+        </w:rPr>
+        <w:t xml:space="preserve">           │   reach hosts 2..N from there.           │</w:t>
+      </w:r>
+      <w:r>
+        <w:br/>
+      </w:r>
+      <w:r>
+        <w:rPr>
+          <w:rStyle w:val="VerbatimChar"/>
+        </w:rPr>
+        <w:t xml:space="preserve">           └──────────────────────────────────────────┘</w:t>
       </w:r>
     </w:p>
     <w:p>

</xml_diff>

<commit_message>
docs: link the CSW-Compliance-Mapping companion repo from the compliance bullet
The "Compliance and audit demand it" bullet in both README and guide
now points to chandrapati/CSW-Compliance-Mapping, the customer-facing
companion repo that ships reports and matching SA/SE technical runbooks
for HIPAA, SOC 2, PCI DSS v4, NIST 800-53, ISO 27001:2022, CISA ZTMM,
FIPS 140, NIST 800-207/207A, DORA, NIS2, NERC CIP, TSA Pipeline,
CIS Controls v8.1, NIST CSF 2.0, CMMC 2.0, and more.

Use it whenever a customer asks "how does CSW map to <framework>?".

Rebuilt DOCX and PDF.

Co-authored-by: Cursor <cursoragent@cursor.com>
</commit_message>
<xml_diff>
--- a/docs/user-education/CSW-User-Education-Guide.docx
+++ b/docs/user-education/CSW-User-Education-Guide.docx
@@ -60,7 +60,7 @@
         </w:p>
       </w:sdtContent>
     </w:sdt>
-    <w:bookmarkStart w:id="78" w:name="X92ee979ebdbb38d988228e1ce971d57f1b349ff"/>
+    <w:bookmarkStart w:id="79" w:name="X92ee979ebdbb38d988228e1ce971d57f1b349ff"/>
     <w:p>
       <w:pPr>
         <w:pStyle w:val="Heading1"/>
@@ -240,7 +240,7 @@
       </w:r>
     </w:p>
     <w:bookmarkEnd w:id="10"/>
-    <w:bookmarkStart w:id="14" w:name="X65a3ca2c4eb11e28f1c01acdfed178fb2c5bbdd"/>
+    <w:bookmarkStart w:id="15" w:name="X65a3ca2c4eb11e28f1c01acdfed178fb2c5bbdd"/>
     <w:p>
       <w:pPr>
         <w:pStyle w:val="Heading2"/>
@@ -1014,7 +1014,7 @@
       </w:r>
     </w:p>
     <w:bookmarkEnd w:id="12"/>
-    <w:bookmarkStart w:id="13" w:name="Xf5adb5257dc22157f69a2cf0d0c3c3b107bfbd8"/>
+    <w:bookmarkStart w:id="14" w:name="Xf5adb5257dc22157f69a2cf0d0c3c3b107bfbd8"/>
     <w:p>
       <w:pPr>
         <w:pStyle w:val="Heading3"/>
@@ -1108,7 +1108,36 @@
         <w:t xml:space="preserve"> </w:t>
       </w:r>
       <w:r>
-        <w:t xml:space="preserve">PCI, HIPAA, SOX, and most internal security frameworks expect documented segmentation between regulated and non-regulated systems.</w:t>
+        <w:t xml:space="preserve">PCI, HIPAA, SOX, and most internal security frameworks expect documented segmentation between regulated and non-regulated systems. For framework-by-framework mappings — customer-facing reports and matching SA / SE technical runbooks across HIPAA, SOC 2, PCI DSS v4, NIST 800-53, ISO 27001:2022, CISA ZTMM, FIPS 140, NIST 800-207 / 207A, DORA, NIS2, NERC CIP, TSA Pipeline, CIS Controls v8.1, NIST CSF 2.0, CMMC 2.0, and more — see the companion repository:</w:t>
+      </w:r>
+      <w:r>
+        <w:t xml:space="preserve"> </w:t>
+      </w:r>
+      <w:hyperlink r:id="rId13">
+        <w:r>
+          <w:rPr>
+            <w:rStyle w:val="Hyperlink"/>
+            <w:b/>
+            <w:bCs/>
+          </w:rPr>
+          <w:t xml:space="preserve">chandrapati/CSW-Compliance-Mapping</w:t>
+        </w:r>
+      </w:hyperlink>
+      <w:r>
+        <w:t xml:space="preserve">. Use it whenever a customer asks "how does CSW map to</w:t>
+      </w:r>
+      <w:r>
+        <w:t xml:space="preserve"> </w:t>
+      </w:r>
+      <w:r>
+        <w:rPr>
+          <w:i/>
+          <w:iCs/>
+        </w:rPr>
+        <w:t xml:space="preserve">&lt;framework&gt;</w:t>
+      </w:r>
+      <w:r>
+        <w:t xml:space="preserve">?".</w:t>
       </w:r>
     </w:p>
     <w:p>
@@ -1158,9 +1187,9 @@
         </w:pict>
       </w:r>
     </w:p>
-    <w:bookmarkEnd w:id="13"/>
     <w:bookmarkEnd w:id="14"/>
-    <w:bookmarkStart w:id="15" w:name="Xc93e48c43e4ee8764e63c76fe597d43f46cd2e8"/>
+    <w:bookmarkEnd w:id="15"/>
+    <w:bookmarkStart w:id="16" w:name="Xc93e48c43e4ee8764e63c76fe597d43f46cd2e8"/>
     <w:p>
       <w:pPr>
         <w:pStyle w:val="Heading2"/>
@@ -1264,8 +1293,8 @@
         </w:pict>
       </w:r>
     </w:p>
-    <w:bookmarkEnd w:id="15"/>
-    <w:bookmarkStart w:id="16" w:name="X353429cded0140ab0d779a396742c604dc7c0fe"/>
+    <w:bookmarkEnd w:id="16"/>
+    <w:bookmarkStart w:id="17" w:name="X353429cded0140ab0d779a396742c604dc7c0fe"/>
     <w:p>
       <w:pPr>
         <w:pStyle w:val="Heading2"/>
@@ -1655,8 +1684,8 @@
         </w:pict>
       </w:r>
     </w:p>
-    <w:bookmarkEnd w:id="16"/>
-    <w:bookmarkStart w:id="18" w:name="X379b2d95ae6a85ebda4985fdd640c1c5b25f9bc"/>
+    <w:bookmarkEnd w:id="17"/>
+    <w:bookmarkStart w:id="19" w:name="X379b2d95ae6a85ebda4985fdd640c1c5b25f9bc"/>
     <w:p>
       <w:pPr>
         <w:pStyle w:val="Heading2"/>
@@ -2216,7 +2245,7 @@
         <w:t xml:space="preserve">every phase is independently valuable. A customer who stops after Phase 2 still wins — ransomware fan-out is gone and prod is isolated from non-prod. A customer who reaches Phase 5 has continuous defense in depth, not a one-off project.</w:t>
       </w:r>
     </w:p>
-    <w:bookmarkStart w:id="17" w:name="mapping-phases-to-videos-in-the-catalog"/>
+    <w:bookmarkStart w:id="18" w:name="mapping-phases-to-videos-in-the-catalog"/>
     <w:p>
       <w:pPr>
         <w:pStyle w:val="Heading3"/>
@@ -2342,9 +2371,9 @@
         </w:pict>
       </w:r>
     </w:p>
-    <w:bookmarkEnd w:id="17"/>
     <w:bookmarkEnd w:id="18"/>
-    <w:bookmarkStart w:id="58" w:name="X17ed11c017e89b8141ed9a306f0a0e31f839240"/>
+    <w:bookmarkEnd w:id="19"/>
+    <w:bookmarkStart w:id="59" w:name="X17ed11c017e89b8141ed9a306f0a0e31f839240"/>
     <w:p>
       <w:pPr>
         <w:pStyle w:val="Heading2"/>
@@ -2361,7 +2390,7 @@
         <w:t xml:space="preserve">The video catalog below mirrors the Cisco Secure Workload learning material. Sub-section 5.1 contains the ten foundational training videos from the source Cisco slide. Sub-sections 5.2 through 5.7 extend the catalog with deeper topics commonly requested in customer conversations: security and risk reduction, segmentation use cases, firewall integration, F5 / BIG-IP integration, identity and DNS integrations, and containers. All entries link to YouTube unless explicitly noted otherwise.</w:t>
       </w:r>
     </w:p>
-    <w:bookmarkStart w:id="29" w:name="Xf31d039ca1017fc6bc4e4b716cc94054d75b6a9"/>
+    <w:bookmarkStart w:id="30" w:name="Xf31d039ca1017fc6bc4e4b716cc94054d75b6a9"/>
     <w:p>
       <w:pPr>
         <w:pStyle w:val="Heading3"/>
@@ -2471,57 +2500,6 @@
             <w:pPr>
               <w:pStyle w:val="Compact"/>
             </w:pPr>
-            <w:hyperlink r:id="rId19">
-              <w:r>
-                <w:rPr>
-                  <w:rStyle w:val="Hyperlink"/>
-                </w:rPr>
-                <w:t xml:space="preserve">Watch</w:t>
-              </w:r>
-            </w:hyperlink>
-          </w:p>
-        </w:tc>
-      </w:tr>
-      <w:tr>
-        <w:tc>
-          <w:tcPr/>
-          <w:p>
-            <w:pPr>
-              <w:pStyle w:val="Compact"/>
-            </w:pPr>
-            <w:r>
-              <w:t xml:space="preserve">2</w:t>
-            </w:r>
-          </w:p>
-        </w:tc>
-        <w:tc>
-          <w:tcPr/>
-          <w:p>
-            <w:pPr>
-              <w:pStyle w:val="Compact"/>
-            </w:pPr>
-            <w:r>
-              <w:t xml:space="preserve">Cisco Secure Workload: Agent Configuration and Deployment – Golden Image VDI</w:t>
-            </w:r>
-          </w:p>
-        </w:tc>
-        <w:tc>
-          <w:tcPr/>
-          <w:p>
-            <w:pPr>
-              <w:pStyle w:val="Compact"/>
-            </w:pPr>
-            <w:r>
-              <w:t xml:space="preserve">Demonstrates deploying Secure Workload agents in virtual desktop infrastructure environments using golden images.</w:t>
-            </w:r>
-          </w:p>
-        </w:tc>
-        <w:tc>
-          <w:tcPr/>
-          <w:p>
-            <w:pPr>
-              <w:pStyle w:val="Compact"/>
-            </w:pPr>
             <w:hyperlink r:id="rId20">
               <w:r>
                 <w:rPr>
@@ -2541,29 +2519,29 @@
               <w:pStyle w:val="Compact"/>
             </w:pPr>
             <w:r>
-              <w:t xml:space="preserve">3</w:t>
-            </w:r>
-          </w:p>
-        </w:tc>
-        <w:tc>
-          <w:tcPr/>
-          <w:p>
-            <w:pPr>
-              <w:pStyle w:val="Compact"/>
-            </w:pPr>
-            <w:r>
-              <w:t xml:space="preserve">Cisco Secure Workload: Scopes</w:t>
-            </w:r>
-          </w:p>
-        </w:tc>
-        <w:tc>
-          <w:tcPr/>
-          <w:p>
-            <w:pPr>
-              <w:pStyle w:val="Compact"/>
-            </w:pPr>
-            <w:r>
-              <w:t xml:space="preserve">Explains how to use scopes to group workloads logically for policy application and management.</w:t>
+              <w:t xml:space="preserve">2</w:t>
+            </w:r>
+          </w:p>
+        </w:tc>
+        <w:tc>
+          <w:tcPr/>
+          <w:p>
+            <w:pPr>
+              <w:pStyle w:val="Compact"/>
+            </w:pPr>
+            <w:r>
+              <w:t xml:space="preserve">Cisco Secure Workload: Agent Configuration and Deployment – Golden Image VDI</w:t>
+            </w:r>
+          </w:p>
+        </w:tc>
+        <w:tc>
+          <w:tcPr/>
+          <w:p>
+            <w:pPr>
+              <w:pStyle w:val="Compact"/>
+            </w:pPr>
+            <w:r>
+              <w:t xml:space="preserve">Demonstrates deploying Secure Workload agents in virtual desktop infrastructure environments using golden images.</w:t>
             </w:r>
           </w:p>
         </w:tc>
@@ -2592,29 +2570,29 @@
               <w:pStyle w:val="Compact"/>
             </w:pPr>
             <w:r>
-              <w:t xml:space="preserve">4</w:t>
-            </w:r>
-          </w:p>
-        </w:tc>
-        <w:tc>
-          <w:tcPr/>
-          <w:p>
-            <w:pPr>
-              <w:pStyle w:val="Compact"/>
-            </w:pPr>
-            <w:r>
-              <w:t xml:space="preserve">Cisco Secure Workload: Labels</w:t>
-            </w:r>
-          </w:p>
-        </w:tc>
-        <w:tc>
-          <w:tcPr/>
-          <w:p>
-            <w:pPr>
-              <w:pStyle w:val="Compact"/>
-            </w:pPr>
-            <w:r>
-              <w:t xml:space="preserve">Details the use of labels to tag workloads for granular policy enforcement and visibility.</w:t>
+              <w:t xml:space="preserve">3</w:t>
+            </w:r>
+          </w:p>
+        </w:tc>
+        <w:tc>
+          <w:tcPr/>
+          <w:p>
+            <w:pPr>
+              <w:pStyle w:val="Compact"/>
+            </w:pPr>
+            <w:r>
+              <w:t xml:space="preserve">Cisco Secure Workload: Scopes</w:t>
+            </w:r>
+          </w:p>
+        </w:tc>
+        <w:tc>
+          <w:tcPr/>
+          <w:p>
+            <w:pPr>
+              <w:pStyle w:val="Compact"/>
+            </w:pPr>
+            <w:r>
+              <w:t xml:space="preserve">Explains how to use scopes to group workloads logically for policy application and management.</w:t>
             </w:r>
           </w:p>
         </w:tc>
@@ -2643,29 +2621,29 @@
               <w:pStyle w:val="Compact"/>
             </w:pPr>
             <w:r>
-              <w:t xml:space="preserve">5</w:t>
-            </w:r>
-          </w:p>
-        </w:tc>
-        <w:tc>
-          <w:tcPr/>
-          <w:p>
-            <w:pPr>
-              <w:pStyle w:val="Compact"/>
-            </w:pPr>
-            <w:r>
-              <w:t xml:space="preserve">Cisco Secure Workload: Inventory Filters</w:t>
-            </w:r>
-          </w:p>
-        </w:tc>
-        <w:tc>
-          <w:tcPr/>
-          <w:p>
-            <w:pPr>
-              <w:pStyle w:val="Compact"/>
-            </w:pPr>
-            <w:r>
-              <w:t xml:space="preserve">Shows how to filter inventory to focus on specific workloads or groups for analysis and policy.</w:t>
+              <w:t xml:space="preserve">4</w:t>
+            </w:r>
+          </w:p>
+        </w:tc>
+        <w:tc>
+          <w:tcPr/>
+          <w:p>
+            <w:pPr>
+              <w:pStyle w:val="Compact"/>
+            </w:pPr>
+            <w:r>
+              <w:t xml:space="preserve">Cisco Secure Workload: Labels</w:t>
+            </w:r>
+          </w:p>
+        </w:tc>
+        <w:tc>
+          <w:tcPr/>
+          <w:p>
+            <w:pPr>
+              <w:pStyle w:val="Compact"/>
+            </w:pPr>
+            <w:r>
+              <w:t xml:space="preserve">Details the use of labels to tag workloads for granular policy enforcement and visibility.</w:t>
             </w:r>
           </w:p>
         </w:tc>
@@ -2694,29 +2672,29 @@
               <w:pStyle w:val="Compact"/>
             </w:pPr>
             <w:r>
-              <w:t xml:space="preserve">6</w:t>
-            </w:r>
-          </w:p>
-        </w:tc>
-        <w:tc>
-          <w:tcPr/>
-          <w:p>
-            <w:pPr>
-              <w:pStyle w:val="Compact"/>
-            </w:pPr>
-            <w:r>
-              <w:t xml:space="preserve">Cisco Secure Workload: Production and Test Risk Reduction</w:t>
-            </w:r>
-          </w:p>
-        </w:tc>
-        <w:tc>
-          <w:tcPr/>
-          <w:p>
-            <w:pPr>
-              <w:pStyle w:val="Compact"/>
-            </w:pPr>
-            <w:r>
-              <w:t xml:space="preserve">Covers strategies to reduce risk in production and test environments using Secure Workload policies.</w:t>
+              <w:t xml:space="preserve">5</w:t>
+            </w:r>
+          </w:p>
+        </w:tc>
+        <w:tc>
+          <w:tcPr/>
+          <w:p>
+            <w:pPr>
+              <w:pStyle w:val="Compact"/>
+            </w:pPr>
+            <w:r>
+              <w:t xml:space="preserve">Cisco Secure Workload: Inventory Filters</w:t>
+            </w:r>
+          </w:p>
+        </w:tc>
+        <w:tc>
+          <w:tcPr/>
+          <w:p>
+            <w:pPr>
+              <w:pStyle w:val="Compact"/>
+            </w:pPr>
+            <w:r>
+              <w:t xml:space="preserve">Shows how to filter inventory to focus on specific workloads or groups for analysis and policy.</w:t>
             </w:r>
           </w:p>
         </w:tc>
@@ -2745,29 +2723,29 @@
               <w:pStyle w:val="Compact"/>
             </w:pPr>
             <w:r>
-              <w:t xml:space="preserve">7</w:t>
-            </w:r>
-          </w:p>
-        </w:tc>
-        <w:tc>
-          <w:tcPr/>
-          <w:p>
-            <w:pPr>
-              <w:pStyle w:val="Compact"/>
-            </w:pPr>
-            <w:r>
-              <w:t xml:space="preserve">Cisco Secure Workload: Application Dependency Mapping &amp; Policy Analysis</w:t>
-            </w:r>
-          </w:p>
-        </w:tc>
-        <w:tc>
-          <w:tcPr/>
-          <w:p>
-            <w:pPr>
-              <w:pStyle w:val="Compact"/>
-            </w:pPr>
-            <w:r>
-              <w:t xml:space="preserve">Demonstrates mapping application dependencies and analyzing policies for effective microsegmentation.</w:t>
+              <w:t xml:space="preserve">6</w:t>
+            </w:r>
+          </w:p>
+        </w:tc>
+        <w:tc>
+          <w:tcPr/>
+          <w:p>
+            <w:pPr>
+              <w:pStyle w:val="Compact"/>
+            </w:pPr>
+            <w:r>
+              <w:t xml:space="preserve">Cisco Secure Workload: Production and Test Risk Reduction</w:t>
+            </w:r>
+          </w:p>
+        </w:tc>
+        <w:tc>
+          <w:tcPr/>
+          <w:p>
+            <w:pPr>
+              <w:pStyle w:val="Compact"/>
+            </w:pPr>
+            <w:r>
+              <w:t xml:space="preserve">Covers strategies to reduce risk in production and test environments using Secure Workload policies.</w:t>
             </w:r>
           </w:p>
         </w:tc>
@@ -2796,29 +2774,29 @@
               <w:pStyle w:val="Compact"/>
             </w:pPr>
             <w:r>
-              <w:t xml:space="preserve">8</w:t>
-            </w:r>
-          </w:p>
-        </w:tc>
-        <w:tc>
-          <w:tcPr/>
-          <w:p>
-            <w:pPr>
-              <w:pStyle w:val="Compact"/>
-            </w:pPr>
-            <w:r>
-              <w:t xml:space="preserve">Cisco Secure Workload: Policy Visual and Quick Analysis</w:t>
-            </w:r>
-          </w:p>
-        </w:tc>
-        <w:tc>
-          <w:tcPr/>
-          <w:p>
-            <w:pPr>
-              <w:pStyle w:val="Compact"/>
-            </w:pPr>
-            <w:r>
-              <w:t xml:space="preserve">Provides tools for visualizing and quickly analyzing security policies and their impact.</w:t>
+              <w:t xml:space="preserve">7</w:t>
+            </w:r>
+          </w:p>
+        </w:tc>
+        <w:tc>
+          <w:tcPr/>
+          <w:p>
+            <w:pPr>
+              <w:pStyle w:val="Compact"/>
+            </w:pPr>
+            <w:r>
+              <w:t xml:space="preserve">Cisco Secure Workload: Application Dependency Mapping &amp; Policy Analysis</w:t>
+            </w:r>
+          </w:p>
+        </w:tc>
+        <w:tc>
+          <w:tcPr/>
+          <w:p>
+            <w:pPr>
+              <w:pStyle w:val="Compact"/>
+            </w:pPr>
+            <w:r>
+              <w:t xml:space="preserve">Demonstrates mapping application dependencies and analyzing policies for effective microsegmentation.</w:t>
             </w:r>
           </w:p>
         </w:tc>
@@ -2847,29 +2825,29 @@
               <w:pStyle w:val="Compact"/>
             </w:pPr>
             <w:r>
-              <w:t xml:space="preserve">9</w:t>
-            </w:r>
-          </w:p>
-        </w:tc>
-        <w:tc>
-          <w:tcPr/>
-          <w:p>
-            <w:pPr>
-              <w:pStyle w:val="Compact"/>
-            </w:pPr>
-            <w:r>
-              <w:t xml:space="preserve">Cisco Secure Workload: Dynamic Workloads &amp; Policy</w:t>
-            </w:r>
-          </w:p>
-        </w:tc>
-        <w:tc>
-          <w:tcPr/>
-          <w:p>
-            <w:pPr>
-              <w:pStyle w:val="Compact"/>
-            </w:pPr>
-            <w:r>
-              <w:t xml:space="preserve">Explains handling dynamic workloads and adapting policies accordingly.</w:t>
+              <w:t xml:space="preserve">8</w:t>
+            </w:r>
+          </w:p>
+        </w:tc>
+        <w:tc>
+          <w:tcPr/>
+          <w:p>
+            <w:pPr>
+              <w:pStyle w:val="Compact"/>
+            </w:pPr>
+            <w:r>
+              <w:t xml:space="preserve">Cisco Secure Workload: Policy Visual and Quick Analysis</w:t>
+            </w:r>
+          </w:p>
+        </w:tc>
+        <w:tc>
+          <w:tcPr/>
+          <w:p>
+            <w:pPr>
+              <w:pStyle w:val="Compact"/>
+            </w:pPr>
+            <w:r>
+              <w:t xml:space="preserve">Provides tools for visualizing and quickly analyzing security policies and their impact.</w:t>
             </w:r>
           </w:p>
         </w:tc>
@@ -2898,29 +2876,29 @@
               <w:pStyle w:val="Compact"/>
             </w:pPr>
             <w:r>
-              <w:t xml:space="preserve">10</w:t>
-            </w:r>
-          </w:p>
-        </w:tc>
-        <w:tc>
-          <w:tcPr/>
-          <w:p>
-            <w:pPr>
-              <w:pStyle w:val="Compact"/>
-            </w:pPr>
-            <w:r>
-              <w:t xml:space="preserve">Cisco Secure Workload: Flow Analysis</w:t>
-            </w:r>
-          </w:p>
-        </w:tc>
-        <w:tc>
-          <w:tcPr/>
-          <w:p>
-            <w:pPr>
-              <w:pStyle w:val="Compact"/>
-            </w:pPr>
-            <w:r>
-              <w:t xml:space="preserve">Details flow analysis capabilities to understand traffic patterns and detect anomalies.</w:t>
+              <w:t xml:space="preserve">9</w:t>
+            </w:r>
+          </w:p>
+        </w:tc>
+        <w:tc>
+          <w:tcPr/>
+          <w:p>
+            <w:pPr>
+              <w:pStyle w:val="Compact"/>
+            </w:pPr>
+            <w:r>
+              <w:t xml:space="preserve">Cisco Secure Workload: Dynamic Workloads &amp; Policy</w:t>
+            </w:r>
+          </w:p>
+        </w:tc>
+        <w:tc>
+          <w:tcPr/>
+          <w:p>
+            <w:pPr>
+              <w:pStyle w:val="Compact"/>
+            </w:pPr>
+            <w:r>
+              <w:t xml:space="preserve">Explains handling dynamic workloads and adapting policies accordingly.</w:t>
             </w:r>
           </w:p>
         </w:tc>
@@ -2941,9 +2919,60 @@
           </w:p>
         </w:tc>
       </w:tr>
+      <w:tr>
+        <w:tc>
+          <w:tcPr/>
+          <w:p>
+            <w:pPr>
+              <w:pStyle w:val="Compact"/>
+            </w:pPr>
+            <w:r>
+              <w:t xml:space="preserve">10</w:t>
+            </w:r>
+          </w:p>
+        </w:tc>
+        <w:tc>
+          <w:tcPr/>
+          <w:p>
+            <w:pPr>
+              <w:pStyle w:val="Compact"/>
+            </w:pPr>
+            <w:r>
+              <w:t xml:space="preserve">Cisco Secure Workload: Flow Analysis</w:t>
+            </w:r>
+          </w:p>
+        </w:tc>
+        <w:tc>
+          <w:tcPr/>
+          <w:p>
+            <w:pPr>
+              <w:pStyle w:val="Compact"/>
+            </w:pPr>
+            <w:r>
+              <w:t xml:space="preserve">Details flow analysis capabilities to understand traffic patterns and detect anomalies.</w:t>
+            </w:r>
+          </w:p>
+        </w:tc>
+        <w:tc>
+          <w:tcPr/>
+          <w:p>
+            <w:pPr>
+              <w:pStyle w:val="Compact"/>
+            </w:pPr>
+            <w:hyperlink r:id="rId29">
+              <w:r>
+                <w:rPr>
+                  <w:rStyle w:val="Hyperlink"/>
+                </w:rPr>
+                <w:t xml:space="preserve">Watch</w:t>
+              </w:r>
+            </w:hyperlink>
+          </w:p>
+        </w:tc>
+      </w:tr>
     </w:tbl>
-    <w:bookmarkEnd w:id="29"/>
-    <w:bookmarkStart w:id="35" w:name="X7e4ed10df8fd6d4fb06fc3b837581fae3b51b5d"/>
+    <w:bookmarkEnd w:id="30"/>
+    <w:bookmarkStart w:id="36" w:name="X7e4ed10df8fd6d4fb06fc3b837581fae3b51b5d"/>
     <w:p>
       <w:pPr>
         <w:pStyle w:val="Heading3"/>
@@ -3053,57 +3082,6 @@
             <w:pPr>
               <w:pStyle w:val="Compact"/>
             </w:pPr>
-            <w:hyperlink r:id="rId30">
-              <w:r>
-                <w:rPr>
-                  <w:rStyle w:val="Hyperlink"/>
-                </w:rPr>
-                <w:t xml:space="preserve">Watch</w:t>
-              </w:r>
-            </w:hyperlink>
-          </w:p>
-        </w:tc>
-      </w:tr>
-      <w:tr>
-        <w:tc>
-          <w:tcPr/>
-          <w:p>
-            <w:pPr>
-              <w:pStyle w:val="Compact"/>
-            </w:pPr>
-            <w:r>
-              <w:t xml:space="preserve">12</w:t>
-            </w:r>
-          </w:p>
-        </w:tc>
-        <w:tc>
-          <w:tcPr/>
-          <w:p>
-            <w:pPr>
-              <w:pStyle w:val="Compact"/>
-            </w:pPr>
-            <w:r>
-              <w:t xml:space="preserve">Cisco Secure Workload: Security Dashboard</w:t>
-            </w:r>
-          </w:p>
-        </w:tc>
-        <w:tc>
-          <w:tcPr/>
-          <w:p>
-            <w:pPr>
-              <w:pStyle w:val="Compact"/>
-            </w:pPr>
-            <w:r>
-              <w:t xml:space="preserve">Walks through the Secure Workload security dashboard: posture, risk indicators, and drill-downs.</w:t>
-            </w:r>
-          </w:p>
-        </w:tc>
-        <w:tc>
-          <w:tcPr/>
-          <w:p>
-            <w:pPr>
-              <w:pStyle w:val="Compact"/>
-            </w:pPr>
             <w:hyperlink r:id="rId31">
               <w:r>
                 <w:rPr>
@@ -3123,29 +3101,29 @@
               <w:pStyle w:val="Compact"/>
             </w:pPr>
             <w:r>
-              <w:t xml:space="preserve">13</w:t>
-            </w:r>
-          </w:p>
-        </w:tc>
-        <w:tc>
-          <w:tcPr/>
-          <w:p>
-            <w:pPr>
-              <w:pStyle w:val="Compact"/>
-            </w:pPr>
-            <w:r>
-              <w:t xml:space="preserve">Cisco Secure Workload: Forensics</w:t>
-            </w:r>
-          </w:p>
-        </w:tc>
-        <w:tc>
-          <w:tcPr/>
-          <w:p>
-            <w:pPr>
-              <w:pStyle w:val="Compact"/>
-            </w:pPr>
-            <w:r>
-              <w:t xml:space="preserve">Demonstrates Secure Workload's forensics capability for capturing process and flow evidence during investigations.</w:t>
+              <w:t xml:space="preserve">12</w:t>
+            </w:r>
+          </w:p>
+        </w:tc>
+        <w:tc>
+          <w:tcPr/>
+          <w:p>
+            <w:pPr>
+              <w:pStyle w:val="Compact"/>
+            </w:pPr>
+            <w:r>
+              <w:t xml:space="preserve">Cisco Secure Workload: Security Dashboard</w:t>
+            </w:r>
+          </w:p>
+        </w:tc>
+        <w:tc>
+          <w:tcPr/>
+          <w:p>
+            <w:pPr>
+              <w:pStyle w:val="Compact"/>
+            </w:pPr>
+            <w:r>
+              <w:t xml:space="preserve">Walks through the Secure Workload security dashboard: posture, risk indicators, and drill-downs.</w:t>
             </w:r>
           </w:p>
         </w:tc>
@@ -3174,29 +3152,29 @@
               <w:pStyle w:val="Compact"/>
             </w:pPr>
             <w:r>
-              <w:t xml:space="preserve">14</w:t>
-            </w:r>
-          </w:p>
-        </w:tc>
-        <w:tc>
-          <w:tcPr/>
-          <w:p>
-            <w:pPr>
-              <w:pStyle w:val="Compact"/>
-            </w:pPr>
-            <w:r>
-              <w:t xml:space="preserve">Cisco Secure Workload: Log4J Risk Reduction</w:t>
-            </w:r>
-          </w:p>
-        </w:tc>
-        <w:tc>
-          <w:tcPr/>
-          <w:p>
-            <w:pPr>
-              <w:pStyle w:val="Compact"/>
-            </w:pPr>
-            <w:r>
-              <w:t xml:space="preserve">Shows how to use Secure Workload to identify and contain Log4J (Log4Shell) exposure across workloads.</w:t>
+              <w:t xml:space="preserve">13</w:t>
+            </w:r>
+          </w:p>
+        </w:tc>
+        <w:tc>
+          <w:tcPr/>
+          <w:p>
+            <w:pPr>
+              <w:pStyle w:val="Compact"/>
+            </w:pPr>
+            <w:r>
+              <w:t xml:space="preserve">Cisco Secure Workload: Forensics</w:t>
+            </w:r>
+          </w:p>
+        </w:tc>
+        <w:tc>
+          <w:tcPr/>
+          <w:p>
+            <w:pPr>
+              <w:pStyle w:val="Compact"/>
+            </w:pPr>
+            <w:r>
+              <w:t xml:space="preserve">Demonstrates Secure Workload's forensics capability for capturing process and flow evidence during investigations.</w:t>
             </w:r>
           </w:p>
         </w:tc>
@@ -3225,29 +3203,29 @@
               <w:pStyle w:val="Compact"/>
             </w:pPr>
             <w:r>
-              <w:t xml:space="preserve">15</w:t>
-            </w:r>
-          </w:p>
-        </w:tc>
-        <w:tc>
-          <w:tcPr/>
-          <w:p>
-            <w:pPr>
-              <w:pStyle w:val="Compact"/>
-            </w:pPr>
-            <w:r>
-              <w:t xml:space="preserve">Cisco Secure Workload: SSH Risk Reduction</w:t>
-            </w:r>
-          </w:p>
-        </w:tc>
-        <w:tc>
-          <w:tcPr/>
-          <w:p>
-            <w:pPr>
-              <w:pStyle w:val="Compact"/>
-            </w:pPr>
-            <w:r>
-              <w:t xml:space="preserve">Demonstrates segmenting and controlling SSH paths between workloads using Secure Workload policy.</w:t>
+              <w:t xml:space="preserve">14</w:t>
+            </w:r>
+          </w:p>
+        </w:tc>
+        <w:tc>
+          <w:tcPr/>
+          <w:p>
+            <w:pPr>
+              <w:pStyle w:val="Compact"/>
+            </w:pPr>
+            <w:r>
+              <w:t xml:space="preserve">Cisco Secure Workload: Log4J Risk Reduction</w:t>
+            </w:r>
+          </w:p>
+        </w:tc>
+        <w:tc>
+          <w:tcPr/>
+          <w:p>
+            <w:pPr>
+              <w:pStyle w:val="Compact"/>
+            </w:pPr>
+            <w:r>
+              <w:t xml:space="preserve">Shows how to use Secure Workload to identify and contain Log4J (Log4Shell) exposure across workloads.</w:t>
             </w:r>
           </w:p>
         </w:tc>
@@ -3268,9 +3246,60 @@
           </w:p>
         </w:tc>
       </w:tr>
+      <w:tr>
+        <w:tc>
+          <w:tcPr/>
+          <w:p>
+            <w:pPr>
+              <w:pStyle w:val="Compact"/>
+            </w:pPr>
+            <w:r>
+              <w:t xml:space="preserve">15</w:t>
+            </w:r>
+          </w:p>
+        </w:tc>
+        <w:tc>
+          <w:tcPr/>
+          <w:p>
+            <w:pPr>
+              <w:pStyle w:val="Compact"/>
+            </w:pPr>
+            <w:r>
+              <w:t xml:space="preserve">Cisco Secure Workload: SSH Risk Reduction</w:t>
+            </w:r>
+          </w:p>
+        </w:tc>
+        <w:tc>
+          <w:tcPr/>
+          <w:p>
+            <w:pPr>
+              <w:pStyle w:val="Compact"/>
+            </w:pPr>
+            <w:r>
+              <w:t xml:space="preserve">Demonstrates segmenting and controlling SSH paths between workloads using Secure Workload policy.</w:t>
+            </w:r>
+          </w:p>
+        </w:tc>
+        <w:tc>
+          <w:tcPr/>
+          <w:p>
+            <w:pPr>
+              <w:pStyle w:val="Compact"/>
+            </w:pPr>
+            <w:hyperlink r:id="rId35">
+              <w:r>
+                <w:rPr>
+                  <w:rStyle w:val="Hyperlink"/>
+                </w:rPr>
+                <w:t xml:space="preserve">Watch</w:t>
+              </w:r>
+            </w:hyperlink>
+          </w:p>
+        </w:tc>
+      </w:tr>
     </w:tbl>
-    <w:bookmarkEnd w:id="35"/>
-    <w:bookmarkStart w:id="38" w:name="Xa25cb844b6c2e07d0eacf111776e9b686d70167"/>
+    <w:bookmarkEnd w:id="36"/>
+    <w:bookmarkStart w:id="39" w:name="Xa25cb844b6c2e07d0eacf111776e9b686d70167"/>
     <w:p>
       <w:pPr>
         <w:pStyle w:val="Heading3"/>
@@ -3380,57 +3409,6 @@
             <w:pPr>
               <w:pStyle w:val="Compact"/>
             </w:pPr>
-            <w:hyperlink r:id="rId36">
-              <w:r>
-                <w:rPr>
-                  <w:rStyle w:val="Hyperlink"/>
-                </w:rPr>
-                <w:t xml:space="preserve">Watch</w:t>
-              </w:r>
-            </w:hyperlink>
-          </w:p>
-        </w:tc>
-      </w:tr>
-      <w:tr>
-        <w:tc>
-          <w:tcPr/>
-          <w:p>
-            <w:pPr>
-              <w:pStyle w:val="Compact"/>
-            </w:pPr>
-            <w:r>
-              <w:t xml:space="preserve">17</w:t>
-            </w:r>
-          </w:p>
-        </w:tc>
-        <w:tc>
-          <w:tcPr/>
-          <w:p>
-            <w:pPr>
-              <w:pStyle w:val="Compact"/>
-            </w:pPr>
-            <w:r>
-              <w:t xml:space="preserve">Cisco Secure Workload: Virtual Desktop Interface (VDI) Segmentation</w:t>
-            </w:r>
-          </w:p>
-        </w:tc>
-        <w:tc>
-          <w:tcPr/>
-          <w:p>
-            <w:pPr>
-              <w:pStyle w:val="Compact"/>
-            </w:pPr>
-            <w:r>
-              <w:t xml:space="preserve">Covers segmenting VDI environments where many users share a small set of golden images.</w:t>
-            </w:r>
-          </w:p>
-        </w:tc>
-        <w:tc>
-          <w:tcPr/>
-          <w:p>
-            <w:pPr>
-              <w:pStyle w:val="Compact"/>
-            </w:pPr>
             <w:hyperlink r:id="rId37">
               <w:r>
                 <w:rPr>
@@ -3442,9 +3420,60 @@
           </w:p>
         </w:tc>
       </w:tr>
+      <w:tr>
+        <w:tc>
+          <w:tcPr/>
+          <w:p>
+            <w:pPr>
+              <w:pStyle w:val="Compact"/>
+            </w:pPr>
+            <w:r>
+              <w:t xml:space="preserve">17</w:t>
+            </w:r>
+          </w:p>
+        </w:tc>
+        <w:tc>
+          <w:tcPr/>
+          <w:p>
+            <w:pPr>
+              <w:pStyle w:val="Compact"/>
+            </w:pPr>
+            <w:r>
+              <w:t xml:space="preserve">Cisco Secure Workload: Virtual Desktop Interface (VDI) Segmentation</w:t>
+            </w:r>
+          </w:p>
+        </w:tc>
+        <w:tc>
+          <w:tcPr/>
+          <w:p>
+            <w:pPr>
+              <w:pStyle w:val="Compact"/>
+            </w:pPr>
+            <w:r>
+              <w:t xml:space="preserve">Covers segmenting VDI environments where many users share a small set of golden images.</w:t>
+            </w:r>
+          </w:p>
+        </w:tc>
+        <w:tc>
+          <w:tcPr/>
+          <w:p>
+            <w:pPr>
+              <w:pStyle w:val="Compact"/>
+            </w:pPr>
+            <w:hyperlink r:id="rId38">
+              <w:r>
+                <w:rPr>
+                  <w:rStyle w:val="Hyperlink"/>
+                </w:rPr>
+                <w:t xml:space="preserve">Watch</w:t>
+              </w:r>
+            </w:hyperlink>
+          </w:p>
+        </w:tc>
+      </w:tr>
     </w:tbl>
-    <w:bookmarkEnd w:id="38"/>
-    <w:bookmarkStart w:id="44" w:name="Xe84731e0fb2aae3b4cd16e37c76ea5e8e3c2cb2"/>
+    <w:bookmarkEnd w:id="39"/>
+    <w:bookmarkStart w:id="45" w:name="Xe84731e0fb2aae3b4cd16e37c76ea5e8e3c2cb2"/>
     <w:p>
       <w:pPr>
         <w:pStyle w:val="Heading3"/>
@@ -3554,57 +3583,6 @@
             <w:pPr>
               <w:pStyle w:val="Compact"/>
             </w:pPr>
-            <w:hyperlink r:id="rId39">
-              <w:r>
-                <w:rPr>
-                  <w:rStyle w:val="Hyperlink"/>
-                </w:rPr>
-                <w:t xml:space="preserve">Watch</w:t>
-              </w:r>
-            </w:hyperlink>
-          </w:p>
-        </w:tc>
-      </w:tr>
-      <w:tr>
-        <w:tc>
-          <w:tcPr/>
-          <w:p>
-            <w:pPr>
-              <w:pStyle w:val="Compact"/>
-            </w:pPr>
-            <w:r>
-              <w:t xml:space="preserve">19</w:t>
-            </w:r>
-          </w:p>
-        </w:tc>
-        <w:tc>
-          <w:tcPr/>
-          <w:p>
-            <w:pPr>
-              <w:pStyle w:val="Compact"/>
-            </w:pPr>
-            <w:r>
-              <w:t xml:space="preserve">Secure Workload &amp; Firewall Integration (Part 2)</w:t>
-            </w:r>
-          </w:p>
-        </w:tc>
-        <w:tc>
-          <w:tcPr/>
-          <w:p>
-            <w:pPr>
-              <w:pStyle w:val="Compact"/>
-            </w:pPr>
-            <w:r>
-              <w:t xml:space="preserve">Part 2: deployment patterns and policy flow.</w:t>
-            </w:r>
-          </w:p>
-        </w:tc>
-        <w:tc>
-          <w:tcPr/>
-          <w:p>
-            <w:pPr>
-              <w:pStyle w:val="Compact"/>
-            </w:pPr>
             <w:hyperlink r:id="rId40">
               <w:r>
                 <w:rPr>
@@ -3624,29 +3602,29 @@
               <w:pStyle w:val="Compact"/>
             </w:pPr>
             <w:r>
-              <w:t xml:space="preserve">20</w:t>
-            </w:r>
-          </w:p>
-        </w:tc>
-        <w:tc>
-          <w:tcPr/>
-          <w:p>
-            <w:pPr>
-              <w:pStyle w:val="Compact"/>
-            </w:pPr>
-            <w:r>
-              <w:t xml:space="preserve">Secure Workload &amp; Firewall Integration (Part 3)</w:t>
-            </w:r>
-          </w:p>
-        </w:tc>
-        <w:tc>
-          <w:tcPr/>
-          <w:p>
-            <w:pPr>
-              <w:pStyle w:val="Compact"/>
-            </w:pPr>
-            <w:r>
-              <w:t xml:space="preserve">Part 3: enforcement, telemetry, and operational considerations.</w:t>
+              <w:t xml:space="preserve">19</w:t>
+            </w:r>
+          </w:p>
+        </w:tc>
+        <w:tc>
+          <w:tcPr/>
+          <w:p>
+            <w:pPr>
+              <w:pStyle w:val="Compact"/>
+            </w:pPr>
+            <w:r>
+              <w:t xml:space="preserve">Secure Workload &amp; Firewall Integration (Part 2)</w:t>
+            </w:r>
+          </w:p>
+        </w:tc>
+        <w:tc>
+          <w:tcPr/>
+          <w:p>
+            <w:pPr>
+              <w:pStyle w:val="Compact"/>
+            </w:pPr>
+            <w:r>
+              <w:t xml:space="preserve">Part 2: deployment patterns and policy flow.</w:t>
             </w:r>
           </w:p>
         </w:tc>
@@ -3675,6 +3653,57 @@
               <w:pStyle w:val="Compact"/>
             </w:pPr>
             <w:r>
+              <w:t xml:space="preserve">20</w:t>
+            </w:r>
+          </w:p>
+        </w:tc>
+        <w:tc>
+          <w:tcPr/>
+          <w:p>
+            <w:pPr>
+              <w:pStyle w:val="Compact"/>
+            </w:pPr>
+            <w:r>
+              <w:t xml:space="preserve">Secure Workload &amp; Firewall Integration (Part 3)</w:t>
+            </w:r>
+          </w:p>
+        </w:tc>
+        <w:tc>
+          <w:tcPr/>
+          <w:p>
+            <w:pPr>
+              <w:pStyle w:val="Compact"/>
+            </w:pPr>
+            <w:r>
+              <w:t xml:space="preserve">Part 3: enforcement, telemetry, and operational considerations.</w:t>
+            </w:r>
+          </w:p>
+        </w:tc>
+        <w:tc>
+          <w:tcPr/>
+          <w:p>
+            <w:pPr>
+              <w:pStyle w:val="Compact"/>
+            </w:pPr>
+            <w:hyperlink r:id="rId42">
+              <w:r>
+                <w:rPr>
+                  <w:rStyle w:val="Hyperlink"/>
+                </w:rPr>
+                <w:t xml:space="preserve">Watch</w:t>
+              </w:r>
+            </w:hyperlink>
+          </w:p>
+        </w:tc>
+      </w:tr>
+      <w:tr>
+        <w:tc>
+          <w:tcPr/>
+          <w:p>
+            <w:pPr>
+              <w:pStyle w:val="Compact"/>
+            </w:pPr>
+            <w:r>
               <w:t xml:space="preserve">21</w:t>
             </w:r>
           </w:p>
@@ -3707,7 +3736,7 @@
             <w:pPr>
               <w:pStyle w:val="Compact"/>
             </w:pPr>
-            <w:hyperlink r:id="rId42">
+            <w:hyperlink r:id="rId43">
               <w:r>
                 <w:rPr>
                   <w:rStyle w:val="Hyperlink"/>
@@ -3758,7 +3787,7 @@
             <w:pPr>
               <w:pStyle w:val="Compact"/>
             </w:pPr>
-            <w:hyperlink r:id="rId43">
+            <w:hyperlink r:id="rId44">
               <w:r>
                 <w:rPr>
                   <w:rStyle w:val="Hyperlink"/>
@@ -3770,8 +3799,8 @@
         </w:tc>
       </w:tr>
     </w:tbl>
-    <w:bookmarkEnd w:id="44"/>
-    <w:bookmarkStart w:id="48" w:name="X9aa0f006b1b738a1139363b734f7ac8f93e2172"/>
+    <w:bookmarkEnd w:id="45"/>
+    <w:bookmarkStart w:id="49" w:name="X9aa0f006b1b738a1139363b734f7ac8f93e2172"/>
     <w:p>
       <w:pPr>
         <w:pStyle w:val="Heading3"/>
@@ -3881,57 +3910,6 @@
             <w:pPr>
               <w:pStyle w:val="Compact"/>
             </w:pPr>
-            <w:hyperlink r:id="rId45">
-              <w:r>
-                <w:rPr>
-                  <w:rStyle w:val="Hyperlink"/>
-                </w:rPr>
-                <w:t xml:space="preserve">Watch</w:t>
-              </w:r>
-            </w:hyperlink>
-          </w:p>
-        </w:tc>
-      </w:tr>
-      <w:tr>
-        <w:tc>
-          <w:tcPr/>
-          <w:p>
-            <w:pPr>
-              <w:pStyle w:val="Compact"/>
-            </w:pPr>
-            <w:r>
-              <w:t xml:space="preserve">24</w:t>
-            </w:r>
-          </w:p>
-        </w:tc>
-        <w:tc>
-          <w:tcPr/>
-          <w:p>
-            <w:pPr>
-              <w:pStyle w:val="Compact"/>
-            </w:pPr>
-            <w:r>
-              <w:t xml:space="preserve">Cisco Tetration and F5 BIG-IP AFM</w:t>
-            </w:r>
-          </w:p>
-        </w:tc>
-        <w:tc>
-          <w:tcPr/>
-          <w:p>
-            <w:pPr>
-              <w:pStyle w:val="Compact"/>
-            </w:pPr>
-            <w:r>
-              <w:t xml:space="preserve">Covers integration with F5 BIG-IP AFM (Advanced Firewall Manager) for additional flow context.</w:t>
-            </w:r>
-          </w:p>
-        </w:tc>
-        <w:tc>
-          <w:tcPr/>
-          <w:p>
-            <w:pPr>
-              <w:pStyle w:val="Compact"/>
-            </w:pPr>
             <w:hyperlink r:id="rId46">
               <w:r>
                 <w:rPr>
@@ -3951,29 +3929,29 @@
               <w:pStyle w:val="Compact"/>
             </w:pPr>
             <w:r>
-              <w:t xml:space="preserve">25</w:t>
-            </w:r>
-          </w:p>
-        </w:tc>
-        <w:tc>
-          <w:tcPr/>
-          <w:p>
-            <w:pPr>
-              <w:pStyle w:val="Compact"/>
-            </w:pPr>
-            <w:r>
-              <w:t xml:space="preserve">Cisco Tetration and F5 BIG-IP IPFIX Configuration</w:t>
-            </w:r>
-          </w:p>
-        </w:tc>
-        <w:tc>
-          <w:tcPr/>
-          <w:p>
-            <w:pPr>
-              <w:pStyle w:val="Compact"/>
-            </w:pPr>
-            <w:r>
-              <w:t xml:space="preserve">Configuration walk-through for sending IPFIX flow records from F5 BIG-IP into Secure Workload.</w:t>
+              <w:t xml:space="preserve">24</w:t>
+            </w:r>
+          </w:p>
+        </w:tc>
+        <w:tc>
+          <w:tcPr/>
+          <w:p>
+            <w:pPr>
+              <w:pStyle w:val="Compact"/>
+            </w:pPr>
+            <w:r>
+              <w:t xml:space="preserve">Cisco Tetration and F5 BIG-IP AFM</w:t>
+            </w:r>
+          </w:p>
+        </w:tc>
+        <w:tc>
+          <w:tcPr/>
+          <w:p>
+            <w:pPr>
+              <w:pStyle w:val="Compact"/>
+            </w:pPr>
+            <w:r>
+              <w:t xml:space="preserve">Covers integration with F5 BIG-IP AFM (Advanced Firewall Manager) for additional flow context.</w:t>
             </w:r>
           </w:p>
         </w:tc>
@@ -3994,9 +3972,60 @@
           </w:p>
         </w:tc>
       </w:tr>
+      <w:tr>
+        <w:tc>
+          <w:tcPr/>
+          <w:p>
+            <w:pPr>
+              <w:pStyle w:val="Compact"/>
+            </w:pPr>
+            <w:r>
+              <w:t xml:space="preserve">25</w:t>
+            </w:r>
+          </w:p>
+        </w:tc>
+        <w:tc>
+          <w:tcPr/>
+          <w:p>
+            <w:pPr>
+              <w:pStyle w:val="Compact"/>
+            </w:pPr>
+            <w:r>
+              <w:t xml:space="preserve">Cisco Tetration and F5 BIG-IP IPFIX Configuration</w:t>
+            </w:r>
+          </w:p>
+        </w:tc>
+        <w:tc>
+          <w:tcPr/>
+          <w:p>
+            <w:pPr>
+              <w:pStyle w:val="Compact"/>
+            </w:pPr>
+            <w:r>
+              <w:t xml:space="preserve">Configuration walk-through for sending IPFIX flow records from F5 BIG-IP into Secure Workload.</w:t>
+            </w:r>
+          </w:p>
+        </w:tc>
+        <w:tc>
+          <w:tcPr/>
+          <w:p>
+            <w:pPr>
+              <w:pStyle w:val="Compact"/>
+            </w:pPr>
+            <w:hyperlink r:id="rId48">
+              <w:r>
+                <w:rPr>
+                  <w:rStyle w:val="Hyperlink"/>
+                </w:rPr>
+                <w:t xml:space="preserve">Watch</w:t>
+              </w:r>
+            </w:hyperlink>
+          </w:p>
+        </w:tc>
+      </w:tr>
     </w:tbl>
-    <w:bookmarkEnd w:id="48"/>
-    <w:bookmarkStart w:id="54" w:name="X4bf09ee1bba42ec2ec42d9c65ff0742e1c265e7"/>
+    <w:bookmarkEnd w:id="49"/>
+    <w:bookmarkStart w:id="55" w:name="X4bf09ee1bba42ec2ec42d9c65ff0742e1c265e7"/>
     <w:p>
       <w:pPr>
         <w:pStyle w:val="Heading3"/>
@@ -4106,57 +4135,6 @@
             <w:pPr>
               <w:pStyle w:val="Compact"/>
             </w:pPr>
-            <w:hyperlink r:id="rId49">
-              <w:r>
-                <w:rPr>
-                  <w:rStyle w:val="Hyperlink"/>
-                </w:rPr>
-                <w:t xml:space="preserve">Watch</w:t>
-              </w:r>
-            </w:hyperlink>
-          </w:p>
-        </w:tc>
-      </w:tr>
-      <w:tr>
-        <w:tc>
-          <w:tcPr/>
-          <w:p>
-            <w:pPr>
-              <w:pStyle w:val="Compact"/>
-            </w:pPr>
-            <w:r>
-              <w:t xml:space="preserve">27</w:t>
-            </w:r>
-          </w:p>
-        </w:tc>
-        <w:tc>
-          <w:tcPr/>
-          <w:p>
-            <w:pPr>
-              <w:pStyle w:val="Compact"/>
-            </w:pPr>
-            <w:r>
-              <w:t xml:space="preserve">Cisco Secure Workload — Infoblox Integration</w:t>
-            </w:r>
-          </w:p>
-        </w:tc>
-        <w:tc>
-          <w:tcPr/>
-          <w:p>
-            <w:pPr>
-              <w:pStyle w:val="Compact"/>
-            </w:pPr>
-            <w:r>
-              <w:t xml:space="preserve">Covers integrating Infoblox DNS / IPAM data for richer workload context inside Secure Workload.</w:t>
-            </w:r>
-          </w:p>
-        </w:tc>
-        <w:tc>
-          <w:tcPr/>
-          <w:p>
-            <w:pPr>
-              <w:pStyle w:val="Compact"/>
-            </w:pPr>
             <w:hyperlink r:id="rId50">
               <w:r>
                 <w:rPr>
@@ -4176,29 +4154,29 @@
               <w:pStyle w:val="Compact"/>
             </w:pPr>
             <w:r>
-              <w:t xml:space="preserve">28</w:t>
-            </w:r>
-          </w:p>
-        </w:tc>
-        <w:tc>
-          <w:tcPr/>
-          <w:p>
-            <w:pPr>
-              <w:pStyle w:val="Compact"/>
-            </w:pPr>
-            <w:r>
-              <w:t xml:space="preserve">Cisco Secure Workload and Algosec Integration</w:t>
-            </w:r>
-          </w:p>
-        </w:tc>
-        <w:tc>
-          <w:tcPr/>
-          <w:p>
-            <w:pPr>
-              <w:pStyle w:val="Compact"/>
-            </w:pPr>
-            <w:r>
-              <w:t xml:space="preserve">Covers integrating Algosec for policy analysis and firewall-policy lifecycle alongside Secure Workload.</w:t>
+              <w:t xml:space="preserve">27</w:t>
+            </w:r>
+          </w:p>
+        </w:tc>
+        <w:tc>
+          <w:tcPr/>
+          <w:p>
+            <w:pPr>
+              <w:pStyle w:val="Compact"/>
+            </w:pPr>
+            <w:r>
+              <w:t xml:space="preserve">Cisco Secure Workload — Infoblox Integration</w:t>
+            </w:r>
+          </w:p>
+        </w:tc>
+        <w:tc>
+          <w:tcPr/>
+          <w:p>
+            <w:pPr>
+              <w:pStyle w:val="Compact"/>
+            </w:pPr>
+            <w:r>
+              <w:t xml:space="preserve">Covers integrating Infoblox DNS / IPAM data for richer workload context inside Secure Workload.</w:t>
             </w:r>
           </w:p>
         </w:tc>
@@ -4227,29 +4205,29 @@
               <w:pStyle w:val="Compact"/>
             </w:pPr>
             <w:r>
-              <w:t xml:space="preserve">29</w:t>
-            </w:r>
-          </w:p>
-        </w:tc>
-        <w:tc>
-          <w:tcPr/>
-          <w:p>
-            <w:pPr>
-              <w:pStyle w:val="Compact"/>
-            </w:pPr>
-            <w:r>
-              <w:t xml:space="preserve">Cisco Secure Workload and ISE (In Action)</w:t>
-            </w:r>
-          </w:p>
-        </w:tc>
-        <w:tc>
-          <w:tcPr/>
-          <w:p>
-            <w:pPr>
-              <w:pStyle w:val="Compact"/>
-            </w:pPr>
-            <w:r>
-              <w:t xml:space="preserve">Demonstrates Secure Workload integration with Cisco ISE for user and device identity context.</w:t>
+              <w:t xml:space="preserve">28</w:t>
+            </w:r>
+          </w:p>
+        </w:tc>
+        <w:tc>
+          <w:tcPr/>
+          <w:p>
+            <w:pPr>
+              <w:pStyle w:val="Compact"/>
+            </w:pPr>
+            <w:r>
+              <w:t xml:space="preserve">Cisco Secure Workload and Algosec Integration</w:t>
+            </w:r>
+          </w:p>
+        </w:tc>
+        <w:tc>
+          <w:tcPr/>
+          <w:p>
+            <w:pPr>
+              <w:pStyle w:val="Compact"/>
+            </w:pPr>
+            <w:r>
+              <w:t xml:space="preserve">Covers integrating Algosec for policy analysis and firewall-policy lifecycle alongside Secure Workload.</w:t>
             </w:r>
           </w:p>
         </w:tc>
@@ -4278,29 +4256,29 @@
               <w:pStyle w:val="Compact"/>
             </w:pPr>
             <w:r>
-              <w:t xml:space="preserve">30</w:t>
-            </w:r>
-          </w:p>
-        </w:tc>
-        <w:tc>
-          <w:tcPr/>
-          <w:p>
-            <w:pPr>
-              <w:pStyle w:val="Compact"/>
-            </w:pPr>
-            <w:r>
-              <w:t xml:space="preserve">FMC Integration with Edge / Ingest / Appliance</w:t>
-            </w:r>
-          </w:p>
-        </w:tc>
-        <w:tc>
-          <w:tcPr/>
-          <w:p>
-            <w:pPr>
-              <w:pStyle w:val="Compact"/>
-            </w:pPr>
-            <w:r>
-              <w:t xml:space="preserve">Covers integrating Cisco FMC (Firewall Management Center) through Secure Workload's Edge, Ingest, and Appliance integration paths.</w:t>
+              <w:t xml:space="preserve">29</w:t>
+            </w:r>
+          </w:p>
+        </w:tc>
+        <w:tc>
+          <w:tcPr/>
+          <w:p>
+            <w:pPr>
+              <w:pStyle w:val="Compact"/>
+            </w:pPr>
+            <w:r>
+              <w:t xml:space="preserve">Cisco Secure Workload and ISE (In Action)</w:t>
+            </w:r>
+          </w:p>
+        </w:tc>
+        <w:tc>
+          <w:tcPr/>
+          <w:p>
+            <w:pPr>
+              <w:pStyle w:val="Compact"/>
+            </w:pPr>
+            <w:r>
+              <w:t xml:space="preserve">Demonstrates Secure Workload integration with Cisco ISE for user and device identity context.</w:t>
             </w:r>
           </w:p>
         </w:tc>
@@ -4321,9 +4299,60 @@
           </w:p>
         </w:tc>
       </w:tr>
+      <w:tr>
+        <w:tc>
+          <w:tcPr/>
+          <w:p>
+            <w:pPr>
+              <w:pStyle w:val="Compact"/>
+            </w:pPr>
+            <w:r>
+              <w:t xml:space="preserve">30</w:t>
+            </w:r>
+          </w:p>
+        </w:tc>
+        <w:tc>
+          <w:tcPr/>
+          <w:p>
+            <w:pPr>
+              <w:pStyle w:val="Compact"/>
+            </w:pPr>
+            <w:r>
+              <w:t xml:space="preserve">FMC Integration with Edge / Ingest / Appliance</w:t>
+            </w:r>
+          </w:p>
+        </w:tc>
+        <w:tc>
+          <w:tcPr/>
+          <w:p>
+            <w:pPr>
+              <w:pStyle w:val="Compact"/>
+            </w:pPr>
+            <w:r>
+              <w:t xml:space="preserve">Covers integrating Cisco FMC (Firewall Management Center) through Secure Workload's Edge, Ingest, and Appliance integration paths.</w:t>
+            </w:r>
+          </w:p>
+        </w:tc>
+        <w:tc>
+          <w:tcPr/>
+          <w:p>
+            <w:pPr>
+              <w:pStyle w:val="Compact"/>
+            </w:pPr>
+            <w:hyperlink r:id="rId54">
+              <w:r>
+                <w:rPr>
+                  <w:rStyle w:val="Hyperlink"/>
+                </w:rPr>
+                <w:t xml:space="preserve">Watch</w:t>
+              </w:r>
+            </w:hyperlink>
+          </w:p>
+        </w:tc>
+      </w:tr>
     </w:tbl>
-    <w:bookmarkEnd w:id="54"/>
-    <w:bookmarkStart w:id="56" w:name="X55b54997538aa12b2c052078f6e47c5b6dc01c1"/>
+    <w:bookmarkEnd w:id="55"/>
+    <w:bookmarkStart w:id="57" w:name="X55b54997538aa12b2c052078f6e47c5b6dc01c1"/>
     <w:p>
       <w:pPr>
         <w:pStyle w:val="Heading3"/>
@@ -4433,7 +4462,7 @@
             <w:pPr>
               <w:pStyle w:val="Compact"/>
             </w:pPr>
-            <w:hyperlink r:id="rId55">
+            <w:hyperlink r:id="rId56">
               <w:r>
                 <w:rPr>
                   <w:rStyle w:val="Hyperlink"/>
@@ -4445,8 +4474,8 @@
         </w:tc>
       </w:tr>
     </w:tbl>
-    <w:bookmarkEnd w:id="56"/>
-    <w:bookmarkStart w:id="57" w:name="suggested-watch-order"/>
+    <w:bookmarkEnd w:id="57"/>
+    <w:bookmarkStart w:id="58" w:name="suggested-watch-order"/>
     <w:p>
       <w:pPr>
         <w:pStyle w:val="Heading3"/>
@@ -4624,9 +4653,9 @@
         </w:pict>
       </w:r>
     </w:p>
-    <w:bookmarkEnd w:id="57"/>
     <w:bookmarkEnd w:id="58"/>
-    <w:bookmarkStart w:id="62" w:name="Xb9f64f467495bd55447e9bc3c7ae8dd7dbb3895"/>
+    <w:bookmarkEnd w:id="59"/>
+    <w:bookmarkStart w:id="63" w:name="Xb9f64f467495bd55447e9bc3c7ae8dd7dbb3895"/>
     <w:p>
       <w:pPr>
         <w:pStyle w:val="Heading2"/>
@@ -4635,7 +4664,7 @@
         <w:t xml:space="preserve">7. How to Explain CSW in a Customer Meeting</w:t>
       </w:r>
     </w:p>
-    <w:bookmarkStart w:id="59" w:name="X02667f004e9d93967c02b53649e8d7704fae290"/>
+    <w:bookmarkStart w:id="60" w:name="X02667f004e9d93967c02b53649e8d7704fae290"/>
     <w:p>
       <w:pPr>
         <w:pStyle w:val="Heading3"/>
@@ -4652,8 +4681,8 @@
         <w:t xml:space="preserve">Cisco Secure Workload helps customers discover how applications communicate and then safely enforce least-privilege segmentation policies around those applications. It starts with visibility and dependency mapping, uses labels and observed behavior to create policy, and supports staged enforcement so teams can reduce lateral movement risk without breaking applications.</w:t>
       </w:r>
     </w:p>
-    <w:bookmarkEnd w:id="59"/>
-    <w:bookmarkStart w:id="60" w:name="X245c304b430f838300b4e5d227cae86dea678fa"/>
+    <w:bookmarkEnd w:id="60"/>
+    <w:bookmarkStart w:id="61" w:name="X245c304b430f838300b4e5d227cae86dea678fa"/>
     <w:p>
       <w:pPr>
         <w:pStyle w:val="Heading3"/>
@@ -4670,8 +4699,8 @@
         <w:t xml:space="preserve">Most enterprises want micro-segmentation, but they hesitate because they do not fully know what their applications depend on. CSW starts by collecting workload telemetry, flow visibility, process context, cloud metadata, and CMDB labels. That data helps application teams understand real dependencies. From there, teams can model policy, see what would be blocked, tune the rules, and move selected workloads from monitor mode to enforcement. CSW is especially useful when customers need consistent segmentation across data center and cloud environments.</w:t>
       </w:r>
     </w:p>
-    <w:bookmarkEnd w:id="60"/>
-    <w:bookmarkStart w:id="61" w:name="common-positioning"/>
+    <w:bookmarkEnd w:id="61"/>
+    <w:bookmarkStart w:id="62" w:name="common-positioning"/>
     <w:p>
       <w:pPr>
         <w:pStyle w:val="Heading3"/>
@@ -4797,9 +4826,9 @@
         </w:pict>
       </w:r>
     </w:p>
-    <w:bookmarkEnd w:id="61"/>
     <w:bookmarkEnd w:id="62"/>
-    <w:bookmarkStart w:id="72" w:name="X861afc8e8f3d3fa2cbc4317cb6150d80f9f9ccf"/>
+    <w:bookmarkEnd w:id="63"/>
+    <w:bookmarkStart w:id="73" w:name="X861afc8e8f3d3fa2cbc4317cb6150d80f9f9ccf"/>
     <w:p>
       <w:pPr>
         <w:pStyle w:val="Heading2"/>
@@ -4808,7 +4837,7 @@
         <w:t xml:space="preserve">8. CSW Onboarding Runbook</w:t>
       </w:r>
     </w:p>
-    <w:bookmarkStart w:id="63" w:name="phase-0---confirm-scope-and-outcomes"/>
+    <w:bookmarkStart w:id="64" w:name="phase-0---confirm-scope-and-outcomes"/>
     <w:p>
       <w:pPr>
         <w:pStyle w:val="Heading3"/>
@@ -4992,8 +5021,8 @@
         </w:pict>
       </w:r>
     </w:p>
-    <w:bookmarkEnd w:id="63"/>
-    <w:bookmarkStart w:id="64" w:name="phase-1---prepare-the-tenant-and-access"/>
+    <w:bookmarkEnd w:id="64"/>
+    <w:bookmarkStart w:id="65" w:name="phase-1---prepare-the-tenant-and-access"/>
     <w:p>
       <w:pPr>
         <w:pStyle w:val="Heading3"/>
@@ -5117,8 +5146,8 @@
         </w:pict>
       </w:r>
     </w:p>
-    <w:bookmarkEnd w:id="64"/>
-    <w:bookmarkStart w:id="65" w:name="phase-2---build-the-label-strategy"/>
+    <w:bookmarkEnd w:id="65"/>
+    <w:bookmarkStart w:id="66" w:name="phase-2---build-the-label-strategy"/>
     <w:p>
       <w:pPr>
         <w:pStyle w:val="Heading3"/>
@@ -5684,8 +5713,8 @@
         </w:pict>
       </w:r>
     </w:p>
-    <w:bookmarkEnd w:id="65"/>
-    <w:bookmarkStart w:id="66" w:name="phase-3---deploy-agents-and-connectors"/>
+    <w:bookmarkEnd w:id="66"/>
+    <w:bookmarkStart w:id="67" w:name="phase-3---deploy-agents-and-connectors"/>
     <w:p>
       <w:pPr>
         <w:pStyle w:val="Heading3"/>
@@ -5821,8 +5850,8 @@
         </w:pict>
       </w:r>
     </w:p>
-    <w:bookmarkEnd w:id="66"/>
-    <w:bookmarkStart w:id="67" w:name="X85d4e4be5891f720f2552e26364a87ec66b02af"/>
+    <w:bookmarkEnd w:id="67"/>
+    <w:bookmarkStart w:id="68" w:name="X85d4e4be5891f720f2552e26364a87ec66b02af"/>
     <w:p>
       <w:pPr>
         <w:pStyle w:val="Heading3"/>
@@ -5958,8 +5987,8 @@
         </w:pict>
       </w:r>
     </w:p>
-    <w:bookmarkEnd w:id="67"/>
-    <w:bookmarkStart w:id="68" w:name="phase-5---model-policy"/>
+    <w:bookmarkEnd w:id="68"/>
+    <w:bookmarkStart w:id="69" w:name="phase-5---model-policy"/>
     <w:p>
       <w:pPr>
         <w:pStyle w:val="Heading3"/>
@@ -6095,8 +6124,8 @@
         </w:pict>
       </w:r>
     </w:p>
-    <w:bookmarkEnd w:id="68"/>
-    <w:bookmarkStart w:id="69" w:name="phase-6---start-in-monitor-mode"/>
+    <w:bookmarkEnd w:id="69"/>
+    <w:bookmarkStart w:id="70" w:name="phase-6---start-in-monitor-mode"/>
     <w:p>
       <w:pPr>
         <w:pStyle w:val="Heading3"/>
@@ -6220,8 +6249,8 @@
         </w:pict>
       </w:r>
     </w:p>
-    <w:bookmarkEnd w:id="69"/>
-    <w:bookmarkStart w:id="70" w:name="phase-7---enforce-in-a-controlled-scope"/>
+    <w:bookmarkEnd w:id="70"/>
+    <w:bookmarkStart w:id="71" w:name="phase-7---enforce-in-a-controlled-scope"/>
     <w:p>
       <w:pPr>
         <w:pStyle w:val="Heading3"/>
@@ -6381,8 +6410,8 @@
         </w:pict>
       </w:r>
     </w:p>
-    <w:bookmarkEnd w:id="70"/>
-    <w:bookmarkStart w:id="71" w:name="phase-8---operationalize"/>
+    <w:bookmarkEnd w:id="71"/>
+    <w:bookmarkStart w:id="72" w:name="phase-8---operationalize"/>
     <w:p>
       <w:pPr>
         <w:pStyle w:val="Heading3"/>
@@ -6530,9 +6559,9 @@
         </w:pict>
       </w:r>
     </w:p>
-    <w:bookmarkEnd w:id="71"/>
     <w:bookmarkEnd w:id="72"/>
-    <w:bookmarkStart w:id="73" w:name="X67792f16bd81b6e95001d9627ef1e2127c941c5"/>
+    <w:bookmarkEnd w:id="73"/>
+    <w:bookmarkStart w:id="74" w:name="X67792f16bd81b6e95001d9627ef1e2127c941c5"/>
     <w:p>
       <w:pPr>
         <w:pStyle w:val="Heading2"/>
@@ -6736,8 +6765,8 @@
         </w:pict>
       </w:r>
     </w:p>
-    <w:bookmarkEnd w:id="73"/>
-    <w:bookmarkStart w:id="74" w:name="Xe3d4887c83d95160b9d75f09aebe5899dbbe065"/>
+    <w:bookmarkEnd w:id="74"/>
+    <w:bookmarkStart w:id="75" w:name="Xe3d4887c83d95160b9d75f09aebe5899dbbe065"/>
     <w:p>
       <w:pPr>
         <w:pStyle w:val="Heading2"/>
@@ -7175,8 +7204,8 @@
         </w:pict>
       </w:r>
     </w:p>
-    <w:bookmarkEnd w:id="74"/>
-    <w:bookmarkStart w:id="75" w:name="X3a0851872a13412add7784181f5bc7c74c6084b"/>
+    <w:bookmarkEnd w:id="75"/>
+    <w:bookmarkStart w:id="76" w:name="X3a0851872a13412add7784181f5bc7c74c6084b"/>
     <w:p>
       <w:pPr>
         <w:pStyle w:val="Heading2"/>
@@ -7398,8 +7427,8 @@
         </w:pict>
       </w:r>
     </w:p>
-    <w:bookmarkEnd w:id="75"/>
-    <w:bookmarkStart w:id="76" w:name="Xfed9d69b88147d94e8bc0dfd5dae9f34760df84"/>
+    <w:bookmarkEnd w:id="76"/>
+    <w:bookmarkStart w:id="77" w:name="Xfed9d69b88147d94e8bc0dfd5dae9f34760df84"/>
     <w:p>
       <w:pPr>
         <w:pStyle w:val="Heading2"/>
@@ -7533,8 +7562,8 @@
         </w:pict>
       </w:r>
     </w:p>
-    <w:bookmarkEnd w:id="76"/>
-    <w:bookmarkStart w:id="77" w:name="X0c2ed5a214feef6529510a3cb85eae535b5e9d5"/>
+    <w:bookmarkEnd w:id="77"/>
+    <w:bookmarkStart w:id="78" w:name="X0c2ed5a214feef6529510a3cb85eae535b5e9d5"/>
     <w:p>
       <w:pPr>
         <w:pStyle w:val="Heading2"/>
@@ -7618,8 +7647,8 @@
         <w:t xml:space="preserve">Validate current release-specific support matrices before presenting platform coverage.</w:t>
       </w:r>
     </w:p>
-    <w:bookmarkEnd w:id="77"/>
     <w:bookmarkEnd w:id="78"/>
+    <w:bookmarkEnd w:id="79"/>
     <w:sectPr>
       <w:footnotePr>
         <w:numRestart w:val="eachSect"/>

</xml_diff>

<commit_message>
docs: disclaimer, fix video count, regenerate guide PDF/DOCX
Add non-official Cisco disclaimer to README and guide. Correct catalog
size to 36 entries. Regenerate Word and PDF artifacts from current Markdown.

Co-authored-by: Cursor <cursoragent@cursor.com>
</commit_message>
<xml_diff>
--- a/docs/user-education/CSW-User-Education-Guide.docx
+++ b/docs/user-education/CSW-User-Education-Guide.docx
@@ -31,7 +31,7 @@
         <w:pStyle w:val="Date"/>
       </w:pPr>
       <w:r>
-        <w:t xml:space="preserve">2026-05-14</w:t>
+        <w:t xml:space="preserve">2026-05-22</w:t>
       </w:r>
     </w:p>
     <w:sdt>
@@ -60,7 +60,7 @@
         </w:p>
       </w:sdtContent>
     </w:sdt>
-    <w:bookmarkStart w:id="88" w:name="X92ee979ebdbb38d988228e1ce971d57f1b349ff"/>
+    <w:bookmarkStart w:id="89" w:name="X92ee979ebdbb38d988228e1ce971d57f1b349ff"/>
     <w:p>
       <w:pPr>
         <w:pStyle w:val="Heading1"/>
@@ -101,7 +101,41 @@
     </w:p>
     <w:p>
       <w:pPr>
-        <w:pStyle w:val="BodyText"/>
+        <w:pStyle w:val="BlockText"/>
+      </w:pPr>
+      <w:r>
+        <w:rPr>
+          <w:b/>
+          <w:bCs/>
+        </w:rPr>
+        <w:t xml:space="preserve">Disclaimer:</w:t>
+      </w:r>
+      <w:r>
+        <w:t xml:space="preserve"> </w:t>
+      </w:r>
+      <w:r>
+        <w:t xml:space="preserve">This guide is</w:t>
+      </w:r>
+      <w:r>
+        <w:t xml:space="preserve"> </w:t>
+      </w:r>
+      <w:r>
+        <w:rPr>
+          <w:b/>
+          <w:bCs/>
+        </w:rPr>
+        <w:t xml:space="preserve">not</w:t>
+      </w:r>
+      <w:r>
+        <w:t xml:space="preserve"> </w:t>
+      </w:r>
+      <w:r>
+        <w:t xml:space="preserve">official Cisco product documentation. It is companion learning material for customer and partner education. Validate all design, scope, and feature support against your tenant's in-product documentation and Cisco product documentation before production use.</w:t>
+      </w:r>
+    </w:p>
+    <w:p>
+      <w:pPr>
+        <w:pStyle w:val="FirstParagraph"/>
       </w:pPr>
       <w:r>
         <w:t xml:space="preserve">Use this as a user-friendly starting point. It is intentionally written in practical language, not as a replacement for Cisco product documentation, release notes, or design validation.</w:t>
@@ -115,7 +149,7 @@
       </w:r>
     </w:p>
     <w:bookmarkEnd w:id="9"/>
-    <w:bookmarkStart w:id="10" w:name="X5feec5e5859d845760ab99c4f8063ea357a0918"/>
+    <w:bookmarkStart w:id="11" w:name="X5feec5e5859d845760ab99c4f8063ea357a0918"/>
     <w:p>
       <w:pPr>
         <w:pStyle w:val="Heading2"/>
@@ -230,6 +264,156 @@
       </w:pPr>
       <w:r>
         <w:t xml:space="preserve">CSW is not just a firewall rule tool. It is an application dependency mapping, workload labeling, policy modeling, and micro-segmentation platform. The value comes from combining telemetry, labels, policy simulation, and controlled enforcement.</w:t>
+      </w:r>
+    </w:p>
+    <w:bookmarkStart w:id="10" w:name="X19c494ce018b7a65ec4b390853f875c213f86aa"/>
+    <w:p>
+      <w:pPr>
+        <w:pStyle w:val="Heading3"/>
+      </w:pPr>
+      <w:r>
+        <w:t xml:space="preserve">1.1 Micro-segmentation is a journey</w:t>
+      </w:r>
+    </w:p>
+    <w:p>
+      <w:pPr>
+        <w:pStyle w:val="FirstParagraph"/>
+      </w:pPr>
+      <w:r>
+        <w:t xml:space="preserve">Micro-segmentation is</w:t>
+      </w:r>
+      <w:r>
+        <w:t xml:space="preserve"> </w:t>
+      </w:r>
+      <w:r>
+        <w:rPr>
+          <w:b/>
+          <w:bCs/>
+        </w:rPr>
+        <w:t xml:space="preserve">not</w:t>
+      </w:r>
+      <w:r>
+        <w:t xml:space="preserve"> </w:t>
+      </w:r>
+      <w:r>
+        <w:t xml:space="preserve">something you create once and forget. Applications change — new microservices, refactors, cloud moves, patches, and integrations all shift real dependencies. Policy must stay aligned with that change or you either block legitimate traffic or slowly reopen paths you thought were closed.</w:t>
+      </w:r>
+    </w:p>
+    <w:p>
+      <w:pPr>
+        <w:pStyle w:val="BodyText"/>
+      </w:pPr>
+      <w:r>
+        <w:t xml:space="preserve">CSW supports an ongoing program, not a one-off cutover:</w:t>
+      </w:r>
+    </w:p>
+    <w:p>
+      <w:pPr>
+        <w:pStyle w:val="Compact"/>
+        <w:numPr>
+          <w:ilvl w:val="0"/>
+          <w:numId w:val="1002"/>
+        </w:numPr>
+      </w:pPr>
+      <w:r>
+        <w:rPr>
+          <w:b/>
+          <w:bCs/>
+        </w:rPr>
+        <w:t xml:space="preserve">Keep seeing the truth</w:t>
+      </w:r>
+      <w:r>
+        <w:t xml:space="preserve"> </w:t>
+      </w:r>
+      <w:r>
+        <w:t xml:space="preserve">— continuous flow and process telemetry (where enabled) so dependency maps reflect production, not a point-in-time snapshot.</w:t>
+      </w:r>
+    </w:p>
+    <w:p>
+      <w:pPr>
+        <w:pStyle w:val="Compact"/>
+        <w:numPr>
+          <w:ilvl w:val="0"/>
+          <w:numId w:val="1002"/>
+        </w:numPr>
+      </w:pPr>
+      <w:r>
+        <w:rPr>
+          <w:b/>
+          <w:bCs/>
+        </w:rPr>
+        <w:t xml:space="preserve">Catch drift early</w:t>
+      </w:r>
+      <w:r>
+        <w:t xml:space="preserve"> </w:t>
+      </w:r>
+      <w:r>
+        <w:t xml:space="preserve">— monitor and simulation modes highlight new conversations before enforcement surprises an app owner.</w:t>
+      </w:r>
+    </w:p>
+    <w:p>
+      <w:pPr>
+        <w:pStyle w:val="Compact"/>
+        <w:numPr>
+          <w:ilvl w:val="0"/>
+          <w:numId w:val="1002"/>
+        </w:numPr>
+      </w:pPr>
+      <w:r>
+        <w:rPr>
+          <w:b/>
+          <w:bCs/>
+        </w:rPr>
+        <w:t xml:space="preserve">Adapt policy deliberately</w:t>
+      </w:r>
+      <w:r>
+        <w:t xml:space="preserve"> </w:t>
+      </w:r>
+      <w:r>
+        <w:t xml:space="preserve">— ADM, labels, scopes, and modeling workflows exist to update allow rules when the business legitimately changes; vulnerability and forensics layers tighten or investigate when risk changes.</w:t>
+      </w:r>
+    </w:p>
+    <w:p>
+      <w:pPr>
+        <w:pStyle w:val="Compact"/>
+        <w:numPr>
+          <w:ilvl w:val="0"/>
+          <w:numId w:val="1002"/>
+        </w:numPr>
+      </w:pPr>
+      <w:r>
+        <w:rPr>
+          <w:b/>
+          <w:bCs/>
+        </w:rPr>
+        <w:t xml:space="preserve">Operate for the long run</w:t>
+      </w:r>
+      <w:r>
+        <w:t xml:space="preserve"> </w:t>
+      </w:r>
+      <w:r>
+        <w:t xml:space="preserve">— change control, app-owner signoff, label sync from CMDB/cloud tags, API/CI/CD automation, and drift checks (see § 6.7 and § 8 Phase 8) are how teams sustain segmentation after the POV ends.</w:t>
+      </w:r>
+    </w:p>
+    <w:p>
+      <w:pPr>
+        <w:pStyle w:val="FirstParagraph"/>
+      </w:pPr>
+      <w:r>
+        <w:t xml:space="preserve">The phased roadmap in § 5 is a</w:t>
+      </w:r>
+      <w:r>
+        <w:t xml:space="preserve"> </w:t>
+      </w:r>
+      <w:r>
+        <w:rPr>
+          <w:b/>
+          <w:bCs/>
+        </w:rPr>
+        <w:t xml:space="preserve">on-ramp</w:t>
+      </w:r>
+      <w:r>
+        <w:t xml:space="preserve">. Phases 4–5 and day-2 operational practices are where journey-minded teams live after initial enforcement.</w:t>
       </w:r>
     </w:p>
     <w:p>
@@ -240,7 +424,8 @@
       </w:r>
     </w:p>
     <w:bookmarkEnd w:id="10"/>
-    <w:bookmarkStart w:id="15" w:name="X65a3ca2c4eb11e28f1c01acdfed178fb2c5bbdd"/>
+    <w:bookmarkEnd w:id="11"/>
+    <w:bookmarkStart w:id="16" w:name="X65a3ca2c4eb11e28f1c01acdfed178fb2c5bbdd"/>
     <w:p>
       <w:pPr>
         <w:pStyle w:val="Heading2"/>
@@ -294,7 +479,7 @@
         <w:t xml:space="preserve">, based on real observed application behavior.</w:t>
       </w:r>
     </w:p>
-    <w:bookmarkStart w:id="11" w:name="X2ac810635cc91a37a9eb992deb3575abc311cf5"/>
+    <w:bookmarkStart w:id="12" w:name="X2ac810635cc91a37a9eb992deb3575abc311cf5"/>
     <w:p>
       <w:pPr>
         <w:pStyle w:val="Heading3"/>
@@ -316,7 +501,7 @@
         <w:pStyle w:val="Compact"/>
         <w:numPr>
           <w:ilvl w:val="0"/>
-          <w:numId w:val="1002"/>
+          <w:numId w:val="1003"/>
         </w:numPr>
       </w:pPr>
       <w:r>
@@ -338,7 +523,7 @@
         <w:pStyle w:val="Compact"/>
         <w:numPr>
           <w:ilvl w:val="0"/>
-          <w:numId w:val="1002"/>
+          <w:numId w:val="1003"/>
         </w:numPr>
       </w:pPr>
       <w:r>
@@ -360,7 +545,7 @@
         <w:pStyle w:val="Compact"/>
         <w:numPr>
           <w:ilvl w:val="0"/>
-          <w:numId w:val="1002"/>
+          <w:numId w:val="1003"/>
         </w:numPr>
       </w:pPr>
       <w:r>
@@ -382,7 +567,7 @@
         <w:pStyle w:val="Compact"/>
         <w:numPr>
           <w:ilvl w:val="0"/>
-          <w:numId w:val="1002"/>
+          <w:numId w:val="1003"/>
         </w:numPr>
       </w:pPr>
       <w:r>
@@ -404,7 +589,7 @@
         <w:pStyle w:val="Compact"/>
         <w:numPr>
           <w:ilvl w:val="0"/>
-          <w:numId w:val="1002"/>
+          <w:numId w:val="1003"/>
         </w:numPr>
       </w:pPr>
       <w:r>
@@ -426,7 +611,7 @@
         <w:pStyle w:val="Compact"/>
         <w:numPr>
           <w:ilvl w:val="0"/>
-          <w:numId w:val="1002"/>
+          <w:numId w:val="1003"/>
         </w:numPr>
       </w:pPr>
       <w:r>
@@ -648,8 +833,8 @@
         <w:t xml:space="preserve">. That is exactly the layer CSW controls.</w:t>
       </w:r>
     </w:p>
-    <w:bookmarkEnd w:id="11"/>
-    <w:bookmarkStart w:id="12" w:name="Xb1d8714a4ed6d6d7ec0c5c8c1f72995bb9cb45d"/>
+    <w:bookmarkEnd w:id="12"/>
+    <w:bookmarkStart w:id="13" w:name="Xb1d8714a4ed6d6d7ec0c5c8c1f72995bb9cb45d"/>
     <w:p>
       <w:pPr>
         <w:pStyle w:val="Heading3"/>
@@ -671,7 +856,7 @@
         <w:pStyle w:val="Compact"/>
         <w:numPr>
           <w:ilvl w:val="0"/>
-          <w:numId w:val="1003"/>
+          <w:numId w:val="1004"/>
         </w:numPr>
       </w:pPr>
       <w:r>
@@ -699,7 +884,7 @@
         <w:pStyle w:val="Compact"/>
         <w:numPr>
           <w:ilvl w:val="0"/>
-          <w:numId w:val="1003"/>
+          <w:numId w:val="1004"/>
         </w:numPr>
       </w:pPr>
       <w:r>
@@ -727,7 +912,7 @@
         <w:pStyle w:val="Compact"/>
         <w:numPr>
           <w:ilvl w:val="0"/>
-          <w:numId w:val="1003"/>
+          <w:numId w:val="1004"/>
         </w:numPr>
       </w:pPr>
       <w:r>
@@ -755,7 +940,7 @@
         <w:pStyle w:val="Compact"/>
         <w:numPr>
           <w:ilvl w:val="0"/>
-          <w:numId w:val="1003"/>
+          <w:numId w:val="1004"/>
         </w:numPr>
       </w:pPr>
       <w:r>
@@ -1013,8 +1198,8 @@
         <w:t xml:space="preserve">: the protocols it needs to spread are blocked by policy, and every attempt is logged.</w:t>
       </w:r>
     </w:p>
-    <w:bookmarkEnd w:id="12"/>
-    <w:bookmarkStart w:id="14" w:name="Xf5adb5257dc22157f69a2cf0d0c3c3b107bfbd8"/>
+    <w:bookmarkEnd w:id="13"/>
+    <w:bookmarkStart w:id="15" w:name="Xf5adb5257dc22157f69a2cf0d0c3c3b107bfbd8"/>
     <w:p>
       <w:pPr>
         <w:pStyle w:val="Heading3"/>
@@ -1028,7 +1213,7 @@
         <w:pStyle w:val="Compact"/>
         <w:numPr>
           <w:ilvl w:val="0"/>
-          <w:numId w:val="1004"/>
+          <w:numId w:val="1005"/>
         </w:numPr>
       </w:pPr>
       <w:r>
@@ -1050,7 +1235,7 @@
         <w:pStyle w:val="Compact"/>
         <w:numPr>
           <w:ilvl w:val="0"/>
-          <w:numId w:val="1004"/>
+          <w:numId w:val="1005"/>
         </w:numPr>
       </w:pPr>
       <w:r>
@@ -1072,7 +1257,7 @@
         <w:pStyle w:val="Compact"/>
         <w:numPr>
           <w:ilvl w:val="0"/>
-          <w:numId w:val="1004"/>
+          <w:numId w:val="1005"/>
         </w:numPr>
       </w:pPr>
       <w:r>
@@ -1094,7 +1279,7 @@
         <w:pStyle w:val="Compact"/>
         <w:numPr>
           <w:ilvl w:val="0"/>
-          <w:numId w:val="1004"/>
+          <w:numId w:val="1005"/>
         </w:numPr>
       </w:pPr>
       <w:r>
@@ -1113,7 +1298,7 @@
       <w:r>
         <w:t xml:space="preserve"> </w:t>
       </w:r>
-      <w:hyperlink r:id="rId13">
+      <w:hyperlink r:id="rId14">
         <w:r>
           <w:rPr>
             <w:rStyle w:val="Hyperlink"/>
@@ -1145,7 +1330,7 @@
         <w:pStyle w:val="Compact"/>
         <w:numPr>
           <w:ilvl w:val="0"/>
-          <w:numId w:val="1004"/>
+          <w:numId w:val="1005"/>
         </w:numPr>
       </w:pPr>
       <w:r>
@@ -1187,9 +1372,9 @@
         </w:pict>
       </w:r>
     </w:p>
-    <w:bookmarkEnd w:id="14"/>
     <w:bookmarkEnd w:id="15"/>
-    <w:bookmarkStart w:id="16" w:name="Xc93e48c43e4ee8764e63c76fe597d43f46cd2e8"/>
+    <w:bookmarkEnd w:id="16"/>
+    <w:bookmarkStart w:id="17" w:name="Xc93e48c43e4ee8764e63c76fe597d43f46cd2e8"/>
     <w:p>
       <w:pPr>
         <w:pStyle w:val="Heading2"/>
@@ -1219,7 +1404,7 @@
         <w:pStyle w:val="Compact"/>
         <w:numPr>
           <w:ilvl w:val="0"/>
-          <w:numId w:val="1005"/>
+          <w:numId w:val="1006"/>
         </w:numPr>
       </w:pPr>
       <w:r>
@@ -1231,7 +1416,7 @@
         <w:pStyle w:val="Compact"/>
         <w:numPr>
           <w:ilvl w:val="0"/>
-          <w:numId w:val="1005"/>
+          <w:numId w:val="1006"/>
         </w:numPr>
       </w:pPr>
       <w:r>
@@ -1243,7 +1428,7 @@
         <w:pStyle w:val="Compact"/>
         <w:numPr>
           <w:ilvl w:val="0"/>
-          <w:numId w:val="1005"/>
+          <w:numId w:val="1006"/>
         </w:numPr>
       </w:pPr>
       <w:r>
@@ -1255,7 +1440,7 @@
         <w:pStyle w:val="Compact"/>
         <w:numPr>
           <w:ilvl w:val="0"/>
-          <w:numId w:val="1005"/>
+          <w:numId w:val="1006"/>
         </w:numPr>
       </w:pPr>
       <w:r>
@@ -1267,7 +1452,7 @@
         <w:pStyle w:val="Compact"/>
         <w:numPr>
           <w:ilvl w:val="0"/>
-          <w:numId w:val="1005"/>
+          <w:numId w:val="1006"/>
         </w:numPr>
       </w:pPr>
       <w:r>
@@ -1279,7 +1464,7 @@
         <w:pStyle w:val="Compact"/>
         <w:numPr>
           <w:ilvl w:val="0"/>
-          <w:numId w:val="1005"/>
+          <w:numId w:val="1006"/>
         </w:numPr>
       </w:pPr>
       <w:r>
@@ -1293,8 +1478,8 @@
         </w:pict>
       </w:r>
     </w:p>
-    <w:bookmarkEnd w:id="16"/>
-    <w:bookmarkStart w:id="17" w:name="X353429cded0140ab0d779a396742c604dc7c0fe"/>
+    <w:bookmarkEnd w:id="17"/>
+    <w:bookmarkStart w:id="18" w:name="X353429cded0140ab0d779a396742c604dc7c0fe"/>
     <w:p>
       <w:pPr>
         <w:pStyle w:val="Heading2"/>
@@ -1684,8 +1869,8 @@
         </w:pict>
       </w:r>
     </w:p>
-    <w:bookmarkEnd w:id="17"/>
-    <w:bookmarkStart w:id="19" w:name="X379b2d95ae6a85ebda4985fdd640c1c5b25f9bc"/>
+    <w:bookmarkEnd w:id="18"/>
+    <w:bookmarkStart w:id="20" w:name="X379b2d95ae6a85ebda4985fdd640c1c5b25f9bc"/>
     <w:p>
       <w:pPr>
         <w:pStyle w:val="Heading2"/>
@@ -2242,10 +2427,10 @@
         <w:t xml:space="preserve"> </w:t>
       </w:r>
       <w:r>
-        <w:t xml:space="preserve">every phase is independently valuable. A customer who stops after Phase 2 still wins — ransomware fan-out is gone and prod is isolated from non-prod. A customer who reaches Phase 5 has continuous defense in depth, not a one-off project.</w:t>
-      </w:r>
-    </w:p>
-    <w:bookmarkStart w:id="18" w:name="mapping-phases-to-videos-in-the-catalog"/>
+        <w:t xml:space="preserve">every phase is independently valuable. A customer who stops after Phase 2 still wins — ransomware fan-out is gone and prod is isolated from non-prod. A customer who reaches Phase 5 has continuous defense in depth — and should keep operating there, because applications and policy both keep changing (see § 1.1).</w:t>
+      </w:r>
+    </w:p>
+    <w:bookmarkStart w:id="19" w:name="mapping-phases-to-videos-in-the-catalog"/>
     <w:p>
       <w:pPr>
         <w:pStyle w:val="Heading3"/>
@@ -2259,7 +2444,7 @@
         <w:pStyle w:val="Compact"/>
         <w:numPr>
           <w:ilvl w:val="0"/>
-          <w:numId w:val="1006"/>
+          <w:numId w:val="1007"/>
         </w:numPr>
       </w:pPr>
       <w:r>
@@ -2281,7 +2466,7 @@
         <w:pStyle w:val="Compact"/>
         <w:numPr>
           <w:ilvl w:val="0"/>
-          <w:numId w:val="1006"/>
+          <w:numId w:val="1007"/>
         </w:numPr>
       </w:pPr>
       <w:r>
@@ -2303,7 +2488,7 @@
         <w:pStyle w:val="Compact"/>
         <w:numPr>
           <w:ilvl w:val="0"/>
-          <w:numId w:val="1006"/>
+          <w:numId w:val="1007"/>
         </w:numPr>
       </w:pPr>
       <w:r>
@@ -2325,7 +2510,7 @@
         <w:pStyle w:val="Compact"/>
         <w:numPr>
           <w:ilvl w:val="0"/>
-          <w:numId w:val="1006"/>
+          <w:numId w:val="1007"/>
         </w:numPr>
       </w:pPr>
       <w:r>
@@ -2347,7 +2532,7 @@
         <w:pStyle w:val="Compact"/>
         <w:numPr>
           <w:ilvl w:val="0"/>
-          <w:numId w:val="1006"/>
+          <w:numId w:val="1007"/>
         </w:numPr>
       </w:pPr>
       <w:r>
@@ -2371,9 +2556,9 @@
         </w:pict>
       </w:r>
     </w:p>
-    <w:bookmarkEnd w:id="18"/>
     <w:bookmarkEnd w:id="19"/>
-    <w:bookmarkStart w:id="64" w:name="X34388d678d45029f6ea868320ccc3fef24f0f73"/>
+    <w:bookmarkEnd w:id="20"/>
+    <w:bookmarkStart w:id="66" w:name="X34388d678d45029f6ea868320ccc3fef24f0f73"/>
     <w:p>
       <w:pPr>
         <w:pStyle w:val="Heading2"/>
@@ -2422,7 +2607,7 @@
         <w:t xml:space="preserve">column matches the original Cisco slide numbering (used in § 5 phase mappings).</w:t>
       </w:r>
     </w:p>
-    <w:bookmarkStart w:id="23" w:name="X79c14ae92492dca098785b61112f093e8b83cc5"/>
+    <w:bookmarkStart w:id="24" w:name="X79c14ae92492dca098785b61112f093e8b83cc5"/>
     <w:p>
       <w:pPr>
         <w:pStyle w:val="Heading3"/>
@@ -2561,71 +2746,6 @@
               <w:pStyle w:val="Compact"/>
               <w:jc w:val="center"/>
             </w:pPr>
-            <w:hyperlink r:id="rId20">
-              <w:r>
-                <w:rPr>
-                  <w:rStyle w:val="Hyperlink"/>
-                </w:rPr>
-                <w:t xml:space="preserve">Watch</w:t>
-              </w:r>
-            </w:hyperlink>
-          </w:p>
-        </w:tc>
-      </w:tr>
-      <w:tr>
-        <w:tc>
-          <w:tcPr/>
-          <w:p>
-            <w:pPr>
-              <w:pStyle w:val="Compact"/>
-              <w:jc w:val="center"/>
-            </w:pPr>
-            <w:r>
-              <w:t xml:space="preserve">2</w:t>
-            </w:r>
-          </w:p>
-        </w:tc>
-        <w:tc>
-          <w:tcPr/>
-          <w:p>
-            <w:pPr>
-              <w:pStyle w:val="Compact"/>
-              <w:jc w:val="right"/>
-            </w:pPr>
-            <w:r>
-              <w:t xml:space="preserve">4</w:t>
-            </w:r>
-          </w:p>
-        </w:tc>
-        <w:tc>
-          <w:tcPr/>
-          <w:p>
-            <w:pPr>
-              <w:pStyle w:val="Compact"/>
-            </w:pPr>
-            <w:r>
-              <w:t xml:space="preserve">Labels</w:t>
-            </w:r>
-          </w:p>
-        </w:tc>
-        <w:tc>
-          <w:tcPr/>
-          <w:p>
-            <w:pPr>
-              <w:pStyle w:val="Compact"/>
-            </w:pPr>
-            <w:r>
-              <w:t xml:space="preserve">Tag workloads for policy and visibility.</w:t>
-            </w:r>
-          </w:p>
-        </w:tc>
-        <w:tc>
-          <w:tcPr/>
-          <w:p>
-            <w:pPr>
-              <w:pStyle w:val="Compact"/>
-              <w:jc w:val="center"/>
-            </w:pPr>
             <w:hyperlink r:id="rId21">
               <w:r>
                 <w:rPr>
@@ -2646,7 +2766,7 @@
               <w:jc w:val="center"/>
             </w:pPr>
             <w:r>
-              <w:t xml:space="preserve">3</w:t>
+              <w:t xml:space="preserve">2</w:t>
             </w:r>
           </w:p>
         </w:tc>
@@ -2658,29 +2778,29 @@
               <w:jc w:val="right"/>
             </w:pPr>
             <w:r>
-              <w:t xml:space="preserve">5</w:t>
-            </w:r>
-          </w:p>
-        </w:tc>
-        <w:tc>
-          <w:tcPr/>
-          <w:p>
-            <w:pPr>
-              <w:pStyle w:val="Compact"/>
-            </w:pPr>
-            <w:r>
-              <w:t xml:space="preserve">Inventory Filters</w:t>
-            </w:r>
-          </w:p>
-        </w:tc>
-        <w:tc>
-          <w:tcPr/>
-          <w:p>
-            <w:pPr>
-              <w:pStyle w:val="Compact"/>
-            </w:pPr>
-            <w:r>
-              <w:t xml:space="preserve">Focus inventory on specific workload groups.</w:t>
+              <w:t xml:space="preserve">4</w:t>
+            </w:r>
+          </w:p>
+        </w:tc>
+        <w:tc>
+          <w:tcPr/>
+          <w:p>
+            <w:pPr>
+              <w:pStyle w:val="Compact"/>
+            </w:pPr>
+            <w:r>
+              <w:t xml:space="preserve">Labels</w:t>
+            </w:r>
+          </w:p>
+        </w:tc>
+        <w:tc>
+          <w:tcPr/>
+          <w:p>
+            <w:pPr>
+              <w:pStyle w:val="Compact"/>
+            </w:pPr>
+            <w:r>
+              <w:t xml:space="preserve">Tag workloads for policy and visibility.</w:t>
             </w:r>
           </w:p>
         </w:tc>
@@ -2702,9 +2822,74 @@
           </w:p>
         </w:tc>
       </w:tr>
+      <w:tr>
+        <w:tc>
+          <w:tcPr/>
+          <w:p>
+            <w:pPr>
+              <w:pStyle w:val="Compact"/>
+              <w:jc w:val="center"/>
+            </w:pPr>
+            <w:r>
+              <w:t xml:space="preserve">3</w:t>
+            </w:r>
+          </w:p>
+        </w:tc>
+        <w:tc>
+          <w:tcPr/>
+          <w:p>
+            <w:pPr>
+              <w:pStyle w:val="Compact"/>
+              <w:jc w:val="right"/>
+            </w:pPr>
+            <w:r>
+              <w:t xml:space="preserve">5</w:t>
+            </w:r>
+          </w:p>
+        </w:tc>
+        <w:tc>
+          <w:tcPr/>
+          <w:p>
+            <w:pPr>
+              <w:pStyle w:val="Compact"/>
+            </w:pPr>
+            <w:r>
+              <w:t xml:space="preserve">Inventory Filters</w:t>
+            </w:r>
+          </w:p>
+        </w:tc>
+        <w:tc>
+          <w:tcPr/>
+          <w:p>
+            <w:pPr>
+              <w:pStyle w:val="Compact"/>
+            </w:pPr>
+            <w:r>
+              <w:t xml:space="preserve">Focus inventory on specific workload groups.</w:t>
+            </w:r>
+          </w:p>
+        </w:tc>
+        <w:tc>
+          <w:tcPr/>
+          <w:p>
+            <w:pPr>
+              <w:pStyle w:val="Compact"/>
+              <w:jc w:val="center"/>
+            </w:pPr>
+            <w:hyperlink r:id="rId23">
+              <w:r>
+                <w:rPr>
+                  <w:rStyle w:val="Hyperlink"/>
+                </w:rPr>
+                <w:t xml:space="preserve">Watch</w:t>
+              </w:r>
+            </w:hyperlink>
+          </w:p>
+        </w:tc>
+      </w:tr>
     </w:tbl>
-    <w:bookmarkEnd w:id="23"/>
-    <w:bookmarkStart w:id="26" w:name="X27b0b3246bd0221bf109cd41cf29e8955f4a5a1"/>
+    <w:bookmarkEnd w:id="24"/>
+    <w:bookmarkStart w:id="28" w:name="X27b0b3246bd0221bf109cd41cf29e8955f4a5a1"/>
     <w:p>
       <w:pPr>
         <w:pStyle w:val="Heading3"/>
@@ -2843,81 +3028,6 @@
               <w:pStyle w:val="Compact"/>
               <w:jc w:val="center"/>
             </w:pPr>
-            <w:hyperlink r:id="rId24">
-              <w:r>
-                <w:rPr>
-                  <w:rStyle w:val="Hyperlink"/>
-                </w:rPr>
-                <w:t xml:space="preserve">Watch</w:t>
-              </w:r>
-            </w:hyperlink>
-          </w:p>
-        </w:tc>
-      </w:tr>
-      <w:tr>
-        <w:tc>
-          <w:tcPr/>
-          <w:p>
-            <w:pPr>
-              <w:pStyle w:val="Compact"/>
-              <w:jc w:val="center"/>
-            </w:pPr>
-            <w:r>
-              <w:t xml:space="preserve">5</w:t>
-            </w:r>
-          </w:p>
-        </w:tc>
-        <w:tc>
-          <w:tcPr/>
-          <w:p>
-            <w:pPr>
-              <w:pStyle w:val="Compact"/>
-              <w:jc w:val="right"/>
-            </w:pPr>
-            <w:r>
-              <w:t xml:space="preserve">2</w:t>
-            </w:r>
-          </w:p>
-        </w:tc>
-        <w:tc>
-          <w:tcPr/>
-          <w:p>
-            <w:pPr>
-              <w:pStyle w:val="Compact"/>
-            </w:pPr>
-            <w:r>
-              <w:t xml:space="preserve">Golden Image VDI</w:t>
-            </w:r>
-          </w:p>
-        </w:tc>
-        <w:tc>
-          <w:tcPr/>
-          <w:p>
-            <w:pPr>
-              <w:pStyle w:val="Compact"/>
-            </w:pPr>
-            <w:r>
-              <w:t xml:space="preserve">VDI golden-image agent deployment.</w:t>
-            </w:r>
-            <w:r>
-              <w:t xml:space="preserve"> </w:t>
-            </w:r>
-            <w:r>
-              <w:rPr>
-                <w:i/>
-                <w:iCs/>
-              </w:rPr>
-              <w:t xml:space="preserve">Optional.</w:t>
-            </w:r>
-          </w:p>
-        </w:tc>
-        <w:tc>
-          <w:tcPr/>
-          <w:p>
-            <w:pPr>
-              <w:pStyle w:val="Compact"/>
-              <w:jc w:val="center"/>
-            </w:pPr>
             <w:hyperlink r:id="rId25">
               <w:r>
                 <w:rPr>
@@ -2929,9 +3039,113 @@
           </w:p>
         </w:tc>
       </w:tr>
+      <w:tr>
+        <w:tc>
+          <w:tcPr/>
+          <w:p>
+            <w:pPr>
+              <w:pStyle w:val="Compact"/>
+              <w:jc w:val="center"/>
+            </w:pPr>
+            <w:r>
+              <w:t xml:space="preserve">5</w:t>
+            </w:r>
+          </w:p>
+        </w:tc>
+        <w:tc>
+          <w:tcPr/>
+          <w:p>
+            <w:pPr>
+              <w:pStyle w:val="Compact"/>
+              <w:jc w:val="right"/>
+            </w:pPr>
+            <w:r>
+              <w:t xml:space="preserve">2</w:t>
+            </w:r>
+          </w:p>
+        </w:tc>
+        <w:tc>
+          <w:tcPr/>
+          <w:p>
+            <w:pPr>
+              <w:pStyle w:val="Compact"/>
+            </w:pPr>
+            <w:r>
+              <w:t xml:space="preserve">Golden Image VDI</w:t>
+            </w:r>
+          </w:p>
+        </w:tc>
+        <w:tc>
+          <w:tcPr/>
+          <w:p>
+            <w:pPr>
+              <w:pStyle w:val="Compact"/>
+            </w:pPr>
+            <w:r>
+              <w:t xml:space="preserve">VDI golden-image agent deployment.</w:t>
+            </w:r>
+            <w:r>
+              <w:t xml:space="preserve"> </w:t>
+            </w:r>
+            <w:r>
+              <w:rPr>
+                <w:i/>
+                <w:iCs/>
+              </w:rPr>
+              <w:t xml:space="preserve">Optional.</w:t>
+            </w:r>
+          </w:p>
+        </w:tc>
+        <w:tc>
+          <w:tcPr/>
+          <w:p>
+            <w:pPr>
+              <w:pStyle w:val="Compact"/>
+              <w:jc w:val="center"/>
+            </w:pPr>
+            <w:hyperlink r:id="rId26">
+              <w:r>
+                <w:rPr>
+                  <w:rStyle w:val="Hyperlink"/>
+                </w:rPr>
+                <w:t xml:space="preserve">Watch</w:t>
+              </w:r>
+            </w:hyperlink>
+          </w:p>
+        </w:tc>
+      </w:tr>
     </w:tbl>
-    <w:bookmarkEnd w:id="26"/>
-    <w:bookmarkStart w:id="32" w:name="Xf8e5d935e4719b8ec583b58485ced48d95037fb"/>
+    <w:p>
+      <w:pPr>
+        <w:pStyle w:val="BodyText"/>
+      </w:pPr>
+      <w:r>
+        <w:rPr>
+          <w:b/>
+          <w:bCs/>
+        </w:rPr>
+        <w:t xml:space="preserve">Reference — Windows policy enforcement (WFP):</w:t>
+      </w:r>
+      <w:r>
+        <w:t xml:space="preserve"> </w:t>
+      </w:r>
+      <w:hyperlink r:id="rId27">
+        <w:r>
+          <w:rPr>
+            <w:rStyle w:val="VerbatimChar"/>
+          </w:rPr>
+          <w:t xml:space="preserve">WFP-Design.docx</w:t>
+        </w:r>
+      </w:hyperlink>
+      <w:r>
+        <w:t xml:space="preserve"> </w:t>
+      </w:r>
+      <w:r>
+        <w:t xml:space="preserve">— Windows Filtering Platform design; how the CSW agent enforces host policy on Windows workloads.</w:t>
+      </w:r>
+    </w:p>
+    <w:bookmarkEnd w:id="28"/>
+    <w:bookmarkStart w:id="34" w:name="Xf8e5d935e4719b8ec583b58485ced48d95037fb"/>
     <w:p>
       <w:pPr>
         <w:pStyle w:val="Heading3"/>
@@ -3070,136 +3284,6 @@
               <w:pStyle w:val="Compact"/>
               <w:jc w:val="center"/>
             </w:pPr>
-            <w:hyperlink r:id="rId27">
-              <w:r>
-                <w:rPr>
-                  <w:rStyle w:val="Hyperlink"/>
-                </w:rPr>
-                <w:t xml:space="preserve">Watch</w:t>
-              </w:r>
-            </w:hyperlink>
-          </w:p>
-        </w:tc>
-      </w:tr>
-      <w:tr>
-        <w:tc>
-          <w:tcPr/>
-          <w:p>
-            <w:pPr>
-              <w:pStyle w:val="Compact"/>
-              <w:jc w:val="center"/>
-            </w:pPr>
-            <w:r>
-              <w:t xml:space="preserve">7</w:t>
-            </w:r>
-          </w:p>
-        </w:tc>
-        <w:tc>
-          <w:tcPr/>
-          <w:p>
-            <w:pPr>
-              <w:pStyle w:val="Compact"/>
-              <w:jc w:val="right"/>
-            </w:pPr>
-            <w:r>
-              <w:t xml:space="preserve">10</w:t>
-            </w:r>
-          </w:p>
-        </w:tc>
-        <w:tc>
-          <w:tcPr/>
-          <w:p>
-            <w:pPr>
-              <w:pStyle w:val="Compact"/>
-            </w:pPr>
-            <w:r>
-              <w:t xml:space="preserve">Flow Analysis</w:t>
-            </w:r>
-          </w:p>
-        </w:tc>
-        <w:tc>
-          <w:tcPr/>
-          <w:p>
-            <w:pPr>
-              <w:pStyle w:val="Compact"/>
-            </w:pPr>
-            <w:r>
-              <w:t xml:space="preserve">Traffic patterns and anomalies.</w:t>
-            </w:r>
-          </w:p>
-        </w:tc>
-        <w:tc>
-          <w:tcPr/>
-          <w:p>
-            <w:pPr>
-              <w:pStyle w:val="Compact"/>
-              <w:jc w:val="center"/>
-            </w:pPr>
-            <w:hyperlink r:id="rId28">
-              <w:r>
-                <w:rPr>
-                  <w:rStyle w:val="Hyperlink"/>
-                </w:rPr>
-                <w:t xml:space="preserve">Watch</w:t>
-              </w:r>
-            </w:hyperlink>
-          </w:p>
-        </w:tc>
-      </w:tr>
-      <w:tr>
-        <w:tc>
-          <w:tcPr/>
-          <w:p>
-            <w:pPr>
-              <w:pStyle w:val="Compact"/>
-              <w:jc w:val="center"/>
-            </w:pPr>
-            <w:r>
-              <w:t xml:space="preserve">8</w:t>
-            </w:r>
-          </w:p>
-        </w:tc>
-        <w:tc>
-          <w:tcPr/>
-          <w:p>
-            <w:pPr>
-              <w:pStyle w:val="Compact"/>
-              <w:jc w:val="right"/>
-            </w:pPr>
-            <w:r>
-              <w:t xml:space="preserve">7</w:t>
-            </w:r>
-          </w:p>
-        </w:tc>
-        <w:tc>
-          <w:tcPr/>
-          <w:p>
-            <w:pPr>
-              <w:pStyle w:val="Compact"/>
-            </w:pPr>
-            <w:r>
-              <w:t xml:space="preserve">Application Dependency Mapping &amp; Policy Analysis</w:t>
-            </w:r>
-          </w:p>
-        </w:tc>
-        <w:tc>
-          <w:tcPr/>
-          <w:p>
-            <w:pPr>
-              <w:pStyle w:val="Compact"/>
-            </w:pPr>
-            <w:r>
-              <w:t xml:space="preserve">ADM and policy derivation.</w:t>
-            </w:r>
-          </w:p>
-        </w:tc>
-        <w:tc>
-          <w:tcPr/>
-          <w:p>
-            <w:pPr>
-              <w:pStyle w:val="Compact"/>
-              <w:jc w:val="center"/>
-            </w:pPr>
             <w:hyperlink r:id="rId29">
               <w:r>
                 <w:rPr>
@@ -3220,7 +3304,7 @@
               <w:jc w:val="center"/>
             </w:pPr>
             <w:r>
-              <w:t xml:space="preserve">9</w:t>
+              <w:t xml:space="preserve">7</w:t>
             </w:r>
           </w:p>
         </w:tc>
@@ -3232,29 +3316,29 @@
               <w:jc w:val="right"/>
             </w:pPr>
             <w:r>
-              <w:t xml:space="preserve">9</w:t>
-            </w:r>
-          </w:p>
-        </w:tc>
-        <w:tc>
-          <w:tcPr/>
-          <w:p>
-            <w:pPr>
-              <w:pStyle w:val="Compact"/>
-            </w:pPr>
-            <w:r>
-              <w:t xml:space="preserve">Dynamic Workloads &amp; Policy</w:t>
-            </w:r>
-          </w:p>
-        </w:tc>
-        <w:tc>
-          <w:tcPr/>
-          <w:p>
-            <w:pPr>
-              <w:pStyle w:val="Compact"/>
-            </w:pPr>
-            <w:r>
-              <w:t xml:space="preserve">Policy for moving/scaling workloads.</w:t>
+              <w:t xml:space="preserve">10</w:t>
+            </w:r>
+          </w:p>
+        </w:tc>
+        <w:tc>
+          <w:tcPr/>
+          <w:p>
+            <w:pPr>
+              <w:pStyle w:val="Compact"/>
+            </w:pPr>
+            <w:r>
+              <w:t xml:space="preserve">Flow Analysis</w:t>
+            </w:r>
+          </w:p>
+        </w:tc>
+        <w:tc>
+          <w:tcPr/>
+          <w:p>
+            <w:pPr>
+              <w:pStyle w:val="Compact"/>
+            </w:pPr>
+            <w:r>
+              <w:t xml:space="preserve">Traffic patterns and anomalies.</w:t>
             </w:r>
           </w:p>
         </w:tc>
@@ -3285,7 +3369,7 @@
               <w:jc w:val="center"/>
             </w:pPr>
             <w:r>
-              <w:t xml:space="preserve">10</w:t>
+              <w:t xml:space="preserve">8</w:t>
             </w:r>
           </w:p>
         </w:tc>
@@ -3297,29 +3381,29 @@
               <w:jc w:val="right"/>
             </w:pPr>
             <w:r>
-              <w:t xml:space="preserve">8</w:t>
-            </w:r>
-          </w:p>
-        </w:tc>
-        <w:tc>
-          <w:tcPr/>
-          <w:p>
-            <w:pPr>
-              <w:pStyle w:val="Compact"/>
-            </w:pPr>
-            <w:r>
-              <w:t xml:space="preserve">Policy Visual and Quick Analysis</w:t>
-            </w:r>
-          </w:p>
-        </w:tc>
-        <w:tc>
-          <w:tcPr/>
-          <w:p>
-            <w:pPr>
-              <w:pStyle w:val="Compact"/>
-            </w:pPr>
-            <w:r>
-              <w:t xml:space="preserve">Visualize policy impact.</w:t>
+              <w:t xml:space="preserve">7</w:t>
+            </w:r>
+          </w:p>
+        </w:tc>
+        <w:tc>
+          <w:tcPr/>
+          <w:p>
+            <w:pPr>
+              <w:pStyle w:val="Compact"/>
+            </w:pPr>
+            <w:r>
+              <w:t xml:space="preserve">Application Dependency Mapping &amp; Policy Analysis</w:t>
+            </w:r>
+          </w:p>
+        </w:tc>
+        <w:tc>
+          <w:tcPr/>
+          <w:p>
+            <w:pPr>
+              <w:pStyle w:val="Compact"/>
+            </w:pPr>
+            <w:r>
+              <w:t xml:space="preserve">ADM and policy derivation.</w:t>
             </w:r>
           </w:p>
         </w:tc>
@@ -3341,9 +3425,139 @@
           </w:p>
         </w:tc>
       </w:tr>
+      <w:tr>
+        <w:tc>
+          <w:tcPr/>
+          <w:p>
+            <w:pPr>
+              <w:pStyle w:val="Compact"/>
+              <w:jc w:val="center"/>
+            </w:pPr>
+            <w:r>
+              <w:t xml:space="preserve">9</w:t>
+            </w:r>
+          </w:p>
+        </w:tc>
+        <w:tc>
+          <w:tcPr/>
+          <w:p>
+            <w:pPr>
+              <w:pStyle w:val="Compact"/>
+              <w:jc w:val="right"/>
+            </w:pPr>
+            <w:r>
+              <w:t xml:space="preserve">9</w:t>
+            </w:r>
+          </w:p>
+        </w:tc>
+        <w:tc>
+          <w:tcPr/>
+          <w:p>
+            <w:pPr>
+              <w:pStyle w:val="Compact"/>
+            </w:pPr>
+            <w:r>
+              <w:t xml:space="preserve">Dynamic Workloads &amp; Policy</w:t>
+            </w:r>
+          </w:p>
+        </w:tc>
+        <w:tc>
+          <w:tcPr/>
+          <w:p>
+            <w:pPr>
+              <w:pStyle w:val="Compact"/>
+            </w:pPr>
+            <w:r>
+              <w:t xml:space="preserve">Policy for moving/scaling workloads.</w:t>
+            </w:r>
+          </w:p>
+        </w:tc>
+        <w:tc>
+          <w:tcPr/>
+          <w:p>
+            <w:pPr>
+              <w:pStyle w:val="Compact"/>
+              <w:jc w:val="center"/>
+            </w:pPr>
+            <w:hyperlink r:id="rId32">
+              <w:r>
+                <w:rPr>
+                  <w:rStyle w:val="Hyperlink"/>
+                </w:rPr>
+                <w:t xml:space="preserve">Watch</w:t>
+              </w:r>
+            </w:hyperlink>
+          </w:p>
+        </w:tc>
+      </w:tr>
+      <w:tr>
+        <w:tc>
+          <w:tcPr/>
+          <w:p>
+            <w:pPr>
+              <w:pStyle w:val="Compact"/>
+              <w:jc w:val="center"/>
+            </w:pPr>
+            <w:r>
+              <w:t xml:space="preserve">10</w:t>
+            </w:r>
+          </w:p>
+        </w:tc>
+        <w:tc>
+          <w:tcPr/>
+          <w:p>
+            <w:pPr>
+              <w:pStyle w:val="Compact"/>
+              <w:jc w:val="right"/>
+            </w:pPr>
+            <w:r>
+              <w:t xml:space="preserve">8</w:t>
+            </w:r>
+          </w:p>
+        </w:tc>
+        <w:tc>
+          <w:tcPr/>
+          <w:p>
+            <w:pPr>
+              <w:pStyle w:val="Compact"/>
+            </w:pPr>
+            <w:r>
+              <w:t xml:space="preserve">Policy Visual and Quick Analysis</w:t>
+            </w:r>
+          </w:p>
+        </w:tc>
+        <w:tc>
+          <w:tcPr/>
+          <w:p>
+            <w:pPr>
+              <w:pStyle w:val="Compact"/>
+            </w:pPr>
+            <w:r>
+              <w:t xml:space="preserve">Visualize policy impact.</w:t>
+            </w:r>
+          </w:p>
+        </w:tc>
+        <w:tc>
+          <w:tcPr/>
+          <w:p>
+            <w:pPr>
+              <w:pStyle w:val="Compact"/>
+              <w:jc w:val="center"/>
+            </w:pPr>
+            <w:hyperlink r:id="rId33">
+              <w:r>
+                <w:rPr>
+                  <w:rStyle w:val="Hyperlink"/>
+                </w:rPr>
+                <w:t xml:space="preserve">Watch</w:t>
+              </w:r>
+            </w:hyperlink>
+          </w:p>
+        </w:tc>
+      </w:tr>
     </w:tbl>
-    <w:bookmarkEnd w:id="32"/>
-    <w:bookmarkStart w:id="35" w:name="Xe08cf81caea7d0f53bf073b145c66d190f05ea7"/>
+    <w:bookmarkEnd w:id="34"/>
+    <w:bookmarkStart w:id="37" w:name="Xe08cf81caea7d0f53bf073b145c66d190f05ea7"/>
     <w:p>
       <w:pPr>
         <w:pStyle w:val="Heading3"/>
@@ -3482,7 +3696,7 @@
               <w:pStyle w:val="Compact"/>
               <w:jc w:val="center"/>
             </w:pPr>
-            <w:hyperlink r:id="rId33">
+            <w:hyperlink r:id="rId35">
               <w:r>
                 <w:rPr>
                   <w:rStyle w:val="Hyperlink"/>
@@ -3547,7 +3761,7 @@
               <w:pStyle w:val="Compact"/>
               <w:jc w:val="center"/>
             </w:pPr>
-            <w:hyperlink r:id="rId34">
+            <w:hyperlink r:id="rId36">
               <w:r>
                 <w:rPr>
                   <w:rStyle w:val="Hyperlink"/>
@@ -3559,8 +3773,8 @@
         </w:tc>
       </w:tr>
     </w:tbl>
-    <w:bookmarkEnd w:id="35"/>
-    <w:bookmarkStart w:id="41" w:name="X8a788de5795d40d873f8a098801eb93b3a8b2cf"/>
+    <w:bookmarkEnd w:id="37"/>
+    <w:bookmarkStart w:id="43" w:name="X8a788de5795d40d873f8a098801eb93b3a8b2cf"/>
     <w:p>
       <w:pPr>
         <w:pStyle w:val="Heading3"/>
@@ -3699,136 +3913,6 @@
               <w:pStyle w:val="Compact"/>
               <w:jc w:val="center"/>
             </w:pPr>
-            <w:hyperlink r:id="rId36">
-              <w:r>
-                <w:rPr>
-                  <w:rStyle w:val="Hyperlink"/>
-                </w:rPr>
-                <w:t xml:space="preserve">Watch</w:t>
-              </w:r>
-            </w:hyperlink>
-          </w:p>
-        </w:tc>
-      </w:tr>
-      <w:tr>
-        <w:tc>
-          <w:tcPr/>
-          <w:p>
-            <w:pPr>
-              <w:pStyle w:val="Compact"/>
-              <w:jc w:val="center"/>
-            </w:pPr>
-            <w:r>
-              <w:t xml:space="preserve">14</w:t>
-            </w:r>
-          </w:p>
-        </w:tc>
-        <w:tc>
-          <w:tcPr/>
-          <w:p>
-            <w:pPr>
-              <w:pStyle w:val="Compact"/>
-              <w:jc w:val="right"/>
-            </w:pPr>
-            <w:r>
-              <w:t xml:space="preserve">11</w:t>
-            </w:r>
-          </w:p>
-        </w:tc>
-        <w:tc>
-          <w:tcPr/>
-          <w:p>
-            <w:pPr>
-              <w:pStyle w:val="Compact"/>
-            </w:pPr>
-            <w:r>
-              <w:t xml:space="preserve">Vulnerabilities and Risk Reduction</w:t>
-            </w:r>
-          </w:p>
-        </w:tc>
-        <w:tc>
-          <w:tcPr/>
-          <w:p>
-            <w:pPr>
-              <w:pStyle w:val="Compact"/>
-            </w:pPr>
-            <w:r>
-              <w:t xml:space="preserve">Vulnerable workload prioritization.</w:t>
-            </w:r>
-          </w:p>
-        </w:tc>
-        <w:tc>
-          <w:tcPr/>
-          <w:p>
-            <w:pPr>
-              <w:pStyle w:val="Compact"/>
-              <w:jc w:val="center"/>
-            </w:pPr>
-            <w:hyperlink r:id="rId37">
-              <w:r>
-                <w:rPr>
-                  <w:rStyle w:val="Hyperlink"/>
-                </w:rPr>
-                <w:t xml:space="preserve">Watch</w:t>
-              </w:r>
-            </w:hyperlink>
-          </w:p>
-        </w:tc>
-      </w:tr>
-      <w:tr>
-        <w:tc>
-          <w:tcPr/>
-          <w:p>
-            <w:pPr>
-              <w:pStyle w:val="Compact"/>
-              <w:jc w:val="center"/>
-            </w:pPr>
-            <w:r>
-              <w:t xml:space="preserve">15</w:t>
-            </w:r>
-          </w:p>
-        </w:tc>
-        <w:tc>
-          <w:tcPr/>
-          <w:p>
-            <w:pPr>
-              <w:pStyle w:val="Compact"/>
-              <w:jc w:val="right"/>
-            </w:pPr>
-            <w:r>
-              <w:t xml:space="preserve">15</w:t>
-            </w:r>
-          </w:p>
-        </w:tc>
-        <w:tc>
-          <w:tcPr/>
-          <w:p>
-            <w:pPr>
-              <w:pStyle w:val="Compact"/>
-            </w:pPr>
-            <w:r>
-              <w:t xml:space="preserve">SSH Risk Reduction</w:t>
-            </w:r>
-          </w:p>
-        </w:tc>
-        <w:tc>
-          <w:tcPr/>
-          <w:p>
-            <w:pPr>
-              <w:pStyle w:val="Compact"/>
-            </w:pPr>
-            <w:r>
-              <w:t xml:space="preserve">Control SSH between workloads.</w:t>
-            </w:r>
-          </w:p>
-        </w:tc>
-        <w:tc>
-          <w:tcPr/>
-          <w:p>
-            <w:pPr>
-              <w:pStyle w:val="Compact"/>
-              <w:jc w:val="center"/>
-            </w:pPr>
             <w:hyperlink r:id="rId38">
               <w:r>
                 <w:rPr>
@@ -3849,7 +3933,7 @@
               <w:jc w:val="center"/>
             </w:pPr>
             <w:r>
-              <w:t xml:space="preserve">16</w:t>
+              <w:t xml:space="preserve">14</w:t>
             </w:r>
           </w:p>
         </w:tc>
@@ -3861,29 +3945,29 @@
               <w:jc w:val="right"/>
             </w:pPr>
             <w:r>
-              <w:t xml:space="preserve">14</w:t>
-            </w:r>
-          </w:p>
-        </w:tc>
-        <w:tc>
-          <w:tcPr/>
-          <w:p>
-            <w:pPr>
-              <w:pStyle w:val="Compact"/>
-            </w:pPr>
-            <w:r>
-              <w:t xml:space="preserve">Log4J Risk Reduction</w:t>
-            </w:r>
-          </w:p>
-        </w:tc>
-        <w:tc>
-          <w:tcPr/>
-          <w:p>
-            <w:pPr>
-              <w:pStyle w:val="Compact"/>
-            </w:pPr>
-            <w:r>
-              <w:t xml:space="preserve">Log4Shell exposure containment.</w:t>
+              <w:t xml:space="preserve">11</w:t>
+            </w:r>
+          </w:p>
+        </w:tc>
+        <w:tc>
+          <w:tcPr/>
+          <w:p>
+            <w:pPr>
+              <w:pStyle w:val="Compact"/>
+            </w:pPr>
+            <w:r>
+              <w:t xml:space="preserve">Vulnerabilities and Risk Reduction</w:t>
+            </w:r>
+          </w:p>
+        </w:tc>
+        <w:tc>
+          <w:tcPr/>
+          <w:p>
+            <w:pPr>
+              <w:pStyle w:val="Compact"/>
+            </w:pPr>
+            <w:r>
+              <w:t xml:space="preserve">Vulnerable workload prioritization.</w:t>
             </w:r>
           </w:p>
         </w:tc>
@@ -3914,7 +3998,7 @@
               <w:jc w:val="center"/>
             </w:pPr>
             <w:r>
-              <w:t xml:space="preserve">17</w:t>
+              <w:t xml:space="preserve">15</w:t>
             </w:r>
           </w:p>
         </w:tc>
@@ -3926,29 +4010,29 @@
               <w:jc w:val="right"/>
             </w:pPr>
             <w:r>
-              <w:t xml:space="preserve">13</w:t>
-            </w:r>
-          </w:p>
-        </w:tc>
-        <w:tc>
-          <w:tcPr/>
-          <w:p>
-            <w:pPr>
-              <w:pStyle w:val="Compact"/>
-            </w:pPr>
-            <w:r>
-              <w:t xml:space="preserve">Forensics</w:t>
-            </w:r>
-          </w:p>
-        </w:tc>
-        <w:tc>
-          <w:tcPr/>
-          <w:p>
-            <w:pPr>
-              <w:pStyle w:val="Compact"/>
-            </w:pPr>
-            <w:r>
-              <w:t xml:space="preserve">Investigation evidence.</w:t>
+              <w:t xml:space="preserve">15</w:t>
+            </w:r>
+          </w:p>
+        </w:tc>
+        <w:tc>
+          <w:tcPr/>
+          <w:p>
+            <w:pPr>
+              <w:pStyle w:val="Compact"/>
+            </w:pPr>
+            <w:r>
+              <w:t xml:space="preserve">SSH Risk Reduction</w:t>
+            </w:r>
+          </w:p>
+        </w:tc>
+        <w:tc>
+          <w:tcPr/>
+          <w:p>
+            <w:pPr>
+              <w:pStyle w:val="Compact"/>
+            </w:pPr>
+            <w:r>
+              <w:t xml:space="preserve">Control SSH between workloads.</w:t>
             </w:r>
           </w:p>
         </w:tc>
@@ -3970,9 +4054,139 @@
           </w:p>
         </w:tc>
       </w:tr>
+      <w:tr>
+        <w:tc>
+          <w:tcPr/>
+          <w:p>
+            <w:pPr>
+              <w:pStyle w:val="Compact"/>
+              <w:jc w:val="center"/>
+            </w:pPr>
+            <w:r>
+              <w:t xml:space="preserve">16</w:t>
+            </w:r>
+          </w:p>
+        </w:tc>
+        <w:tc>
+          <w:tcPr/>
+          <w:p>
+            <w:pPr>
+              <w:pStyle w:val="Compact"/>
+              <w:jc w:val="right"/>
+            </w:pPr>
+            <w:r>
+              <w:t xml:space="preserve">14</w:t>
+            </w:r>
+          </w:p>
+        </w:tc>
+        <w:tc>
+          <w:tcPr/>
+          <w:p>
+            <w:pPr>
+              <w:pStyle w:val="Compact"/>
+            </w:pPr>
+            <w:r>
+              <w:t xml:space="preserve">Log4J Risk Reduction</w:t>
+            </w:r>
+          </w:p>
+        </w:tc>
+        <w:tc>
+          <w:tcPr/>
+          <w:p>
+            <w:pPr>
+              <w:pStyle w:val="Compact"/>
+            </w:pPr>
+            <w:r>
+              <w:t xml:space="preserve">Log4Shell exposure containment.</w:t>
+            </w:r>
+          </w:p>
+        </w:tc>
+        <w:tc>
+          <w:tcPr/>
+          <w:p>
+            <w:pPr>
+              <w:pStyle w:val="Compact"/>
+              <w:jc w:val="center"/>
+            </w:pPr>
+            <w:hyperlink r:id="rId41">
+              <w:r>
+                <w:rPr>
+                  <w:rStyle w:val="Hyperlink"/>
+                </w:rPr>
+                <w:t xml:space="preserve">Watch</w:t>
+              </w:r>
+            </w:hyperlink>
+          </w:p>
+        </w:tc>
+      </w:tr>
+      <w:tr>
+        <w:tc>
+          <w:tcPr/>
+          <w:p>
+            <w:pPr>
+              <w:pStyle w:val="Compact"/>
+              <w:jc w:val="center"/>
+            </w:pPr>
+            <w:r>
+              <w:t xml:space="preserve">17</w:t>
+            </w:r>
+          </w:p>
+        </w:tc>
+        <w:tc>
+          <w:tcPr/>
+          <w:p>
+            <w:pPr>
+              <w:pStyle w:val="Compact"/>
+              <w:jc w:val="right"/>
+            </w:pPr>
+            <w:r>
+              <w:t xml:space="preserve">13</w:t>
+            </w:r>
+          </w:p>
+        </w:tc>
+        <w:tc>
+          <w:tcPr/>
+          <w:p>
+            <w:pPr>
+              <w:pStyle w:val="Compact"/>
+            </w:pPr>
+            <w:r>
+              <w:t xml:space="preserve">Forensics</w:t>
+            </w:r>
+          </w:p>
+        </w:tc>
+        <w:tc>
+          <w:tcPr/>
+          <w:p>
+            <w:pPr>
+              <w:pStyle w:val="Compact"/>
+            </w:pPr>
+            <w:r>
+              <w:t xml:space="preserve">Investigation evidence.</w:t>
+            </w:r>
+          </w:p>
+        </w:tc>
+        <w:tc>
+          <w:tcPr/>
+          <w:p>
+            <w:pPr>
+              <w:pStyle w:val="Compact"/>
+              <w:jc w:val="center"/>
+            </w:pPr>
+            <w:hyperlink r:id="rId42">
+              <w:r>
+                <w:rPr>
+                  <w:rStyle w:val="Hyperlink"/>
+                </w:rPr>
+                <w:t xml:space="preserve">Watch</w:t>
+              </w:r>
+            </w:hyperlink>
+          </w:p>
+        </w:tc>
+      </w:tr>
     </w:tbl>
-    <w:bookmarkEnd w:id="41"/>
-    <w:bookmarkStart w:id="44" w:name="X8938ec5b7415f921bc4d87f7ee35b1149073c6a"/>
+    <w:bookmarkEnd w:id="43"/>
+    <w:bookmarkStart w:id="46" w:name="X8938ec5b7415f921bc4d87f7ee35b1149073c6a"/>
     <w:p>
       <w:pPr>
         <w:pStyle w:val="Heading3"/>
@@ -4111,7 +4325,7 @@
               <w:pStyle w:val="Compact"/>
               <w:jc w:val="center"/>
             </w:pPr>
-            <w:hyperlink r:id="rId42">
+            <w:hyperlink r:id="rId44">
               <w:r>
                 <w:rPr>
                   <w:rStyle w:val="Hyperlink"/>
@@ -4176,7 +4390,7 @@
               <w:pStyle w:val="Compact"/>
               <w:jc w:val="center"/>
             </w:pPr>
-            <w:hyperlink r:id="rId43">
+            <w:hyperlink r:id="rId45">
               <w:r>
                 <w:rPr>
                   <w:rStyle w:val="Hyperlink"/>
@@ -4188,8 +4402,8 @@
         </w:tc>
       </w:tr>
     </w:tbl>
-    <w:bookmarkEnd w:id="44"/>
-    <w:bookmarkStart w:id="61" w:name="Xe21ac8eabdd6109406629bd8972d04c76475f88"/>
+    <w:bookmarkEnd w:id="46"/>
+    <w:bookmarkStart w:id="63" w:name="Xe21ac8eabdd6109406629bd8972d04c76475f88"/>
     <w:p>
       <w:pPr>
         <w:pStyle w:val="Heading3"/>
@@ -4328,136 +4542,6 @@
               <w:pStyle w:val="Compact"/>
               <w:jc w:val="center"/>
             </w:pPr>
-            <w:hyperlink r:id="rId45">
-              <w:r>
-                <w:rPr>
-                  <w:rStyle w:val="Hyperlink"/>
-                </w:rPr>
-                <w:t xml:space="preserve">Watch</w:t>
-              </w:r>
-            </w:hyperlink>
-          </w:p>
-        </w:tc>
-      </w:tr>
-      <w:tr>
-        <w:tc>
-          <w:tcPr/>
-          <w:p>
-            <w:pPr>
-              <w:pStyle w:val="Compact"/>
-              <w:jc w:val="center"/>
-            </w:pPr>
-            <w:r>
-              <w:t xml:space="preserve">21</w:t>
-            </w:r>
-          </w:p>
-        </w:tc>
-        <w:tc>
-          <w:tcPr/>
-          <w:p>
-            <w:pPr>
-              <w:pStyle w:val="Compact"/>
-              <w:jc w:val="right"/>
-            </w:pPr>
-            <w:r>
-              <w:t xml:space="preserve">19</w:t>
-            </w:r>
-          </w:p>
-        </w:tc>
-        <w:tc>
-          <w:tcPr/>
-          <w:p>
-            <w:pPr>
-              <w:pStyle w:val="Compact"/>
-            </w:pPr>
-            <w:r>
-              <w:t xml:space="preserve">Secure Workload &amp; Firewall Integration (Part 2)</w:t>
-            </w:r>
-          </w:p>
-        </w:tc>
-        <w:tc>
-          <w:tcPr/>
-          <w:p>
-            <w:pPr>
-              <w:pStyle w:val="Compact"/>
-            </w:pPr>
-            <w:r>
-              <w:t xml:space="preserve">Deployment patterns and policy flow.</w:t>
-            </w:r>
-          </w:p>
-        </w:tc>
-        <w:tc>
-          <w:tcPr/>
-          <w:p>
-            <w:pPr>
-              <w:pStyle w:val="Compact"/>
-              <w:jc w:val="center"/>
-            </w:pPr>
-            <w:hyperlink r:id="rId46">
-              <w:r>
-                <w:rPr>
-                  <w:rStyle w:val="Hyperlink"/>
-                </w:rPr>
-                <w:t xml:space="preserve">Watch</w:t>
-              </w:r>
-            </w:hyperlink>
-          </w:p>
-        </w:tc>
-      </w:tr>
-      <w:tr>
-        <w:tc>
-          <w:tcPr/>
-          <w:p>
-            <w:pPr>
-              <w:pStyle w:val="Compact"/>
-              <w:jc w:val="center"/>
-            </w:pPr>
-            <w:r>
-              <w:t xml:space="preserve">22</w:t>
-            </w:r>
-          </w:p>
-        </w:tc>
-        <w:tc>
-          <w:tcPr/>
-          <w:p>
-            <w:pPr>
-              <w:pStyle w:val="Compact"/>
-              <w:jc w:val="right"/>
-            </w:pPr>
-            <w:r>
-              <w:t xml:space="preserve">20</w:t>
-            </w:r>
-          </w:p>
-        </w:tc>
-        <w:tc>
-          <w:tcPr/>
-          <w:p>
-            <w:pPr>
-              <w:pStyle w:val="Compact"/>
-            </w:pPr>
-            <w:r>
-              <w:t xml:space="preserve">Secure Workload &amp; Firewall Integration (Part 3)</w:t>
-            </w:r>
-          </w:p>
-        </w:tc>
-        <w:tc>
-          <w:tcPr/>
-          <w:p>
-            <w:pPr>
-              <w:pStyle w:val="Compact"/>
-            </w:pPr>
-            <w:r>
-              <w:t xml:space="preserve">Enforcement, telemetry, operations.</w:t>
-            </w:r>
-          </w:p>
-        </w:tc>
-        <w:tc>
-          <w:tcPr/>
-          <w:p>
-            <w:pPr>
-              <w:pStyle w:val="Compact"/>
-              <w:jc w:val="center"/>
-            </w:pPr>
             <w:hyperlink r:id="rId47">
               <w:r>
                 <w:rPr>
@@ -4478,6 +4562,136 @@
               <w:jc w:val="center"/>
             </w:pPr>
             <w:r>
+              <w:t xml:space="preserve">21</w:t>
+            </w:r>
+          </w:p>
+        </w:tc>
+        <w:tc>
+          <w:tcPr/>
+          <w:p>
+            <w:pPr>
+              <w:pStyle w:val="Compact"/>
+              <w:jc w:val="right"/>
+            </w:pPr>
+            <w:r>
+              <w:t xml:space="preserve">19</w:t>
+            </w:r>
+          </w:p>
+        </w:tc>
+        <w:tc>
+          <w:tcPr/>
+          <w:p>
+            <w:pPr>
+              <w:pStyle w:val="Compact"/>
+            </w:pPr>
+            <w:r>
+              <w:t xml:space="preserve">Secure Workload &amp; Firewall Integration (Part 2)</w:t>
+            </w:r>
+          </w:p>
+        </w:tc>
+        <w:tc>
+          <w:tcPr/>
+          <w:p>
+            <w:pPr>
+              <w:pStyle w:val="Compact"/>
+            </w:pPr>
+            <w:r>
+              <w:t xml:space="preserve">Deployment patterns and policy flow.</w:t>
+            </w:r>
+          </w:p>
+        </w:tc>
+        <w:tc>
+          <w:tcPr/>
+          <w:p>
+            <w:pPr>
+              <w:pStyle w:val="Compact"/>
+              <w:jc w:val="center"/>
+            </w:pPr>
+            <w:hyperlink r:id="rId48">
+              <w:r>
+                <w:rPr>
+                  <w:rStyle w:val="Hyperlink"/>
+                </w:rPr>
+                <w:t xml:space="preserve">Watch</w:t>
+              </w:r>
+            </w:hyperlink>
+          </w:p>
+        </w:tc>
+      </w:tr>
+      <w:tr>
+        <w:tc>
+          <w:tcPr/>
+          <w:p>
+            <w:pPr>
+              <w:pStyle w:val="Compact"/>
+              <w:jc w:val="center"/>
+            </w:pPr>
+            <w:r>
+              <w:t xml:space="preserve">22</w:t>
+            </w:r>
+          </w:p>
+        </w:tc>
+        <w:tc>
+          <w:tcPr/>
+          <w:p>
+            <w:pPr>
+              <w:pStyle w:val="Compact"/>
+              <w:jc w:val="right"/>
+            </w:pPr>
+            <w:r>
+              <w:t xml:space="preserve">20</w:t>
+            </w:r>
+          </w:p>
+        </w:tc>
+        <w:tc>
+          <w:tcPr/>
+          <w:p>
+            <w:pPr>
+              <w:pStyle w:val="Compact"/>
+            </w:pPr>
+            <w:r>
+              <w:t xml:space="preserve">Secure Workload &amp; Firewall Integration (Part 3)</w:t>
+            </w:r>
+          </w:p>
+        </w:tc>
+        <w:tc>
+          <w:tcPr/>
+          <w:p>
+            <w:pPr>
+              <w:pStyle w:val="Compact"/>
+            </w:pPr>
+            <w:r>
+              <w:t xml:space="preserve">Enforcement, telemetry, operations.</w:t>
+            </w:r>
+          </w:p>
+        </w:tc>
+        <w:tc>
+          <w:tcPr/>
+          <w:p>
+            <w:pPr>
+              <w:pStyle w:val="Compact"/>
+              <w:jc w:val="center"/>
+            </w:pPr>
+            <w:hyperlink r:id="rId49">
+              <w:r>
+                <w:rPr>
+                  <w:rStyle w:val="Hyperlink"/>
+                </w:rPr>
+                <w:t xml:space="preserve">Watch</w:t>
+              </w:r>
+            </w:hyperlink>
+          </w:p>
+        </w:tc>
+      </w:tr>
+      <w:tr>
+        <w:tc>
+          <w:tcPr/>
+          <w:p>
+            <w:pPr>
+              <w:pStyle w:val="Compact"/>
+              <w:jc w:val="center"/>
+            </w:pPr>
+            <w:r>
               <w:t xml:space="preserve">23</w:t>
             </w:r>
           </w:p>
@@ -4523,7 +4737,7 @@
               <w:pStyle w:val="Compact"/>
               <w:jc w:val="center"/>
             </w:pPr>
-            <w:hyperlink r:id="rId48">
+            <w:hyperlink r:id="rId50">
               <w:r>
                 <w:rPr>
                   <w:rStyle w:val="Hyperlink"/>
@@ -4588,7 +4802,7 @@
               <w:pStyle w:val="Compact"/>
               <w:jc w:val="center"/>
             </w:pPr>
-            <w:hyperlink r:id="rId49">
+            <w:hyperlink r:id="rId51">
               <w:r>
                 <w:rPr>
                   <w:rStyle w:val="Hyperlink"/>
@@ -4643,136 +4857,6 @@
             </w:pPr>
             <w:r>
               <w:t xml:space="preserve">F5 APM application visibility.</w:t>
-            </w:r>
-          </w:p>
-        </w:tc>
-        <w:tc>
-          <w:tcPr/>
-          <w:p>
-            <w:pPr>
-              <w:pStyle w:val="Compact"/>
-              <w:jc w:val="center"/>
-            </w:pPr>
-            <w:hyperlink r:id="rId50">
-              <w:r>
-                <w:rPr>
-                  <w:rStyle w:val="Hyperlink"/>
-                </w:rPr>
-                <w:t xml:space="preserve">Watch</w:t>
-              </w:r>
-            </w:hyperlink>
-          </w:p>
-        </w:tc>
-      </w:tr>
-      <w:tr>
-        <w:tc>
-          <w:tcPr/>
-          <w:p>
-            <w:pPr>
-              <w:pStyle w:val="Compact"/>
-              <w:jc w:val="center"/>
-            </w:pPr>
-            <w:r>
-              <w:t xml:space="preserve">26</w:t>
-            </w:r>
-          </w:p>
-        </w:tc>
-        <w:tc>
-          <w:tcPr/>
-          <w:p>
-            <w:pPr>
-              <w:pStyle w:val="Compact"/>
-              <w:jc w:val="right"/>
-            </w:pPr>
-            <w:r>
-              <w:t xml:space="preserve">24</w:t>
-            </w:r>
-          </w:p>
-        </w:tc>
-        <w:tc>
-          <w:tcPr/>
-          <w:p>
-            <w:pPr>
-              <w:pStyle w:val="Compact"/>
-            </w:pPr>
-            <w:r>
-              <w:t xml:space="preserve">F5 BIG-IP AFM</w:t>
-            </w:r>
-          </w:p>
-        </w:tc>
-        <w:tc>
-          <w:tcPr/>
-          <w:p>
-            <w:pPr>
-              <w:pStyle w:val="Compact"/>
-            </w:pPr>
-            <w:r>
-              <w:t xml:space="preserve">AFM flow context.</w:t>
-            </w:r>
-          </w:p>
-        </w:tc>
-        <w:tc>
-          <w:tcPr/>
-          <w:p>
-            <w:pPr>
-              <w:pStyle w:val="Compact"/>
-              <w:jc w:val="center"/>
-            </w:pPr>
-            <w:hyperlink r:id="rId51">
-              <w:r>
-                <w:rPr>
-                  <w:rStyle w:val="Hyperlink"/>
-                </w:rPr>
-                <w:t xml:space="preserve">Watch</w:t>
-              </w:r>
-            </w:hyperlink>
-          </w:p>
-        </w:tc>
-      </w:tr>
-      <w:tr>
-        <w:tc>
-          <w:tcPr/>
-          <w:p>
-            <w:pPr>
-              <w:pStyle w:val="Compact"/>
-              <w:jc w:val="center"/>
-            </w:pPr>
-            <w:r>
-              <w:t xml:space="preserve">27</w:t>
-            </w:r>
-          </w:p>
-        </w:tc>
-        <w:tc>
-          <w:tcPr/>
-          <w:p>
-            <w:pPr>
-              <w:pStyle w:val="Compact"/>
-              <w:jc w:val="right"/>
-            </w:pPr>
-            <w:r>
-              <w:t xml:space="preserve">25</w:t>
-            </w:r>
-          </w:p>
-        </w:tc>
-        <w:tc>
-          <w:tcPr/>
-          <w:p>
-            <w:pPr>
-              <w:pStyle w:val="Compact"/>
-            </w:pPr>
-            <w:r>
-              <w:t xml:space="preserve">F5 BIG-IP IPFIX Configuration</w:t>
-            </w:r>
-          </w:p>
-        </w:tc>
-        <w:tc>
-          <w:tcPr/>
-          <w:p>
-            <w:pPr>
-              <w:pStyle w:val="Compact"/>
-            </w:pPr>
-            <w:r>
-              <w:t xml:space="preserve">IPFIX into Secure Workload.</w:t>
             </w:r>
           </w:p>
         </w:tc>
@@ -4803,7 +4887,7 @@
               <w:jc w:val="center"/>
             </w:pPr>
             <w:r>
-              <w:t xml:space="preserve">28</w:t>
+              <w:t xml:space="preserve">26</w:t>
             </w:r>
           </w:p>
         </w:tc>
@@ -4815,29 +4899,29 @@
               <w:jc w:val="right"/>
             </w:pPr>
             <w:r>
-              <w:t xml:space="preserve">26</w:t>
-            </w:r>
-          </w:p>
-        </w:tc>
-        <w:tc>
-          <w:tcPr/>
-          <w:p>
-            <w:pPr>
-              <w:pStyle w:val="Compact"/>
-            </w:pPr>
-            <w:r>
-              <w:t xml:space="preserve">DNS Server Integration</w:t>
-            </w:r>
-          </w:p>
-        </w:tc>
-        <w:tc>
-          <w:tcPr/>
-          <w:p>
-            <w:pPr>
-              <w:pStyle w:val="Compact"/>
-            </w:pPr>
-            <w:r>
-              <w:t xml:space="preserve">DNS context for flows and policy.</w:t>
+              <w:t xml:space="preserve">24</w:t>
+            </w:r>
+          </w:p>
+        </w:tc>
+        <w:tc>
+          <w:tcPr/>
+          <w:p>
+            <w:pPr>
+              <w:pStyle w:val="Compact"/>
+            </w:pPr>
+            <w:r>
+              <w:t xml:space="preserve">F5 BIG-IP AFM</w:t>
+            </w:r>
+          </w:p>
+        </w:tc>
+        <w:tc>
+          <w:tcPr/>
+          <w:p>
+            <w:pPr>
+              <w:pStyle w:val="Compact"/>
+            </w:pPr>
+            <w:r>
+              <w:t xml:space="preserve">AFM flow context.</w:t>
             </w:r>
           </w:p>
         </w:tc>
@@ -4868,7 +4952,7 @@
               <w:jc w:val="center"/>
             </w:pPr>
             <w:r>
-              <w:t xml:space="preserve">29</w:t>
+              <w:t xml:space="preserve">27</w:t>
             </w:r>
           </w:p>
         </w:tc>
@@ -4880,29 +4964,29 @@
               <w:jc w:val="right"/>
             </w:pPr>
             <w:r>
-              <w:t xml:space="preserve">27</w:t>
-            </w:r>
-          </w:p>
-        </w:tc>
-        <w:tc>
-          <w:tcPr/>
-          <w:p>
-            <w:pPr>
-              <w:pStyle w:val="Compact"/>
-            </w:pPr>
-            <w:r>
-              <w:t xml:space="preserve">Infoblox Integration</w:t>
-            </w:r>
-          </w:p>
-        </w:tc>
-        <w:tc>
-          <w:tcPr/>
-          <w:p>
-            <w:pPr>
-              <w:pStyle w:val="Compact"/>
-            </w:pPr>
-            <w:r>
-              <w:t xml:space="preserve">DNS / IPAM context.</w:t>
+              <w:t xml:space="preserve">25</w:t>
+            </w:r>
+          </w:p>
+        </w:tc>
+        <w:tc>
+          <w:tcPr/>
+          <w:p>
+            <w:pPr>
+              <w:pStyle w:val="Compact"/>
+            </w:pPr>
+            <w:r>
+              <w:t xml:space="preserve">F5 BIG-IP IPFIX Configuration</w:t>
+            </w:r>
+          </w:p>
+        </w:tc>
+        <w:tc>
+          <w:tcPr/>
+          <w:p>
+            <w:pPr>
+              <w:pStyle w:val="Compact"/>
+            </w:pPr>
+            <w:r>
+              <w:t xml:space="preserve">IPFIX into Secure Workload.</w:t>
             </w:r>
           </w:p>
         </w:tc>
@@ -4933,7 +5017,7 @@
               <w:jc w:val="center"/>
             </w:pPr>
             <w:r>
-              <w:t xml:space="preserve">30</w:t>
+              <w:t xml:space="preserve">28</w:t>
             </w:r>
           </w:p>
         </w:tc>
@@ -4945,29 +5029,29 @@
               <w:jc w:val="right"/>
             </w:pPr>
             <w:r>
-              <w:t xml:space="preserve">28</w:t>
-            </w:r>
-          </w:p>
-        </w:tc>
-        <w:tc>
-          <w:tcPr/>
-          <w:p>
-            <w:pPr>
-              <w:pStyle w:val="Compact"/>
-            </w:pPr>
-            <w:r>
-              <w:t xml:space="preserve">Algosec Integration</w:t>
-            </w:r>
-          </w:p>
-        </w:tc>
-        <w:tc>
-          <w:tcPr/>
-          <w:p>
-            <w:pPr>
-              <w:pStyle w:val="Compact"/>
-            </w:pPr>
-            <w:r>
-              <w:t xml:space="preserve">Firewall-policy lifecycle.</w:t>
+              <w:t xml:space="preserve">26</w:t>
+            </w:r>
+          </w:p>
+        </w:tc>
+        <w:tc>
+          <w:tcPr/>
+          <w:p>
+            <w:pPr>
+              <w:pStyle w:val="Compact"/>
+            </w:pPr>
+            <w:r>
+              <w:t xml:space="preserve">DNS Server Integration</w:t>
+            </w:r>
+          </w:p>
+        </w:tc>
+        <w:tc>
+          <w:tcPr/>
+          <w:p>
+            <w:pPr>
+              <w:pStyle w:val="Compact"/>
+            </w:pPr>
+            <w:r>
+              <w:t xml:space="preserve">DNS context for flows and policy.</w:t>
             </w:r>
           </w:p>
         </w:tc>
@@ -4998,7 +5082,7 @@
               <w:jc w:val="center"/>
             </w:pPr>
             <w:r>
-              <w:t xml:space="preserve">31</w:t>
+              <w:t xml:space="preserve">29</w:t>
             </w:r>
           </w:p>
         </w:tc>
@@ -5010,29 +5094,29 @@
               <w:jc w:val="right"/>
             </w:pPr>
             <w:r>
-              <w:t xml:space="preserve">29</w:t>
-            </w:r>
-          </w:p>
-        </w:tc>
-        <w:tc>
-          <w:tcPr/>
-          <w:p>
-            <w:pPr>
-              <w:pStyle w:val="Compact"/>
-            </w:pPr>
-            <w:r>
-              <w:t xml:space="preserve">ISE (In Action)</w:t>
-            </w:r>
-          </w:p>
-        </w:tc>
-        <w:tc>
-          <w:tcPr/>
-          <w:p>
-            <w:pPr>
-              <w:pStyle w:val="Compact"/>
-            </w:pPr>
-            <w:r>
-              <w:t xml:space="preserve">Identity from Cisco ISE.</w:t>
+              <w:t xml:space="preserve">27</w:t>
+            </w:r>
+          </w:p>
+        </w:tc>
+        <w:tc>
+          <w:tcPr/>
+          <w:p>
+            <w:pPr>
+              <w:pStyle w:val="Compact"/>
+            </w:pPr>
+            <w:r>
+              <w:t xml:space="preserve">Infoblox Integration</w:t>
+            </w:r>
+          </w:p>
+        </w:tc>
+        <w:tc>
+          <w:tcPr/>
+          <w:p>
+            <w:pPr>
+              <w:pStyle w:val="Compact"/>
+            </w:pPr>
+            <w:r>
+              <w:t xml:space="preserve">DNS / IPAM context.</w:t>
             </w:r>
           </w:p>
         </w:tc>
@@ -5063,7 +5147,7 @@
               <w:jc w:val="center"/>
             </w:pPr>
             <w:r>
-              <w:t xml:space="preserve">32</w:t>
+              <w:t xml:space="preserve">30</w:t>
             </w:r>
           </w:p>
         </w:tc>
@@ -5075,29 +5159,29 @@
               <w:jc w:val="right"/>
             </w:pPr>
             <w:r>
-              <w:t xml:space="preserve">30</w:t>
-            </w:r>
-          </w:p>
-        </w:tc>
-        <w:tc>
-          <w:tcPr/>
-          <w:p>
-            <w:pPr>
-              <w:pStyle w:val="Compact"/>
-            </w:pPr>
-            <w:r>
-              <w:t xml:space="preserve">FMC / Edge / Ingest / Appliance</w:t>
-            </w:r>
-          </w:p>
-        </w:tc>
-        <w:tc>
-          <w:tcPr/>
-          <w:p>
-            <w:pPr>
-              <w:pStyle w:val="Compact"/>
-            </w:pPr>
-            <w:r>
-              <w:t xml:space="preserve">FMC integration paths.</w:t>
+              <w:t xml:space="preserve">28</w:t>
+            </w:r>
+          </w:p>
+        </w:tc>
+        <w:tc>
+          <w:tcPr/>
+          <w:p>
+            <w:pPr>
+              <w:pStyle w:val="Compact"/>
+            </w:pPr>
+            <w:r>
+              <w:t xml:space="preserve">Algosec Integration</w:t>
+            </w:r>
+          </w:p>
+        </w:tc>
+        <w:tc>
+          <w:tcPr/>
+          <w:p>
+            <w:pPr>
+              <w:pStyle w:val="Compact"/>
+            </w:pPr>
+            <w:r>
+              <w:t xml:space="preserve">Firewall-policy lifecycle.</w:t>
             </w:r>
           </w:p>
         </w:tc>
@@ -5128,7 +5212,7 @@
               <w:jc w:val="center"/>
             </w:pPr>
             <w:r>
-              <w:t xml:space="preserve">33</w:t>
+              <w:t xml:space="preserve">31</w:t>
             </w:r>
           </w:p>
         </w:tc>
@@ -5140,29 +5224,29 @@
               <w:jc w:val="right"/>
             </w:pPr>
             <w:r>
-              <w:t xml:space="preserve">31</w:t>
-            </w:r>
-          </w:p>
-        </w:tc>
-        <w:tc>
-          <w:tcPr/>
-          <w:p>
-            <w:pPr>
-              <w:pStyle w:val="Compact"/>
-            </w:pPr>
-            <w:r>
-              <w:t xml:space="preserve">ACI and CSW Integration</w:t>
-            </w:r>
-          </w:p>
-        </w:tc>
-        <w:tc>
-          <w:tcPr/>
-          <w:p>
-            <w:pPr>
-              <w:pStyle w:val="Compact"/>
-            </w:pPr>
-            <w:r>
-              <w:t xml:space="preserve">ACI + workload segmentation.</w:t>
+              <w:t xml:space="preserve">29</w:t>
+            </w:r>
+          </w:p>
+        </w:tc>
+        <w:tc>
+          <w:tcPr/>
+          <w:p>
+            <w:pPr>
+              <w:pStyle w:val="Compact"/>
+            </w:pPr>
+            <w:r>
+              <w:t xml:space="preserve">ISE (In Action)</w:t>
+            </w:r>
+          </w:p>
+        </w:tc>
+        <w:tc>
+          <w:tcPr/>
+          <w:p>
+            <w:pPr>
+              <w:pStyle w:val="Compact"/>
+            </w:pPr>
+            <w:r>
+              <w:t xml:space="preserve">Identity from Cisco ISE.</w:t>
             </w:r>
           </w:p>
         </w:tc>
@@ -5193,7 +5277,7 @@
               <w:jc w:val="center"/>
             </w:pPr>
             <w:r>
-              <w:t xml:space="preserve">34</w:t>
+              <w:t xml:space="preserve">32</w:t>
             </w:r>
           </w:p>
         </w:tc>
@@ -5205,29 +5289,29 @@
               <w:jc w:val="right"/>
             </w:pPr>
             <w:r>
-              <w:t xml:space="preserve">35</w:t>
-            </w:r>
-          </w:p>
-        </w:tc>
-        <w:tc>
-          <w:tcPr/>
-          <w:p>
-            <w:pPr>
-              <w:pStyle w:val="Compact"/>
-            </w:pPr>
-            <w:r>
-              <w:t xml:space="preserve">Splunk Integration (SIEM)</w:t>
-            </w:r>
-          </w:p>
-        </w:tc>
-        <w:tc>
-          <w:tcPr/>
-          <w:p>
-            <w:pPr>
-              <w:pStyle w:val="Compact"/>
-            </w:pPr>
-            <w:r>
-              <w:t xml:space="preserve">Cisco Security Cloud App for baseline datasets, CSW → Splunk Syslog alerts, plus Splunk-driven Python against the CSW API.</w:t>
+              <w:t xml:space="preserve">30</w:t>
+            </w:r>
+          </w:p>
+        </w:tc>
+        <w:tc>
+          <w:tcPr/>
+          <w:p>
+            <w:pPr>
+              <w:pStyle w:val="Compact"/>
+            </w:pPr>
+            <w:r>
+              <w:t xml:space="preserve">FMC / Edge / Ingest / Appliance</w:t>
+            </w:r>
+          </w:p>
+        </w:tc>
+        <w:tc>
+          <w:tcPr/>
+          <w:p>
+            <w:pPr>
+              <w:pStyle w:val="Compact"/>
+            </w:pPr>
+            <w:r>
+              <w:t xml:space="preserve">FMC integration paths.</w:t>
             </w:r>
           </w:p>
         </w:tc>
@@ -5258,6 +5342,83 @@
               <w:jc w:val="center"/>
             </w:pPr>
             <w:r>
+              <w:t xml:space="preserve">33</w:t>
+            </w:r>
+          </w:p>
+        </w:tc>
+        <w:tc>
+          <w:tcPr/>
+          <w:p>
+            <w:pPr>
+              <w:pStyle w:val="Compact"/>
+              <w:jc w:val="right"/>
+            </w:pPr>
+            <w:r>
+              <w:t xml:space="preserve">31</w:t>
+            </w:r>
+          </w:p>
+        </w:tc>
+        <w:tc>
+          <w:tcPr/>
+          <w:p>
+            <w:pPr>
+              <w:pStyle w:val="Compact"/>
+            </w:pPr>
+            <w:r>
+              <w:t xml:space="preserve">ACI and CSW Integration</w:t>
+            </w:r>
+          </w:p>
+        </w:tc>
+        <w:tc>
+          <w:tcPr/>
+          <w:p>
+            <w:pPr>
+              <w:pStyle w:val="Compact"/>
+            </w:pPr>
+            <w:r>
+              <w:t xml:space="preserve">ACI + workload segmentation.</w:t>
+            </w:r>
+          </w:p>
+        </w:tc>
+        <w:tc>
+          <w:tcPr/>
+          <w:p>
+            <w:pPr>
+              <w:pStyle w:val="Compact"/>
+              <w:jc w:val="center"/>
+            </w:pPr>
+            <w:hyperlink r:id="rId60">
+              <w:r>
+                <w:rPr>
+                  <w:rStyle w:val="Hyperlink"/>
+                </w:rPr>
+                <w:t xml:space="preserve">Watch</w:t>
+              </w:r>
+            </w:hyperlink>
+          </w:p>
+        </w:tc>
+      </w:tr>
+      <w:tr>
+        <w:tc>
+          <w:tcPr/>
+          <w:p>
+            <w:pPr>
+              <w:pStyle w:val="Compact"/>
+              <w:jc w:val="center"/>
+            </w:pPr>
+            <w:r>
+              <w:t xml:space="preserve">34</w:t>
+            </w:r>
+          </w:p>
+        </w:tc>
+        <w:tc>
+          <w:tcPr/>
+          <w:p>
+            <w:pPr>
+              <w:pStyle w:val="Compact"/>
+              <w:jc w:val="right"/>
+            </w:pPr>
+            <w:r>
               <w:t xml:space="preserve">35</w:t>
             </w:r>
           </w:p>
@@ -5267,6 +5428,59 @@
           <w:p>
             <w:pPr>
               <w:pStyle w:val="Compact"/>
+            </w:pPr>
+            <w:r>
+              <w:t xml:space="preserve">Splunk Integration (SIEM)</w:t>
+            </w:r>
+          </w:p>
+        </w:tc>
+        <w:tc>
+          <w:tcPr/>
+          <w:p>
+            <w:pPr>
+              <w:pStyle w:val="Compact"/>
+            </w:pPr>
+            <w:r>
+              <w:t xml:space="preserve">Cisco Security Cloud App for baseline datasets, CSW → Splunk Syslog alerts, plus Splunk-driven Python against the CSW API.</w:t>
+            </w:r>
+          </w:p>
+        </w:tc>
+        <w:tc>
+          <w:tcPr/>
+          <w:p>
+            <w:pPr>
+              <w:pStyle w:val="Compact"/>
+              <w:jc w:val="center"/>
+            </w:pPr>
+            <w:hyperlink r:id="rId61">
+              <w:r>
+                <w:rPr>
+                  <w:rStyle w:val="Hyperlink"/>
+                </w:rPr>
+                <w:t xml:space="preserve">Watch</w:t>
+              </w:r>
+            </w:hyperlink>
+          </w:p>
+        </w:tc>
+      </w:tr>
+      <w:tr>
+        <w:tc>
+          <w:tcPr/>
+          <w:p>
+            <w:pPr>
+              <w:pStyle w:val="Compact"/>
+              <w:jc w:val="center"/>
+            </w:pPr>
+            <w:r>
+              <w:t xml:space="preserve">35</w:t>
+            </w:r>
+          </w:p>
+        </w:tc>
+        <w:tc>
+          <w:tcPr/>
+          <w:p>
+            <w:pPr>
+              <w:pStyle w:val="Compact"/>
               <w:jc w:val="right"/>
             </w:pPr>
             <w:r>
@@ -5303,7 +5517,7 @@
               <w:pStyle w:val="Compact"/>
               <w:jc w:val="center"/>
             </w:pPr>
-            <w:hyperlink r:id="rId60">
+            <w:hyperlink r:id="rId62">
               <w:r>
                 <w:rPr>
                   <w:rStyle w:val="Hyperlink"/>
@@ -5875,8 +6089,8 @@
         <w:t xml:space="preserve">the CI/CD story usually lands well with cloud / platform teams who already manage everything else as code and bristle at "click here in the console" instructions. Start with policy-as-code for one application scope from the POV — it pairs naturally with the Phase 3 ADM → policy modeling output, since the modeled policy is already structured data.</w:t>
       </w:r>
     </w:p>
-    <w:bookmarkEnd w:id="61"/>
-    <w:bookmarkStart w:id="63" w:name="X075da46d2c2e8e62f26dd0dd2b1479576f22a39"/>
+    <w:bookmarkEnd w:id="63"/>
+    <w:bookmarkStart w:id="65" w:name="X075da46d2c2e8e62f26dd0dd2b1479576f22a39"/>
     <w:p>
       <w:pPr>
         <w:pStyle w:val="Heading3"/>
@@ -6015,7 +6229,7 @@
               <w:pStyle w:val="Compact"/>
               <w:jc w:val="center"/>
             </w:pPr>
-            <w:hyperlink r:id="rId62">
+            <w:hyperlink r:id="rId64">
               <w:r>
                 <w:rPr>
                   <w:rStyle w:val="Hyperlink"/>
@@ -6034,9 +6248,9 @@
         </w:pict>
       </w:r>
     </w:p>
-    <w:bookmarkEnd w:id="63"/>
-    <w:bookmarkEnd w:id="64"/>
-    <w:bookmarkStart w:id="68" w:name="Xb9f64f467495bd55447e9bc3c7ae8dd7dbb3895"/>
+    <w:bookmarkEnd w:id="65"/>
+    <w:bookmarkEnd w:id="66"/>
+    <w:bookmarkStart w:id="70" w:name="Xb9f64f467495bd55447e9bc3c7ae8dd7dbb3895"/>
     <w:p>
       <w:pPr>
         <w:pStyle w:val="Heading2"/>
@@ -6045,7 +6259,7 @@
         <w:t xml:space="preserve">7. How to Explain CSW in a Customer Meeting</w:t>
       </w:r>
     </w:p>
-    <w:bookmarkStart w:id="65" w:name="X02667f004e9d93967c02b53649e8d7704fae290"/>
+    <w:bookmarkStart w:id="67" w:name="X02667f004e9d93967c02b53649e8d7704fae290"/>
     <w:p>
       <w:pPr>
         <w:pStyle w:val="Heading3"/>
@@ -6062,8 +6276,8 @@
         <w:t xml:space="preserve">Cisco Secure Workload helps customers discover how applications communicate and then safely enforce least-privilege segmentation policies around those applications. It starts with visibility and dependency mapping, uses labels and observed behavior to create policy, and supports staged enforcement so teams can reduce lateral movement risk without breaking applications.</w:t>
       </w:r>
     </w:p>
-    <w:bookmarkEnd w:id="65"/>
-    <w:bookmarkStart w:id="66" w:name="X245c304b430f838300b4e5d227cae86dea678fa"/>
+    <w:bookmarkEnd w:id="67"/>
+    <w:bookmarkStart w:id="68" w:name="X245c304b430f838300b4e5d227cae86dea678fa"/>
     <w:p>
       <w:pPr>
         <w:pStyle w:val="Heading3"/>
@@ -6080,8 +6294,8 @@
         <w:t xml:space="preserve">Most enterprises want micro-segmentation, but they hesitate because they do not fully know what their applications depend on. CSW starts by collecting workload telemetry, flow visibility, process context, cloud metadata, and CMDB labels. That data helps application teams understand real dependencies. From there, teams can model policy, see what would be blocked, tune the rules, and move selected workloads from monitor mode to enforcement. CSW is especially useful when customers need consistent segmentation across data center and cloud environments.</w:t>
       </w:r>
     </w:p>
-    <w:bookmarkEnd w:id="66"/>
-    <w:bookmarkStart w:id="67" w:name="common-positioning"/>
+    <w:bookmarkEnd w:id="68"/>
+    <w:bookmarkStart w:id="69" w:name="common-positioning"/>
     <w:p>
       <w:pPr>
         <w:pStyle w:val="Heading3"/>
@@ -6095,7 +6309,7 @@
         <w:pStyle w:val="Compact"/>
         <w:numPr>
           <w:ilvl w:val="0"/>
-          <w:numId w:val="1007"/>
+          <w:numId w:val="1008"/>
         </w:numPr>
       </w:pPr>
       <w:r>
@@ -6117,7 +6331,7 @@
         <w:pStyle w:val="Compact"/>
         <w:numPr>
           <w:ilvl w:val="0"/>
-          <w:numId w:val="1007"/>
+          <w:numId w:val="1008"/>
         </w:numPr>
       </w:pPr>
       <w:r>
@@ -6139,7 +6353,7 @@
         <w:pStyle w:val="Compact"/>
         <w:numPr>
           <w:ilvl w:val="0"/>
-          <w:numId w:val="1007"/>
+          <w:numId w:val="1008"/>
         </w:numPr>
       </w:pPr>
       <w:r>
@@ -6161,7 +6375,7 @@
         <w:pStyle w:val="Compact"/>
         <w:numPr>
           <w:ilvl w:val="0"/>
-          <w:numId w:val="1007"/>
+          <w:numId w:val="1008"/>
         </w:numPr>
       </w:pPr>
       <w:r>
@@ -6183,7 +6397,7 @@
         <w:pStyle w:val="Compact"/>
         <w:numPr>
           <w:ilvl w:val="0"/>
-          <w:numId w:val="1007"/>
+          <w:numId w:val="1008"/>
         </w:numPr>
       </w:pPr>
       <w:r>
@@ -6207,9 +6421,9 @@
         </w:pict>
       </w:r>
     </w:p>
-    <w:bookmarkEnd w:id="67"/>
-    <w:bookmarkEnd w:id="68"/>
-    <w:bookmarkStart w:id="78" w:name="X861afc8e8f3d3fa2cbc4317cb6150d80f9f9ccf"/>
+    <w:bookmarkEnd w:id="69"/>
+    <w:bookmarkEnd w:id="70"/>
+    <w:bookmarkStart w:id="80" w:name="X861afc8e8f3d3fa2cbc4317cb6150d80f9f9ccf"/>
     <w:p>
       <w:pPr>
         <w:pStyle w:val="Heading2"/>
@@ -6218,7 +6432,7 @@
         <w:t xml:space="preserve">8. CSW Onboarding Runbook</w:t>
       </w:r>
     </w:p>
-    <w:bookmarkStart w:id="69" w:name="phase-0---confirm-scope-and-outcomes"/>
+    <w:bookmarkStart w:id="71" w:name="phase-0---confirm-scope-and-outcomes"/>
     <w:p>
       <w:pPr>
         <w:pStyle w:val="Heading3"/>
@@ -6262,7 +6476,7 @@
         <w:pStyle w:val="Compact"/>
         <w:numPr>
           <w:ilvl w:val="0"/>
-          <w:numId w:val="1008"/>
+          <w:numId w:val="1009"/>
         </w:numPr>
       </w:pPr>
       <w:r>
@@ -6274,7 +6488,7 @@
         <w:pStyle w:val="Compact"/>
         <w:numPr>
           <w:ilvl w:val="0"/>
-          <w:numId w:val="1008"/>
+          <w:numId w:val="1009"/>
         </w:numPr>
       </w:pPr>
       <w:r>
@@ -6286,7 +6500,7 @@
         <w:pStyle w:val="Compact"/>
         <w:numPr>
           <w:ilvl w:val="0"/>
-          <w:numId w:val="1008"/>
+          <w:numId w:val="1009"/>
         </w:numPr>
       </w:pPr>
       <w:r>
@@ -6298,7 +6512,7 @@
         <w:pStyle w:val="Compact"/>
         <w:numPr>
           <w:ilvl w:val="0"/>
-          <w:numId w:val="1008"/>
+          <w:numId w:val="1009"/>
         </w:numPr>
       </w:pPr>
       <w:r>
@@ -6310,7 +6524,7 @@
         <w:pStyle w:val="Compact"/>
         <w:numPr>
           <w:ilvl w:val="1"/>
-          <w:numId w:val="1009"/>
+          <w:numId w:val="1010"/>
         </w:numPr>
       </w:pPr>
       <w:r>
@@ -6322,7 +6536,7 @@
         <w:pStyle w:val="Compact"/>
         <w:numPr>
           <w:ilvl w:val="1"/>
-          <w:numId w:val="1009"/>
+          <w:numId w:val="1010"/>
         </w:numPr>
       </w:pPr>
       <w:r>
@@ -6334,7 +6548,7 @@
         <w:pStyle w:val="Compact"/>
         <w:numPr>
           <w:ilvl w:val="1"/>
-          <w:numId w:val="1009"/>
+          <w:numId w:val="1010"/>
         </w:numPr>
       </w:pPr>
       <w:r>
@@ -6346,7 +6560,7 @@
         <w:pStyle w:val="Compact"/>
         <w:numPr>
           <w:ilvl w:val="1"/>
-          <w:numId w:val="1009"/>
+          <w:numId w:val="1010"/>
         </w:numPr>
       </w:pPr>
       <w:r>
@@ -6358,7 +6572,7 @@
         <w:pStyle w:val="Compact"/>
         <w:numPr>
           <w:ilvl w:val="1"/>
-          <w:numId w:val="1009"/>
+          <w:numId w:val="1010"/>
         </w:numPr>
       </w:pPr>
       <w:r>
@@ -6370,7 +6584,7 @@
         <w:pStyle w:val="Compact"/>
         <w:numPr>
           <w:ilvl w:val="1"/>
-          <w:numId w:val="1009"/>
+          <w:numId w:val="1010"/>
         </w:numPr>
       </w:pPr>
       <w:r>
@@ -6402,8 +6616,8 @@
         </w:pict>
       </w:r>
     </w:p>
-    <w:bookmarkEnd w:id="69"/>
-    <w:bookmarkStart w:id="70" w:name="phase-1---prepare-the-tenant-and-access"/>
+    <w:bookmarkEnd w:id="71"/>
+    <w:bookmarkStart w:id="72" w:name="phase-1---prepare-the-tenant-and-access"/>
     <w:p>
       <w:pPr>
         <w:pStyle w:val="Heading3"/>
@@ -6447,7 +6661,7 @@
         <w:pStyle w:val="Compact"/>
         <w:numPr>
           <w:ilvl w:val="0"/>
-          <w:numId w:val="1010"/>
+          <w:numId w:val="1011"/>
         </w:numPr>
       </w:pPr>
       <w:r>
@@ -6459,7 +6673,7 @@
         <w:pStyle w:val="Compact"/>
         <w:numPr>
           <w:ilvl w:val="0"/>
-          <w:numId w:val="1010"/>
+          <w:numId w:val="1011"/>
         </w:numPr>
       </w:pPr>
       <w:r>
@@ -6471,7 +6685,7 @@
         <w:pStyle w:val="Compact"/>
         <w:numPr>
           <w:ilvl w:val="0"/>
-          <w:numId w:val="1010"/>
+          <w:numId w:val="1011"/>
         </w:numPr>
       </w:pPr>
       <w:r>
@@ -6483,7 +6697,7 @@
         <w:pStyle w:val="Compact"/>
         <w:numPr>
           <w:ilvl w:val="0"/>
-          <w:numId w:val="1010"/>
+          <w:numId w:val="1011"/>
         </w:numPr>
       </w:pPr>
       <w:r>
@@ -6495,7 +6709,7 @@
         <w:pStyle w:val="Compact"/>
         <w:numPr>
           <w:ilvl w:val="0"/>
-          <w:numId w:val="1010"/>
+          <w:numId w:val="1011"/>
         </w:numPr>
       </w:pPr>
       <w:r>
@@ -6527,8 +6741,8 @@
         </w:pict>
       </w:r>
     </w:p>
-    <w:bookmarkEnd w:id="70"/>
-    <w:bookmarkStart w:id="71" w:name="phase-2---build-the-label-strategy"/>
+    <w:bookmarkEnd w:id="72"/>
+    <w:bookmarkStart w:id="73" w:name="phase-2---build-the-label-strategy"/>
     <w:p>
       <w:pPr>
         <w:pStyle w:val="Heading3"/>
@@ -7026,7 +7240,7 @@
         <w:pStyle w:val="Compact"/>
         <w:numPr>
           <w:ilvl w:val="0"/>
-          <w:numId w:val="1011"/>
+          <w:numId w:val="1012"/>
         </w:numPr>
       </w:pPr>
       <w:r>
@@ -7038,7 +7252,7 @@
         <w:pStyle w:val="Compact"/>
         <w:numPr>
           <w:ilvl w:val="0"/>
-          <w:numId w:val="1011"/>
+          <w:numId w:val="1012"/>
         </w:numPr>
       </w:pPr>
       <w:r>
@@ -7050,7 +7264,7 @@
         <w:pStyle w:val="Compact"/>
         <w:numPr>
           <w:ilvl w:val="0"/>
-          <w:numId w:val="1011"/>
+          <w:numId w:val="1012"/>
         </w:numPr>
       </w:pPr>
       <w:r>
@@ -7062,7 +7276,7 @@
         <w:pStyle w:val="Compact"/>
         <w:numPr>
           <w:ilvl w:val="0"/>
-          <w:numId w:val="1011"/>
+          <w:numId w:val="1012"/>
         </w:numPr>
       </w:pPr>
       <w:r>
@@ -7094,8 +7308,8 @@
         </w:pict>
       </w:r>
     </w:p>
-    <w:bookmarkEnd w:id="71"/>
-    <w:bookmarkStart w:id="72" w:name="phase-3---deploy-agents-and-connectors"/>
+    <w:bookmarkEnd w:id="73"/>
+    <w:bookmarkStart w:id="74" w:name="phase-3---deploy-agents-and-connectors"/>
     <w:p>
       <w:pPr>
         <w:pStyle w:val="Heading3"/>
@@ -7139,7 +7353,7 @@
         <w:pStyle w:val="Compact"/>
         <w:numPr>
           <w:ilvl w:val="0"/>
-          <w:numId w:val="1012"/>
+          <w:numId w:val="1013"/>
         </w:numPr>
       </w:pPr>
       <w:r>
@@ -7151,7 +7365,7 @@
         <w:pStyle w:val="Compact"/>
         <w:numPr>
           <w:ilvl w:val="0"/>
-          <w:numId w:val="1012"/>
+          <w:numId w:val="1013"/>
         </w:numPr>
       </w:pPr>
       <w:r>
@@ -7163,7 +7377,7 @@
         <w:pStyle w:val="Compact"/>
         <w:numPr>
           <w:ilvl w:val="0"/>
-          <w:numId w:val="1012"/>
+          <w:numId w:val="1013"/>
         </w:numPr>
       </w:pPr>
       <w:r>
@@ -7175,7 +7389,7 @@
         <w:pStyle w:val="Compact"/>
         <w:numPr>
           <w:ilvl w:val="0"/>
-          <w:numId w:val="1012"/>
+          <w:numId w:val="1013"/>
         </w:numPr>
       </w:pPr>
       <w:r>
@@ -7187,7 +7401,7 @@
         <w:pStyle w:val="Compact"/>
         <w:numPr>
           <w:ilvl w:val="0"/>
-          <w:numId w:val="1012"/>
+          <w:numId w:val="1013"/>
         </w:numPr>
       </w:pPr>
       <w:r>
@@ -7199,7 +7413,7 @@
         <w:pStyle w:val="Compact"/>
         <w:numPr>
           <w:ilvl w:val="0"/>
-          <w:numId w:val="1012"/>
+          <w:numId w:val="1013"/>
         </w:numPr>
       </w:pPr>
       <w:r>
@@ -7231,8 +7445,8 @@
         </w:pict>
       </w:r>
     </w:p>
-    <w:bookmarkEnd w:id="72"/>
-    <w:bookmarkStart w:id="73" w:name="X85d4e4be5891f720f2552e26364a87ec66b02af"/>
+    <w:bookmarkEnd w:id="74"/>
+    <w:bookmarkStart w:id="75" w:name="X85d4e4be5891f720f2552e26364a87ec66b02af"/>
     <w:p>
       <w:pPr>
         <w:pStyle w:val="Heading3"/>
@@ -7276,7 +7490,7 @@
         <w:pStyle w:val="Compact"/>
         <w:numPr>
           <w:ilvl w:val="0"/>
-          <w:numId w:val="1013"/>
+          <w:numId w:val="1014"/>
         </w:numPr>
       </w:pPr>
       <w:r>
@@ -7288,7 +7502,7 @@
         <w:pStyle w:val="Compact"/>
         <w:numPr>
           <w:ilvl w:val="0"/>
-          <w:numId w:val="1013"/>
+          <w:numId w:val="1014"/>
         </w:numPr>
       </w:pPr>
       <w:r>
@@ -7300,7 +7514,7 @@
         <w:pStyle w:val="Compact"/>
         <w:numPr>
           <w:ilvl w:val="0"/>
-          <w:numId w:val="1013"/>
+          <w:numId w:val="1014"/>
         </w:numPr>
       </w:pPr>
       <w:r>
@@ -7312,7 +7526,7 @@
         <w:pStyle w:val="Compact"/>
         <w:numPr>
           <w:ilvl w:val="0"/>
-          <w:numId w:val="1013"/>
+          <w:numId w:val="1014"/>
         </w:numPr>
       </w:pPr>
       <w:r>
@@ -7324,7 +7538,7 @@
         <w:pStyle w:val="Compact"/>
         <w:numPr>
           <w:ilvl w:val="0"/>
-          <w:numId w:val="1013"/>
+          <w:numId w:val="1014"/>
         </w:numPr>
       </w:pPr>
       <w:r>
@@ -7336,7 +7550,7 @@
         <w:pStyle w:val="Compact"/>
         <w:numPr>
           <w:ilvl w:val="0"/>
-          <w:numId w:val="1013"/>
+          <w:numId w:val="1014"/>
         </w:numPr>
       </w:pPr>
       <w:r>
@@ -7368,8 +7582,8 @@
         </w:pict>
       </w:r>
     </w:p>
-    <w:bookmarkEnd w:id="73"/>
-    <w:bookmarkStart w:id="74" w:name="phase-5---model-policy"/>
+    <w:bookmarkEnd w:id="75"/>
+    <w:bookmarkStart w:id="76" w:name="phase-5---model-policy"/>
     <w:p>
       <w:pPr>
         <w:pStyle w:val="Heading3"/>
@@ -7413,7 +7627,7 @@
         <w:pStyle w:val="Compact"/>
         <w:numPr>
           <w:ilvl w:val="0"/>
-          <w:numId w:val="1014"/>
+          <w:numId w:val="1015"/>
         </w:numPr>
       </w:pPr>
       <w:r>
@@ -7425,7 +7639,7 @@
         <w:pStyle w:val="Compact"/>
         <w:numPr>
           <w:ilvl w:val="0"/>
-          <w:numId w:val="1014"/>
+          <w:numId w:val="1015"/>
         </w:numPr>
       </w:pPr>
       <w:r>
@@ -7437,7 +7651,7 @@
         <w:pStyle w:val="Compact"/>
         <w:numPr>
           <w:ilvl w:val="0"/>
-          <w:numId w:val="1014"/>
+          <w:numId w:val="1015"/>
         </w:numPr>
       </w:pPr>
       <w:r>
@@ -7449,7 +7663,7 @@
         <w:pStyle w:val="Compact"/>
         <w:numPr>
           <w:ilvl w:val="0"/>
-          <w:numId w:val="1014"/>
+          <w:numId w:val="1015"/>
         </w:numPr>
       </w:pPr>
       <w:r>
@@ -7461,7 +7675,7 @@
         <w:pStyle w:val="Compact"/>
         <w:numPr>
           <w:ilvl w:val="0"/>
-          <w:numId w:val="1014"/>
+          <w:numId w:val="1015"/>
         </w:numPr>
       </w:pPr>
       <w:r>
@@ -7473,7 +7687,7 @@
         <w:pStyle w:val="Compact"/>
         <w:numPr>
           <w:ilvl w:val="0"/>
-          <w:numId w:val="1014"/>
+          <w:numId w:val="1015"/>
         </w:numPr>
       </w:pPr>
       <w:r>
@@ -7505,8 +7719,8 @@
         </w:pict>
       </w:r>
     </w:p>
-    <w:bookmarkEnd w:id="74"/>
-    <w:bookmarkStart w:id="75" w:name="phase-6---start-in-monitor-mode"/>
+    <w:bookmarkEnd w:id="76"/>
+    <w:bookmarkStart w:id="77" w:name="phase-6---start-in-monitor-mode"/>
     <w:p>
       <w:pPr>
         <w:pStyle w:val="Heading3"/>
@@ -7550,7 +7764,7 @@
         <w:pStyle w:val="Compact"/>
         <w:numPr>
           <w:ilvl w:val="0"/>
-          <w:numId w:val="1015"/>
+          <w:numId w:val="1016"/>
         </w:numPr>
       </w:pPr>
       <w:r>
@@ -7562,7 +7776,7 @@
         <w:pStyle w:val="Compact"/>
         <w:numPr>
           <w:ilvl w:val="0"/>
-          <w:numId w:val="1015"/>
+          <w:numId w:val="1016"/>
         </w:numPr>
       </w:pPr>
       <w:r>
@@ -7574,7 +7788,7 @@
         <w:pStyle w:val="Compact"/>
         <w:numPr>
           <w:ilvl w:val="0"/>
-          <w:numId w:val="1015"/>
+          <w:numId w:val="1016"/>
         </w:numPr>
       </w:pPr>
       <w:r>
@@ -7586,7 +7800,7 @@
         <w:pStyle w:val="Compact"/>
         <w:numPr>
           <w:ilvl w:val="0"/>
-          <w:numId w:val="1015"/>
+          <w:numId w:val="1016"/>
         </w:numPr>
       </w:pPr>
       <w:r>
@@ -7598,7 +7812,7 @@
         <w:pStyle w:val="Compact"/>
         <w:numPr>
           <w:ilvl w:val="0"/>
-          <w:numId w:val="1015"/>
+          <w:numId w:val="1016"/>
         </w:numPr>
       </w:pPr>
       <w:r>
@@ -7630,8 +7844,8 @@
         </w:pict>
       </w:r>
     </w:p>
-    <w:bookmarkEnd w:id="75"/>
-    <w:bookmarkStart w:id="76" w:name="phase-7---enforce-in-a-controlled-scope"/>
+    <w:bookmarkEnd w:id="77"/>
+    <w:bookmarkStart w:id="78" w:name="phase-7---enforce-in-a-controlled-scope"/>
     <w:p>
       <w:pPr>
         <w:pStyle w:val="Heading3"/>
@@ -7675,7 +7889,7 @@
         <w:pStyle w:val="Compact"/>
         <w:numPr>
           <w:ilvl w:val="0"/>
-          <w:numId w:val="1016"/>
+          <w:numId w:val="1017"/>
         </w:numPr>
       </w:pPr>
       <w:r>
@@ -7687,7 +7901,7 @@
         <w:pStyle w:val="Compact"/>
         <w:numPr>
           <w:ilvl w:val="0"/>
-          <w:numId w:val="1016"/>
+          <w:numId w:val="1017"/>
         </w:numPr>
       </w:pPr>
       <w:r>
@@ -7699,7 +7913,7 @@
         <w:pStyle w:val="Compact"/>
         <w:numPr>
           <w:ilvl w:val="0"/>
-          <w:numId w:val="1016"/>
+          <w:numId w:val="1017"/>
         </w:numPr>
       </w:pPr>
       <w:r>
@@ -7711,7 +7925,7 @@
         <w:pStyle w:val="Compact"/>
         <w:numPr>
           <w:ilvl w:val="0"/>
-          <w:numId w:val="1016"/>
+          <w:numId w:val="1017"/>
         </w:numPr>
       </w:pPr>
       <w:r>
@@ -7723,7 +7937,7 @@
         <w:pStyle w:val="Compact"/>
         <w:numPr>
           <w:ilvl w:val="0"/>
-          <w:numId w:val="1016"/>
+          <w:numId w:val="1017"/>
         </w:numPr>
       </w:pPr>
       <w:r>
@@ -7735,7 +7949,7 @@
         <w:pStyle w:val="Compact"/>
         <w:numPr>
           <w:ilvl w:val="0"/>
-          <w:numId w:val="1016"/>
+          <w:numId w:val="1017"/>
         </w:numPr>
       </w:pPr>
       <w:r>
@@ -7747,7 +7961,7 @@
         <w:pStyle w:val="Compact"/>
         <w:numPr>
           <w:ilvl w:val="0"/>
-          <w:numId w:val="1016"/>
+          <w:numId w:val="1017"/>
         </w:numPr>
       </w:pPr>
       <w:r>
@@ -7759,7 +7973,7 @@
         <w:pStyle w:val="Compact"/>
         <w:numPr>
           <w:ilvl w:val="0"/>
-          <w:numId w:val="1016"/>
+          <w:numId w:val="1017"/>
         </w:numPr>
       </w:pPr>
       <w:r>
@@ -7791,8 +8005,8 @@
         </w:pict>
       </w:r>
     </w:p>
-    <w:bookmarkEnd w:id="76"/>
-    <w:bookmarkStart w:id="77" w:name="phase-8---operationalize"/>
+    <w:bookmarkEnd w:id="78"/>
+    <w:bookmarkStart w:id="79" w:name="phase-8---operationalize"/>
     <w:p>
       <w:pPr>
         <w:pStyle w:val="Heading3"/>
@@ -7836,7 +8050,7 @@
         <w:pStyle w:val="Compact"/>
         <w:numPr>
           <w:ilvl w:val="0"/>
-          <w:numId w:val="1017"/>
+          <w:numId w:val="1018"/>
         </w:numPr>
       </w:pPr>
       <w:r>
@@ -7848,7 +8062,7 @@
         <w:pStyle w:val="Compact"/>
         <w:numPr>
           <w:ilvl w:val="0"/>
-          <w:numId w:val="1017"/>
+          <w:numId w:val="1018"/>
         </w:numPr>
       </w:pPr>
       <w:r>
@@ -7860,7 +8074,7 @@
         <w:pStyle w:val="Compact"/>
         <w:numPr>
           <w:ilvl w:val="0"/>
-          <w:numId w:val="1017"/>
+          <w:numId w:val="1018"/>
         </w:numPr>
       </w:pPr>
       <w:r>
@@ -7872,7 +8086,7 @@
         <w:pStyle w:val="Compact"/>
         <w:numPr>
           <w:ilvl w:val="0"/>
-          <w:numId w:val="1017"/>
+          <w:numId w:val="1018"/>
         </w:numPr>
       </w:pPr>
       <w:r>
@@ -7884,7 +8098,7 @@
         <w:pStyle w:val="Compact"/>
         <w:numPr>
           <w:ilvl w:val="0"/>
-          <w:numId w:val="1017"/>
+          <w:numId w:val="1018"/>
         </w:numPr>
       </w:pPr>
       <w:r>
@@ -7906,7 +8120,7 @@
         <w:pStyle w:val="Compact"/>
         <w:numPr>
           <w:ilvl w:val="0"/>
-          <w:numId w:val="1017"/>
+          <w:numId w:val="1018"/>
         </w:numPr>
       </w:pPr>
       <w:r>
@@ -7918,7 +8132,7 @@
         <w:pStyle w:val="Compact"/>
         <w:numPr>
           <w:ilvl w:val="0"/>
-          <w:numId w:val="1017"/>
+          <w:numId w:val="1018"/>
         </w:numPr>
       </w:pPr>
       <w:r>
@@ -7950,9 +8164,9 @@
         </w:pict>
       </w:r>
     </w:p>
-    <w:bookmarkEnd w:id="77"/>
-    <w:bookmarkEnd w:id="78"/>
-    <w:bookmarkStart w:id="79" w:name="X67792f16bd81b6e95001d9627ef1e2127c941c5"/>
+    <w:bookmarkEnd w:id="79"/>
+    <w:bookmarkEnd w:id="80"/>
+    <w:bookmarkStart w:id="81" w:name="X67792f16bd81b6e95001d9627ef1e2127c941c5"/>
     <w:p>
       <w:pPr>
         <w:pStyle w:val="Heading2"/>
@@ -7974,7 +8188,7 @@
         <w:pStyle w:val="Compact"/>
         <w:numPr>
           <w:ilvl w:val="0"/>
-          <w:numId w:val="1018"/>
+          <w:numId w:val="1019"/>
         </w:numPr>
       </w:pPr>
       <w:r>
@@ -7986,7 +8200,7 @@
         <w:pStyle w:val="Compact"/>
         <w:numPr>
           <w:ilvl w:val="0"/>
-          <w:numId w:val="1018"/>
+          <w:numId w:val="1019"/>
         </w:numPr>
       </w:pPr>
       <w:r>
@@ -7998,7 +8212,7 @@
         <w:pStyle w:val="Compact"/>
         <w:numPr>
           <w:ilvl w:val="0"/>
-          <w:numId w:val="1018"/>
+          <w:numId w:val="1019"/>
         </w:numPr>
       </w:pPr>
       <w:r>
@@ -8010,7 +8224,7 @@
         <w:pStyle w:val="Compact"/>
         <w:numPr>
           <w:ilvl w:val="0"/>
-          <w:numId w:val="1018"/>
+          <w:numId w:val="1019"/>
         </w:numPr>
       </w:pPr>
       <w:r>
@@ -8022,7 +8236,7 @@
         <w:pStyle w:val="Compact"/>
         <w:numPr>
           <w:ilvl w:val="0"/>
-          <w:numId w:val="1018"/>
+          <w:numId w:val="1019"/>
         </w:numPr>
       </w:pPr>
       <w:r>
@@ -8034,7 +8248,7 @@
         <w:pStyle w:val="Compact"/>
         <w:numPr>
           <w:ilvl w:val="0"/>
-          <w:numId w:val="1018"/>
+          <w:numId w:val="1019"/>
         </w:numPr>
       </w:pPr>
       <w:r>
@@ -8046,7 +8260,7 @@
         <w:pStyle w:val="Compact"/>
         <w:numPr>
           <w:ilvl w:val="0"/>
-          <w:numId w:val="1018"/>
+          <w:numId w:val="1019"/>
         </w:numPr>
       </w:pPr>
       <w:r>
@@ -8058,7 +8272,7 @@
         <w:pStyle w:val="Compact"/>
         <w:numPr>
           <w:ilvl w:val="0"/>
-          <w:numId w:val="1018"/>
+          <w:numId w:val="1019"/>
         </w:numPr>
       </w:pPr>
       <w:r>
@@ -8070,7 +8284,7 @@
         <w:pStyle w:val="Compact"/>
         <w:numPr>
           <w:ilvl w:val="0"/>
-          <w:numId w:val="1018"/>
+          <w:numId w:val="1019"/>
         </w:numPr>
       </w:pPr>
       <w:r>
@@ -8082,7 +8296,7 @@
         <w:pStyle w:val="Compact"/>
         <w:numPr>
           <w:ilvl w:val="0"/>
-          <w:numId w:val="1018"/>
+          <w:numId w:val="1019"/>
         </w:numPr>
       </w:pPr>
       <w:r>
@@ -8094,7 +8308,7 @@
         <w:pStyle w:val="Compact"/>
         <w:numPr>
           <w:ilvl w:val="0"/>
-          <w:numId w:val="1018"/>
+          <w:numId w:val="1019"/>
         </w:numPr>
       </w:pPr>
       <w:r>
@@ -8106,7 +8320,7 @@
         <w:pStyle w:val="Compact"/>
         <w:numPr>
           <w:ilvl w:val="0"/>
-          <w:numId w:val="1018"/>
+          <w:numId w:val="1019"/>
         </w:numPr>
       </w:pPr>
       <w:r>
@@ -8128,7 +8342,7 @@
         <w:pStyle w:val="Compact"/>
         <w:numPr>
           <w:ilvl w:val="0"/>
-          <w:numId w:val="1018"/>
+          <w:numId w:val="1019"/>
         </w:numPr>
       </w:pPr>
       <w:r>
@@ -8140,7 +8354,7 @@
         <w:pStyle w:val="Compact"/>
         <w:numPr>
           <w:ilvl w:val="0"/>
-          <w:numId w:val="1018"/>
+          <w:numId w:val="1019"/>
         </w:numPr>
       </w:pPr>
       <w:r>
@@ -8152,7 +8366,7 @@
         <w:pStyle w:val="Compact"/>
         <w:numPr>
           <w:ilvl w:val="0"/>
-          <w:numId w:val="1018"/>
+          <w:numId w:val="1019"/>
         </w:numPr>
       </w:pPr>
       <w:r>
@@ -8166,8 +8380,8 @@
         </w:pict>
       </w:r>
     </w:p>
-    <w:bookmarkEnd w:id="79"/>
-    <w:bookmarkStart w:id="80" w:name="Xe3d4887c83d95160b9d75f09aebe5899dbbe065"/>
+    <w:bookmarkEnd w:id="81"/>
+    <w:bookmarkStart w:id="82" w:name="Xe3d4887c83d95160b9d75f09aebe5899dbbe065"/>
     <w:p>
       <w:pPr>
         <w:pStyle w:val="Heading2"/>
@@ -8605,8 +8819,8 @@
         </w:pict>
       </w:r>
     </w:p>
-    <w:bookmarkEnd w:id="80"/>
-    <w:bookmarkStart w:id="81" w:name="X3a0851872a13412add7784181f5bc7c74c6084b"/>
+    <w:bookmarkEnd w:id="82"/>
+    <w:bookmarkStart w:id="83" w:name="X3a0851872a13412add7784181f5bc7c74c6084b"/>
     <w:p>
       <w:pPr>
         <w:pStyle w:val="Heading2"/>
@@ -8828,8 +9042,8 @@
         </w:pict>
       </w:r>
     </w:p>
-    <w:bookmarkEnd w:id="81"/>
-    <w:bookmarkStart w:id="82" w:name="Xfed9d69b88147d94e8bc0dfd5dae9f34760df84"/>
+    <w:bookmarkEnd w:id="83"/>
+    <w:bookmarkStart w:id="84" w:name="Xfed9d69b88147d94e8bc0dfd5dae9f34760df84"/>
     <w:p>
       <w:pPr>
         <w:pStyle w:val="Heading2"/>
@@ -8851,7 +9065,7 @@
         <w:pStyle w:val="Compact"/>
         <w:numPr>
           <w:ilvl w:val="0"/>
-          <w:numId w:val="1019"/>
+          <w:numId w:val="1020"/>
         </w:numPr>
       </w:pPr>
       <w:r>
@@ -8873,7 +9087,7 @@
         <w:pStyle w:val="Compact"/>
         <w:numPr>
           <w:ilvl w:val="0"/>
-          <w:numId w:val="1019"/>
+          <w:numId w:val="1020"/>
         </w:numPr>
       </w:pPr>
       <w:r>
@@ -8895,7 +9109,7 @@
         <w:pStyle w:val="Compact"/>
         <w:numPr>
           <w:ilvl w:val="0"/>
-          <w:numId w:val="1019"/>
+          <w:numId w:val="1020"/>
         </w:numPr>
       </w:pPr>
       <w:r>
@@ -8917,7 +9131,7 @@
         <w:pStyle w:val="Compact"/>
         <w:numPr>
           <w:ilvl w:val="0"/>
-          <w:numId w:val="1019"/>
+          <w:numId w:val="1020"/>
         </w:numPr>
       </w:pPr>
       <w:r>
@@ -8939,7 +9153,7 @@
         <w:pStyle w:val="Compact"/>
         <w:numPr>
           <w:ilvl w:val="0"/>
-          <w:numId w:val="1019"/>
+          <w:numId w:val="1020"/>
         </w:numPr>
       </w:pPr>
       <w:r>
@@ -8963,8 +9177,8 @@
         </w:pict>
       </w:r>
     </w:p>
-    <w:bookmarkEnd w:id="82"/>
-    <w:bookmarkStart w:id="86" w:name="X79e47e825b80098b108f07de62e27975790b823"/>
+    <w:bookmarkEnd w:id="84"/>
+    <w:bookmarkStart w:id="88" w:name="X79e47e825b80098b108f07de62e27975790b823"/>
     <w:p>
       <w:pPr>
         <w:pStyle w:val="Heading2"/>
@@ -9025,7 +9239,7 @@
             <w:pPr>
               <w:pStyle w:val="Compact"/>
             </w:pPr>
-            <w:hyperlink r:id="rId83">
+            <w:hyperlink r:id="rId85">
               <w:r>
                 <w:rPr>
                   <w:rStyle w:val="Hyperlink"/>
@@ -9054,7 +9268,7 @@
             <w:pPr>
               <w:pStyle w:val="Compact"/>
             </w:pPr>
-            <w:hyperlink r:id="rId84">
+            <w:hyperlink r:id="rId86">
               <w:r>
                 <w:rPr>
                   <w:rStyle w:val="Hyperlink"/>
@@ -9083,7 +9297,7 @@
             <w:pPr>
               <w:pStyle w:val="Compact"/>
             </w:pPr>
-            <w:hyperlink r:id="rId13">
+            <w:hyperlink r:id="rId14">
               <w:r>
                 <w:rPr>
                   <w:rStyle w:val="Hyperlink"/>
@@ -9132,7 +9346,7 @@
       <w:r>
         <w:t xml:space="preserve"> </w:t>
       </w:r>
-      <w:hyperlink r:id="rId85">
+      <w:hyperlink r:id="rId87">
         <w:r>
           <w:rPr>
             <w:rStyle w:val="Hyperlink"/>
@@ -9151,66 +9365,8 @@
         </w:pict>
       </w:r>
     </w:p>
-    <w:bookmarkEnd w:id="86"/>
-    <w:bookmarkStart w:id="87" w:name="X9d787da5f4507c4c8cca7b52a976cd3e73e44fc"/>
-    <w:p>
-      <w:pPr>
-        <w:pStyle w:val="Heading2"/>
-      </w:pPr>
-      <w:r>
-        <w:t xml:space="preserve">14. Open Items Before Publishing Final Version</w:t>
-      </w:r>
-    </w:p>
-    <w:p>
-      <w:pPr>
-        <w:pStyle w:val="Compact"/>
-        <w:numPr>
-          <w:ilvl w:val="0"/>
-          <w:numId w:val="1020"/>
-        </w:numPr>
-      </w:pPr>
-      <w:r>
-        <w:t xml:space="preserve">Confirm whether this repo should be public, private, or internal-only.</w:t>
-      </w:r>
-    </w:p>
-    <w:p>
-      <w:pPr>
-        <w:pStyle w:val="Compact"/>
-        <w:numPr>
-          <w:ilvl w:val="0"/>
-          <w:numId w:val="1020"/>
-        </w:numPr>
-      </w:pPr>
-      <w:r>
-        <w:t xml:space="preserve">Confirm whether customer-specific examples should be removed or kept generic.</w:t>
-      </w:r>
-    </w:p>
-    <w:p>
-      <w:pPr>
-        <w:pStyle w:val="Compact"/>
-        <w:numPr>
-          <w:ilvl w:val="0"/>
-          <w:numId w:val="1020"/>
-        </w:numPr>
-      </w:pPr>
-      <w:r>
-        <w:t xml:space="preserve">Add official Cisco documentation links for the final user education version.</w:t>
-      </w:r>
-    </w:p>
-    <w:p>
-      <w:pPr>
-        <w:pStyle w:val="Compact"/>
-        <w:numPr>
-          <w:ilvl w:val="0"/>
-          <w:numId w:val="1020"/>
-        </w:numPr>
-      </w:pPr>
-      <w:r>
-        <w:t xml:space="preserve">Validate current release-specific support matrices before presenting platform coverage.</w:t>
-      </w:r>
-    </w:p>
-    <w:bookmarkEnd w:id="87"/>
     <w:bookmarkEnd w:id="88"/>
+    <w:bookmarkEnd w:id="89"/>
     <w:sectPr>
       <w:footnotePr>
         <w:numRestart w:val="eachSect"/>
@@ -9543,6 +9699,9 @@
     </w:lvlOverride>
   </w:num>
   <w:num w:numId="1002">
+    <w:abstractNumId w:val="991"/>
+  </w:num>
+  <w:num w:numId="1003">
     <w:abstractNumId w:val="99411"/>
     <w:lvlOverride w:ilvl="0">
       <w:startOverride w:val="1"/>
@@ -9571,9 +9730,6 @@
     <w:lvlOverride w:ilvl="8">
       <w:startOverride w:val="1"/>
     </w:lvlOverride>
-  </w:num>
-  <w:num w:numId="1003">
-    <w:abstractNumId w:val="991"/>
   </w:num>
   <w:num w:numId="1004">
     <w:abstractNumId w:val="991"/>
@@ -9588,6 +9744,9 @@
     <w:abstractNumId w:val="991"/>
   </w:num>
   <w:num w:numId="1008">
+    <w:abstractNumId w:val="991"/>
+  </w:num>
+  <w:num w:numId="1009">
     <w:abstractNumId w:val="99411"/>
     <w:lvlOverride w:ilvl="0">
       <w:startOverride w:val="1"/>
@@ -9617,38 +9776,8 @@
       <w:startOverride w:val="1"/>
     </w:lvlOverride>
   </w:num>
-  <w:num w:numId="1009">
+  <w:num w:numId="1010">
     <w:abstractNumId w:val="991"/>
-  </w:num>
-  <w:num w:numId="1010">
-    <w:abstractNumId w:val="99411"/>
-    <w:lvlOverride w:ilvl="0">
-      <w:startOverride w:val="1"/>
-    </w:lvlOverride>
-    <w:lvlOverride w:ilvl="1">
-      <w:startOverride w:val="1"/>
-    </w:lvlOverride>
-    <w:lvlOverride w:ilvl="2">
-      <w:startOverride w:val="1"/>
-    </w:lvlOverride>
-    <w:lvlOverride w:ilvl="3">
-      <w:startOverride w:val="1"/>
-    </w:lvlOverride>
-    <w:lvlOverride w:ilvl="4">
-      <w:startOverride w:val="1"/>
-    </w:lvlOverride>
-    <w:lvlOverride w:ilvl="5">
-      <w:startOverride w:val="1"/>
-    </w:lvlOverride>
-    <w:lvlOverride w:ilvl="6">
-      <w:startOverride w:val="1"/>
-    </w:lvlOverride>
-    <w:lvlOverride w:ilvl="7">
-      <w:startOverride w:val="1"/>
-    </w:lvlOverride>
-    <w:lvlOverride w:ilvl="8">
-      <w:startOverride w:val="1"/>
-    </w:lvlOverride>
   </w:num>
   <w:num w:numId="1011">
     <w:abstractNumId w:val="99411"/>

</xml_diff>

<commit_message>
docs: remove outdated 2019 WFP Design document
Delete WFP-Design.docx and remove README/guide references. Regenerate
guide PDF and DOCX artifacts.

Co-authored-by: Cursor <cursoragent@cursor.com>
</commit_message>
<xml_diff>
--- a/docs/user-education/CSW-User-Education-Guide.docx
+++ b/docs/user-education/CSW-User-Education-Guide.docx
@@ -60,7 +60,7 @@
         </w:p>
       </w:sdtContent>
     </w:sdt>
-    <w:bookmarkStart w:id="89" w:name="X92ee979ebdbb38d988228e1ce971d57f1b349ff"/>
+    <w:bookmarkStart w:id="88" w:name="X92ee979ebdbb38d988228e1ce971d57f1b349ff"/>
     <w:p>
       <w:pPr>
         <w:pStyle w:val="Heading1"/>
@@ -2558,7 +2558,7 @@
     </w:p>
     <w:bookmarkEnd w:id="19"/>
     <w:bookmarkEnd w:id="20"/>
-    <w:bookmarkStart w:id="66" w:name="X34388d678d45029f6ea868320ccc3fef24f0f73"/>
+    <w:bookmarkStart w:id="65" w:name="X34388d678d45029f6ea868320ccc3fef24f0f73"/>
     <w:p>
       <w:pPr>
         <w:pStyle w:val="Heading2"/>
@@ -2889,7 +2889,7 @@
       </w:tr>
     </w:tbl>
     <w:bookmarkEnd w:id="24"/>
-    <w:bookmarkStart w:id="28" w:name="X27b0b3246bd0221bf109cd41cf29e8955f4a5a1"/>
+    <w:bookmarkStart w:id="27" w:name="X27b0b3246bd0221bf109cd41cf29e8955f4a5a1"/>
     <w:p>
       <w:pPr>
         <w:pStyle w:val="Heading3"/>
@@ -3115,37 +3115,8 @@
         </w:tc>
       </w:tr>
     </w:tbl>
-    <w:p>
-      <w:pPr>
-        <w:pStyle w:val="BodyText"/>
-      </w:pPr>
-      <w:r>
-        <w:rPr>
-          <w:b/>
-          <w:bCs/>
-        </w:rPr>
-        <w:t xml:space="preserve">Reference — Windows policy enforcement (WFP):</w:t>
-      </w:r>
-      <w:r>
-        <w:t xml:space="preserve"> </w:t>
-      </w:r>
-      <w:hyperlink r:id="rId27">
-        <w:r>
-          <w:rPr>
-            <w:rStyle w:val="VerbatimChar"/>
-          </w:rPr>
-          <w:t xml:space="preserve">WFP-Design.docx</w:t>
-        </w:r>
-      </w:hyperlink>
-      <w:r>
-        <w:t xml:space="preserve"> </w:t>
-      </w:r>
-      <w:r>
-        <w:t xml:space="preserve">— Windows Filtering Platform design; how the CSW agent enforces host policy on Windows workloads.</w:t>
-      </w:r>
-    </w:p>
-    <w:bookmarkEnd w:id="28"/>
-    <w:bookmarkStart w:id="34" w:name="Xf8e5d935e4719b8ec583b58485ced48d95037fb"/>
+    <w:bookmarkEnd w:id="27"/>
+    <w:bookmarkStart w:id="33" w:name="Xf8e5d935e4719b8ec583b58485ced48d95037fb"/>
     <w:p>
       <w:pPr>
         <w:pStyle w:val="Heading3"/>
@@ -3284,6 +3255,71 @@
               <w:pStyle w:val="Compact"/>
               <w:jc w:val="center"/>
             </w:pPr>
+            <w:hyperlink r:id="rId28">
+              <w:r>
+                <w:rPr>
+                  <w:rStyle w:val="Hyperlink"/>
+                </w:rPr>
+                <w:t xml:space="preserve">Watch</w:t>
+              </w:r>
+            </w:hyperlink>
+          </w:p>
+        </w:tc>
+      </w:tr>
+      <w:tr>
+        <w:tc>
+          <w:tcPr/>
+          <w:p>
+            <w:pPr>
+              <w:pStyle w:val="Compact"/>
+              <w:jc w:val="center"/>
+            </w:pPr>
+            <w:r>
+              <w:t xml:space="preserve">7</w:t>
+            </w:r>
+          </w:p>
+        </w:tc>
+        <w:tc>
+          <w:tcPr/>
+          <w:p>
+            <w:pPr>
+              <w:pStyle w:val="Compact"/>
+              <w:jc w:val="right"/>
+            </w:pPr>
+            <w:r>
+              <w:t xml:space="preserve">10</w:t>
+            </w:r>
+          </w:p>
+        </w:tc>
+        <w:tc>
+          <w:tcPr/>
+          <w:p>
+            <w:pPr>
+              <w:pStyle w:val="Compact"/>
+            </w:pPr>
+            <w:r>
+              <w:t xml:space="preserve">Flow Analysis</w:t>
+            </w:r>
+          </w:p>
+        </w:tc>
+        <w:tc>
+          <w:tcPr/>
+          <w:p>
+            <w:pPr>
+              <w:pStyle w:val="Compact"/>
+            </w:pPr>
+            <w:r>
+              <w:t xml:space="preserve">Traffic patterns and anomalies.</w:t>
+            </w:r>
+          </w:p>
+        </w:tc>
+        <w:tc>
+          <w:tcPr/>
+          <w:p>
+            <w:pPr>
+              <w:pStyle w:val="Compact"/>
+              <w:jc w:val="center"/>
+            </w:pPr>
             <w:hyperlink r:id="rId29">
               <w:r>
                 <w:rPr>
@@ -3304,6 +3340,18 @@
               <w:jc w:val="center"/>
             </w:pPr>
             <w:r>
+              <w:t xml:space="preserve">8</w:t>
+            </w:r>
+          </w:p>
+        </w:tc>
+        <w:tc>
+          <w:tcPr/>
+          <w:p>
+            <w:pPr>
+              <w:pStyle w:val="Compact"/>
+              <w:jc w:val="right"/>
+            </w:pPr>
+            <w:r>
               <w:t xml:space="preserve">7</w:t>
             </w:r>
           </w:p>
@@ -3313,32 +3361,20 @@
           <w:p>
             <w:pPr>
               <w:pStyle w:val="Compact"/>
-              <w:jc w:val="right"/>
-            </w:pPr>
-            <w:r>
-              <w:t xml:space="preserve">10</w:t>
-            </w:r>
-          </w:p>
-        </w:tc>
-        <w:tc>
-          <w:tcPr/>
-          <w:p>
-            <w:pPr>
-              <w:pStyle w:val="Compact"/>
-            </w:pPr>
-            <w:r>
-              <w:t xml:space="preserve">Flow Analysis</w:t>
-            </w:r>
-          </w:p>
-        </w:tc>
-        <w:tc>
-          <w:tcPr/>
-          <w:p>
-            <w:pPr>
-              <w:pStyle w:val="Compact"/>
-            </w:pPr>
-            <w:r>
-              <w:t xml:space="preserve">Traffic patterns and anomalies.</w:t>
+            </w:pPr>
+            <w:r>
+              <w:t xml:space="preserve">Application Dependency Mapping &amp; Policy Analysis</w:t>
+            </w:r>
+          </w:p>
+        </w:tc>
+        <w:tc>
+          <w:tcPr/>
+          <w:p>
+            <w:pPr>
+              <w:pStyle w:val="Compact"/>
+            </w:pPr>
+            <w:r>
+              <w:t xml:space="preserve">ADM and policy derivation.</w:t>
             </w:r>
           </w:p>
         </w:tc>
@@ -3369,7 +3405,7 @@
               <w:jc w:val="center"/>
             </w:pPr>
             <w:r>
-              <w:t xml:space="preserve">8</w:t>
+              <w:t xml:space="preserve">9</w:t>
             </w:r>
           </w:p>
         </w:tc>
@@ -3381,29 +3417,29 @@
               <w:jc w:val="right"/>
             </w:pPr>
             <w:r>
-              <w:t xml:space="preserve">7</w:t>
-            </w:r>
-          </w:p>
-        </w:tc>
-        <w:tc>
-          <w:tcPr/>
-          <w:p>
-            <w:pPr>
-              <w:pStyle w:val="Compact"/>
-            </w:pPr>
-            <w:r>
-              <w:t xml:space="preserve">Application Dependency Mapping &amp; Policy Analysis</w:t>
-            </w:r>
-          </w:p>
-        </w:tc>
-        <w:tc>
-          <w:tcPr/>
-          <w:p>
-            <w:pPr>
-              <w:pStyle w:val="Compact"/>
-            </w:pPr>
-            <w:r>
-              <w:t xml:space="preserve">ADM and policy derivation.</w:t>
+              <w:t xml:space="preserve">9</w:t>
+            </w:r>
+          </w:p>
+        </w:tc>
+        <w:tc>
+          <w:tcPr/>
+          <w:p>
+            <w:pPr>
+              <w:pStyle w:val="Compact"/>
+            </w:pPr>
+            <w:r>
+              <w:t xml:space="preserve">Dynamic Workloads &amp; Policy</w:t>
+            </w:r>
+          </w:p>
+        </w:tc>
+        <w:tc>
+          <w:tcPr/>
+          <w:p>
+            <w:pPr>
+              <w:pStyle w:val="Compact"/>
+            </w:pPr>
+            <w:r>
+              <w:t xml:space="preserve">Policy for moving/scaling workloads.</w:t>
             </w:r>
           </w:p>
         </w:tc>
@@ -3434,7 +3470,7 @@
               <w:jc w:val="center"/>
             </w:pPr>
             <w:r>
-              <w:t xml:space="preserve">9</w:t>
+              <w:t xml:space="preserve">10</w:t>
             </w:r>
           </w:p>
         </w:tc>
@@ -3446,29 +3482,29 @@
               <w:jc w:val="right"/>
             </w:pPr>
             <w:r>
-              <w:t xml:space="preserve">9</w:t>
-            </w:r>
-          </w:p>
-        </w:tc>
-        <w:tc>
-          <w:tcPr/>
-          <w:p>
-            <w:pPr>
-              <w:pStyle w:val="Compact"/>
-            </w:pPr>
-            <w:r>
-              <w:t xml:space="preserve">Dynamic Workloads &amp; Policy</w:t>
-            </w:r>
-          </w:p>
-        </w:tc>
-        <w:tc>
-          <w:tcPr/>
-          <w:p>
-            <w:pPr>
-              <w:pStyle w:val="Compact"/>
-            </w:pPr>
-            <w:r>
-              <w:t xml:space="preserve">Policy for moving/scaling workloads.</w:t>
+              <w:t xml:space="preserve">8</w:t>
+            </w:r>
+          </w:p>
+        </w:tc>
+        <w:tc>
+          <w:tcPr/>
+          <w:p>
+            <w:pPr>
+              <w:pStyle w:val="Compact"/>
+            </w:pPr>
+            <w:r>
+              <w:t xml:space="preserve">Policy Visual and Quick Analysis</w:t>
+            </w:r>
+          </w:p>
+        </w:tc>
+        <w:tc>
+          <w:tcPr/>
+          <w:p>
+            <w:pPr>
+              <w:pStyle w:val="Compact"/>
+            </w:pPr>
+            <w:r>
+              <w:t xml:space="preserve">Visualize policy impact.</w:t>
             </w:r>
           </w:p>
         </w:tc>
@@ -3490,74 +3526,9 @@
           </w:p>
         </w:tc>
       </w:tr>
-      <w:tr>
-        <w:tc>
-          <w:tcPr/>
-          <w:p>
-            <w:pPr>
-              <w:pStyle w:val="Compact"/>
-              <w:jc w:val="center"/>
-            </w:pPr>
-            <w:r>
-              <w:t xml:space="preserve">10</w:t>
-            </w:r>
-          </w:p>
-        </w:tc>
-        <w:tc>
-          <w:tcPr/>
-          <w:p>
-            <w:pPr>
-              <w:pStyle w:val="Compact"/>
-              <w:jc w:val="right"/>
-            </w:pPr>
-            <w:r>
-              <w:t xml:space="preserve">8</w:t>
-            </w:r>
-          </w:p>
-        </w:tc>
-        <w:tc>
-          <w:tcPr/>
-          <w:p>
-            <w:pPr>
-              <w:pStyle w:val="Compact"/>
-            </w:pPr>
-            <w:r>
-              <w:t xml:space="preserve">Policy Visual and Quick Analysis</w:t>
-            </w:r>
-          </w:p>
-        </w:tc>
-        <w:tc>
-          <w:tcPr/>
-          <w:p>
-            <w:pPr>
-              <w:pStyle w:val="Compact"/>
-            </w:pPr>
-            <w:r>
-              <w:t xml:space="preserve">Visualize policy impact.</w:t>
-            </w:r>
-          </w:p>
-        </w:tc>
-        <w:tc>
-          <w:tcPr/>
-          <w:p>
-            <w:pPr>
-              <w:pStyle w:val="Compact"/>
-              <w:jc w:val="center"/>
-            </w:pPr>
-            <w:hyperlink r:id="rId33">
-              <w:r>
-                <w:rPr>
-                  <w:rStyle w:val="Hyperlink"/>
-                </w:rPr>
-                <w:t xml:space="preserve">Watch</w:t>
-              </w:r>
-            </w:hyperlink>
-          </w:p>
-        </w:tc>
-      </w:tr>
     </w:tbl>
-    <w:bookmarkEnd w:id="34"/>
-    <w:bookmarkStart w:id="37" w:name="Xe08cf81caea7d0f53bf073b145c66d190f05ea7"/>
+    <w:bookmarkEnd w:id="33"/>
+    <w:bookmarkStart w:id="36" w:name="Xe08cf81caea7d0f53bf073b145c66d190f05ea7"/>
     <w:p>
       <w:pPr>
         <w:pStyle w:val="Heading3"/>
@@ -3696,6 +3667,71 @@
               <w:pStyle w:val="Compact"/>
               <w:jc w:val="center"/>
             </w:pPr>
+            <w:hyperlink r:id="rId34">
+              <w:r>
+                <w:rPr>
+                  <w:rStyle w:val="Hyperlink"/>
+                </w:rPr>
+                <w:t xml:space="preserve">Watch</w:t>
+              </w:r>
+            </w:hyperlink>
+          </w:p>
+        </w:tc>
+      </w:tr>
+      <w:tr>
+        <w:tc>
+          <w:tcPr/>
+          <w:p>
+            <w:pPr>
+              <w:pStyle w:val="Compact"/>
+              <w:jc w:val="center"/>
+            </w:pPr>
+            <w:r>
+              <w:t xml:space="preserve">12</w:t>
+            </w:r>
+          </w:p>
+        </w:tc>
+        <w:tc>
+          <w:tcPr/>
+          <w:p>
+            <w:pPr>
+              <w:pStyle w:val="Compact"/>
+              <w:jc w:val="right"/>
+            </w:pPr>
+            <w:r>
+              <w:t xml:space="preserve">34</w:t>
+            </w:r>
+          </w:p>
+        </w:tc>
+        <w:tc>
+          <w:tcPr/>
+          <w:p>
+            <w:pPr>
+              <w:pStyle w:val="Compact"/>
+            </w:pPr>
+            <w:r>
+              <w:t xml:space="preserve">Policy Statistics with AI Engine</w:t>
+            </w:r>
+          </w:p>
+        </w:tc>
+        <w:tc>
+          <w:tcPr/>
+          <w:p>
+            <w:pPr>
+              <w:pStyle w:val="Compact"/>
+            </w:pPr>
+            <w:r>
+              <w:t xml:space="preserve">Statistics and tuning at scale.</w:t>
+            </w:r>
+          </w:p>
+        </w:tc>
+        <w:tc>
+          <w:tcPr/>
+          <w:p>
+            <w:pPr>
+              <w:pStyle w:val="Compact"/>
+              <w:jc w:val="center"/>
+            </w:pPr>
             <w:hyperlink r:id="rId35">
               <w:r>
                 <w:rPr>
@@ -3707,74 +3743,9 @@
           </w:p>
         </w:tc>
       </w:tr>
-      <w:tr>
-        <w:tc>
-          <w:tcPr/>
-          <w:p>
-            <w:pPr>
-              <w:pStyle w:val="Compact"/>
-              <w:jc w:val="center"/>
-            </w:pPr>
-            <w:r>
-              <w:t xml:space="preserve">12</w:t>
-            </w:r>
-          </w:p>
-        </w:tc>
-        <w:tc>
-          <w:tcPr/>
-          <w:p>
-            <w:pPr>
-              <w:pStyle w:val="Compact"/>
-              <w:jc w:val="right"/>
-            </w:pPr>
-            <w:r>
-              <w:t xml:space="preserve">34</w:t>
-            </w:r>
-          </w:p>
-        </w:tc>
-        <w:tc>
-          <w:tcPr/>
-          <w:p>
-            <w:pPr>
-              <w:pStyle w:val="Compact"/>
-            </w:pPr>
-            <w:r>
-              <w:t xml:space="preserve">Policy Statistics with AI Engine</w:t>
-            </w:r>
-          </w:p>
-        </w:tc>
-        <w:tc>
-          <w:tcPr/>
-          <w:p>
-            <w:pPr>
-              <w:pStyle w:val="Compact"/>
-            </w:pPr>
-            <w:r>
-              <w:t xml:space="preserve">Statistics and tuning at scale.</w:t>
-            </w:r>
-          </w:p>
-        </w:tc>
-        <w:tc>
-          <w:tcPr/>
-          <w:p>
-            <w:pPr>
-              <w:pStyle w:val="Compact"/>
-              <w:jc w:val="center"/>
-            </w:pPr>
-            <w:hyperlink r:id="rId36">
-              <w:r>
-                <w:rPr>
-                  <w:rStyle w:val="Hyperlink"/>
-                </w:rPr>
-                <w:t xml:space="preserve">Watch</w:t>
-              </w:r>
-            </w:hyperlink>
-          </w:p>
-        </w:tc>
-      </w:tr>
     </w:tbl>
-    <w:bookmarkEnd w:id="37"/>
-    <w:bookmarkStart w:id="43" w:name="X8a788de5795d40d873f8a098801eb93b3a8b2cf"/>
+    <w:bookmarkEnd w:id="36"/>
+    <w:bookmarkStart w:id="42" w:name="X8a788de5795d40d873f8a098801eb93b3a8b2cf"/>
     <w:p>
       <w:pPr>
         <w:pStyle w:val="Heading3"/>
@@ -3913,6 +3884,71 @@
               <w:pStyle w:val="Compact"/>
               <w:jc w:val="center"/>
             </w:pPr>
+            <w:hyperlink r:id="rId37">
+              <w:r>
+                <w:rPr>
+                  <w:rStyle w:val="Hyperlink"/>
+                </w:rPr>
+                <w:t xml:space="preserve">Watch</w:t>
+              </w:r>
+            </w:hyperlink>
+          </w:p>
+        </w:tc>
+      </w:tr>
+      <w:tr>
+        <w:tc>
+          <w:tcPr/>
+          <w:p>
+            <w:pPr>
+              <w:pStyle w:val="Compact"/>
+              <w:jc w:val="center"/>
+            </w:pPr>
+            <w:r>
+              <w:t xml:space="preserve">14</w:t>
+            </w:r>
+          </w:p>
+        </w:tc>
+        <w:tc>
+          <w:tcPr/>
+          <w:p>
+            <w:pPr>
+              <w:pStyle w:val="Compact"/>
+              <w:jc w:val="right"/>
+            </w:pPr>
+            <w:r>
+              <w:t xml:space="preserve">11</w:t>
+            </w:r>
+          </w:p>
+        </w:tc>
+        <w:tc>
+          <w:tcPr/>
+          <w:p>
+            <w:pPr>
+              <w:pStyle w:val="Compact"/>
+            </w:pPr>
+            <w:r>
+              <w:t xml:space="preserve">Vulnerabilities and Risk Reduction</w:t>
+            </w:r>
+          </w:p>
+        </w:tc>
+        <w:tc>
+          <w:tcPr/>
+          <w:p>
+            <w:pPr>
+              <w:pStyle w:val="Compact"/>
+            </w:pPr>
+            <w:r>
+              <w:t xml:space="preserve">Vulnerable workload prioritization.</w:t>
+            </w:r>
+          </w:p>
+        </w:tc>
+        <w:tc>
+          <w:tcPr/>
+          <w:p>
+            <w:pPr>
+              <w:pStyle w:val="Compact"/>
+              <w:jc w:val="center"/>
+            </w:pPr>
             <w:hyperlink r:id="rId38">
               <w:r>
                 <w:rPr>
@@ -3933,7 +3969,7 @@
               <w:jc w:val="center"/>
             </w:pPr>
             <w:r>
-              <w:t xml:space="preserve">14</w:t>
+              <w:t xml:space="preserve">15</w:t>
             </w:r>
           </w:p>
         </w:tc>
@@ -3945,29 +3981,29 @@
               <w:jc w:val="right"/>
             </w:pPr>
             <w:r>
-              <w:t xml:space="preserve">11</w:t>
-            </w:r>
-          </w:p>
-        </w:tc>
-        <w:tc>
-          <w:tcPr/>
-          <w:p>
-            <w:pPr>
-              <w:pStyle w:val="Compact"/>
-            </w:pPr>
-            <w:r>
-              <w:t xml:space="preserve">Vulnerabilities and Risk Reduction</w:t>
-            </w:r>
-          </w:p>
-        </w:tc>
-        <w:tc>
-          <w:tcPr/>
-          <w:p>
-            <w:pPr>
-              <w:pStyle w:val="Compact"/>
-            </w:pPr>
-            <w:r>
-              <w:t xml:space="preserve">Vulnerable workload prioritization.</w:t>
+              <w:t xml:space="preserve">15</w:t>
+            </w:r>
+          </w:p>
+        </w:tc>
+        <w:tc>
+          <w:tcPr/>
+          <w:p>
+            <w:pPr>
+              <w:pStyle w:val="Compact"/>
+            </w:pPr>
+            <w:r>
+              <w:t xml:space="preserve">SSH Risk Reduction</w:t>
+            </w:r>
+          </w:p>
+        </w:tc>
+        <w:tc>
+          <w:tcPr/>
+          <w:p>
+            <w:pPr>
+              <w:pStyle w:val="Compact"/>
+            </w:pPr>
+            <w:r>
+              <w:t xml:space="preserve">Control SSH between workloads.</w:t>
             </w:r>
           </w:p>
         </w:tc>
@@ -3998,7 +4034,7 @@
               <w:jc w:val="center"/>
             </w:pPr>
             <w:r>
-              <w:t xml:space="preserve">15</w:t>
+              <w:t xml:space="preserve">16</w:t>
             </w:r>
           </w:p>
         </w:tc>
@@ -4010,29 +4046,29 @@
               <w:jc w:val="right"/>
             </w:pPr>
             <w:r>
-              <w:t xml:space="preserve">15</w:t>
-            </w:r>
-          </w:p>
-        </w:tc>
-        <w:tc>
-          <w:tcPr/>
-          <w:p>
-            <w:pPr>
-              <w:pStyle w:val="Compact"/>
-            </w:pPr>
-            <w:r>
-              <w:t xml:space="preserve">SSH Risk Reduction</w:t>
-            </w:r>
-          </w:p>
-        </w:tc>
-        <w:tc>
-          <w:tcPr/>
-          <w:p>
-            <w:pPr>
-              <w:pStyle w:val="Compact"/>
-            </w:pPr>
-            <w:r>
-              <w:t xml:space="preserve">Control SSH between workloads.</w:t>
+              <w:t xml:space="preserve">14</w:t>
+            </w:r>
+          </w:p>
+        </w:tc>
+        <w:tc>
+          <w:tcPr/>
+          <w:p>
+            <w:pPr>
+              <w:pStyle w:val="Compact"/>
+            </w:pPr>
+            <w:r>
+              <w:t xml:space="preserve">Log4J Risk Reduction</w:t>
+            </w:r>
+          </w:p>
+        </w:tc>
+        <w:tc>
+          <w:tcPr/>
+          <w:p>
+            <w:pPr>
+              <w:pStyle w:val="Compact"/>
+            </w:pPr>
+            <w:r>
+              <w:t xml:space="preserve">Log4Shell exposure containment.</w:t>
             </w:r>
           </w:p>
         </w:tc>
@@ -4063,7 +4099,7 @@
               <w:jc w:val="center"/>
             </w:pPr>
             <w:r>
-              <w:t xml:space="preserve">16</w:t>
+              <w:t xml:space="preserve">17</w:t>
             </w:r>
           </w:p>
         </w:tc>
@@ -4075,29 +4111,29 @@
               <w:jc w:val="right"/>
             </w:pPr>
             <w:r>
-              <w:t xml:space="preserve">14</w:t>
-            </w:r>
-          </w:p>
-        </w:tc>
-        <w:tc>
-          <w:tcPr/>
-          <w:p>
-            <w:pPr>
-              <w:pStyle w:val="Compact"/>
-            </w:pPr>
-            <w:r>
-              <w:t xml:space="preserve">Log4J Risk Reduction</w:t>
-            </w:r>
-          </w:p>
-        </w:tc>
-        <w:tc>
-          <w:tcPr/>
-          <w:p>
-            <w:pPr>
-              <w:pStyle w:val="Compact"/>
-            </w:pPr>
-            <w:r>
-              <w:t xml:space="preserve">Log4Shell exposure containment.</w:t>
+              <w:t xml:space="preserve">13</w:t>
+            </w:r>
+          </w:p>
+        </w:tc>
+        <w:tc>
+          <w:tcPr/>
+          <w:p>
+            <w:pPr>
+              <w:pStyle w:val="Compact"/>
+            </w:pPr>
+            <w:r>
+              <w:t xml:space="preserve">Forensics</w:t>
+            </w:r>
+          </w:p>
+        </w:tc>
+        <w:tc>
+          <w:tcPr/>
+          <w:p>
+            <w:pPr>
+              <w:pStyle w:val="Compact"/>
+            </w:pPr>
+            <w:r>
+              <w:t xml:space="preserve">Investigation evidence.</w:t>
             </w:r>
           </w:p>
         </w:tc>
@@ -4119,74 +4155,9 @@
           </w:p>
         </w:tc>
       </w:tr>
-      <w:tr>
-        <w:tc>
-          <w:tcPr/>
-          <w:p>
-            <w:pPr>
-              <w:pStyle w:val="Compact"/>
-              <w:jc w:val="center"/>
-            </w:pPr>
-            <w:r>
-              <w:t xml:space="preserve">17</w:t>
-            </w:r>
-          </w:p>
-        </w:tc>
-        <w:tc>
-          <w:tcPr/>
-          <w:p>
-            <w:pPr>
-              <w:pStyle w:val="Compact"/>
-              <w:jc w:val="right"/>
-            </w:pPr>
-            <w:r>
-              <w:t xml:space="preserve">13</w:t>
-            </w:r>
-          </w:p>
-        </w:tc>
-        <w:tc>
-          <w:tcPr/>
-          <w:p>
-            <w:pPr>
-              <w:pStyle w:val="Compact"/>
-            </w:pPr>
-            <w:r>
-              <w:t xml:space="preserve">Forensics</w:t>
-            </w:r>
-          </w:p>
-        </w:tc>
-        <w:tc>
-          <w:tcPr/>
-          <w:p>
-            <w:pPr>
-              <w:pStyle w:val="Compact"/>
-            </w:pPr>
-            <w:r>
-              <w:t xml:space="preserve">Investigation evidence.</w:t>
-            </w:r>
-          </w:p>
-        </w:tc>
-        <w:tc>
-          <w:tcPr/>
-          <w:p>
-            <w:pPr>
-              <w:pStyle w:val="Compact"/>
-              <w:jc w:val="center"/>
-            </w:pPr>
-            <w:hyperlink r:id="rId42">
-              <w:r>
-                <w:rPr>
-                  <w:rStyle w:val="Hyperlink"/>
-                </w:rPr>
-                <w:t xml:space="preserve">Watch</w:t>
-              </w:r>
-            </w:hyperlink>
-          </w:p>
-        </w:tc>
-      </w:tr>
     </w:tbl>
-    <w:bookmarkEnd w:id="43"/>
-    <w:bookmarkStart w:id="46" w:name="X8938ec5b7415f921bc4d87f7ee35b1149073c6a"/>
+    <w:bookmarkEnd w:id="42"/>
+    <w:bookmarkStart w:id="45" w:name="X8938ec5b7415f921bc4d87f7ee35b1149073c6a"/>
     <w:p>
       <w:pPr>
         <w:pStyle w:val="Heading3"/>
@@ -4325,6 +4296,71 @@
               <w:pStyle w:val="Compact"/>
               <w:jc w:val="center"/>
             </w:pPr>
+            <w:hyperlink r:id="rId43">
+              <w:r>
+                <w:rPr>
+                  <w:rStyle w:val="Hyperlink"/>
+                </w:rPr>
+                <w:t xml:space="preserve">Watch</w:t>
+              </w:r>
+            </w:hyperlink>
+          </w:p>
+        </w:tc>
+      </w:tr>
+      <w:tr>
+        <w:tc>
+          <w:tcPr/>
+          <w:p>
+            <w:pPr>
+              <w:pStyle w:val="Compact"/>
+              <w:jc w:val="center"/>
+            </w:pPr>
+            <w:r>
+              <w:t xml:space="preserve">19</w:t>
+            </w:r>
+          </w:p>
+        </w:tc>
+        <w:tc>
+          <w:tcPr/>
+          <w:p>
+            <w:pPr>
+              <w:pStyle w:val="Compact"/>
+              <w:jc w:val="right"/>
+            </w:pPr>
+            <w:r>
+              <w:t xml:space="preserve">17</w:t>
+            </w:r>
+          </w:p>
+        </w:tc>
+        <w:tc>
+          <w:tcPr/>
+          <w:p>
+            <w:pPr>
+              <w:pStyle w:val="Compact"/>
+            </w:pPr>
+            <w:r>
+              <w:t xml:space="preserve">VDI Segmentation</w:t>
+            </w:r>
+          </w:p>
+        </w:tc>
+        <w:tc>
+          <w:tcPr/>
+          <w:p>
+            <w:pPr>
+              <w:pStyle w:val="Compact"/>
+            </w:pPr>
+            <w:r>
+              <w:t xml:space="preserve">Golden-image VDI estates.</w:t>
+            </w:r>
+          </w:p>
+        </w:tc>
+        <w:tc>
+          <w:tcPr/>
+          <w:p>
+            <w:pPr>
+              <w:pStyle w:val="Compact"/>
+              <w:jc w:val="center"/>
+            </w:pPr>
             <w:hyperlink r:id="rId44">
               <w:r>
                 <w:rPr>
@@ -4336,74 +4372,9 @@
           </w:p>
         </w:tc>
       </w:tr>
-      <w:tr>
-        <w:tc>
-          <w:tcPr/>
-          <w:p>
-            <w:pPr>
-              <w:pStyle w:val="Compact"/>
-              <w:jc w:val="center"/>
-            </w:pPr>
-            <w:r>
-              <w:t xml:space="preserve">19</w:t>
-            </w:r>
-          </w:p>
-        </w:tc>
-        <w:tc>
-          <w:tcPr/>
-          <w:p>
-            <w:pPr>
-              <w:pStyle w:val="Compact"/>
-              <w:jc w:val="right"/>
-            </w:pPr>
-            <w:r>
-              <w:t xml:space="preserve">17</w:t>
-            </w:r>
-          </w:p>
-        </w:tc>
-        <w:tc>
-          <w:tcPr/>
-          <w:p>
-            <w:pPr>
-              <w:pStyle w:val="Compact"/>
-            </w:pPr>
-            <w:r>
-              <w:t xml:space="preserve">VDI Segmentation</w:t>
-            </w:r>
-          </w:p>
-        </w:tc>
-        <w:tc>
-          <w:tcPr/>
-          <w:p>
-            <w:pPr>
-              <w:pStyle w:val="Compact"/>
-            </w:pPr>
-            <w:r>
-              <w:t xml:space="preserve">Golden-image VDI estates.</w:t>
-            </w:r>
-          </w:p>
-        </w:tc>
-        <w:tc>
-          <w:tcPr/>
-          <w:p>
-            <w:pPr>
-              <w:pStyle w:val="Compact"/>
-              <w:jc w:val="center"/>
-            </w:pPr>
-            <w:hyperlink r:id="rId45">
-              <w:r>
-                <w:rPr>
-                  <w:rStyle w:val="Hyperlink"/>
-                </w:rPr>
-                <w:t xml:space="preserve">Watch</w:t>
-              </w:r>
-            </w:hyperlink>
-          </w:p>
-        </w:tc>
-      </w:tr>
     </w:tbl>
-    <w:bookmarkEnd w:id="46"/>
-    <w:bookmarkStart w:id="63" w:name="Xe21ac8eabdd6109406629bd8972d04c76475f88"/>
+    <w:bookmarkEnd w:id="45"/>
+    <w:bookmarkStart w:id="62" w:name="Xe21ac8eabdd6109406629bd8972d04c76475f88"/>
     <w:p>
       <w:pPr>
         <w:pStyle w:val="Heading3"/>
@@ -4542,6 +4513,71 @@
               <w:pStyle w:val="Compact"/>
               <w:jc w:val="center"/>
             </w:pPr>
+            <w:hyperlink r:id="rId46">
+              <w:r>
+                <w:rPr>
+                  <w:rStyle w:val="Hyperlink"/>
+                </w:rPr>
+                <w:t xml:space="preserve">Watch</w:t>
+              </w:r>
+            </w:hyperlink>
+          </w:p>
+        </w:tc>
+      </w:tr>
+      <w:tr>
+        <w:tc>
+          <w:tcPr/>
+          <w:p>
+            <w:pPr>
+              <w:pStyle w:val="Compact"/>
+              <w:jc w:val="center"/>
+            </w:pPr>
+            <w:r>
+              <w:t xml:space="preserve">21</w:t>
+            </w:r>
+          </w:p>
+        </w:tc>
+        <w:tc>
+          <w:tcPr/>
+          <w:p>
+            <w:pPr>
+              <w:pStyle w:val="Compact"/>
+              <w:jc w:val="right"/>
+            </w:pPr>
+            <w:r>
+              <w:t xml:space="preserve">19</w:t>
+            </w:r>
+          </w:p>
+        </w:tc>
+        <w:tc>
+          <w:tcPr/>
+          <w:p>
+            <w:pPr>
+              <w:pStyle w:val="Compact"/>
+            </w:pPr>
+            <w:r>
+              <w:t xml:space="preserve">Secure Workload &amp; Firewall Integration (Part 2)</w:t>
+            </w:r>
+          </w:p>
+        </w:tc>
+        <w:tc>
+          <w:tcPr/>
+          <w:p>
+            <w:pPr>
+              <w:pStyle w:val="Compact"/>
+            </w:pPr>
+            <w:r>
+              <w:t xml:space="preserve">Deployment patterns and policy flow.</w:t>
+            </w:r>
+          </w:p>
+        </w:tc>
+        <w:tc>
+          <w:tcPr/>
+          <w:p>
+            <w:pPr>
+              <w:pStyle w:val="Compact"/>
+              <w:jc w:val="center"/>
+            </w:pPr>
             <w:hyperlink r:id="rId47">
               <w:r>
                 <w:rPr>
@@ -4562,7 +4598,7 @@
               <w:jc w:val="center"/>
             </w:pPr>
             <w:r>
-              <w:t xml:space="preserve">21</w:t>
+              <w:t xml:space="preserve">22</w:t>
             </w:r>
           </w:p>
         </w:tc>
@@ -4574,29 +4610,29 @@
               <w:jc w:val="right"/>
             </w:pPr>
             <w:r>
-              <w:t xml:space="preserve">19</w:t>
-            </w:r>
-          </w:p>
-        </w:tc>
-        <w:tc>
-          <w:tcPr/>
-          <w:p>
-            <w:pPr>
-              <w:pStyle w:val="Compact"/>
-            </w:pPr>
-            <w:r>
-              <w:t xml:space="preserve">Secure Workload &amp; Firewall Integration (Part 2)</w:t>
-            </w:r>
-          </w:p>
-        </w:tc>
-        <w:tc>
-          <w:tcPr/>
-          <w:p>
-            <w:pPr>
-              <w:pStyle w:val="Compact"/>
-            </w:pPr>
-            <w:r>
-              <w:t xml:space="preserve">Deployment patterns and policy flow.</w:t>
+              <w:t xml:space="preserve">20</w:t>
+            </w:r>
+          </w:p>
+        </w:tc>
+        <w:tc>
+          <w:tcPr/>
+          <w:p>
+            <w:pPr>
+              <w:pStyle w:val="Compact"/>
+            </w:pPr>
+            <w:r>
+              <w:t xml:space="preserve">Secure Workload &amp; Firewall Integration (Part 3)</w:t>
+            </w:r>
+          </w:p>
+        </w:tc>
+        <w:tc>
+          <w:tcPr/>
+          <w:p>
+            <w:pPr>
+              <w:pStyle w:val="Compact"/>
+            </w:pPr>
+            <w:r>
+              <w:t xml:space="preserve">Enforcement, telemetry, operations.</w:t>
             </w:r>
           </w:p>
         </w:tc>
@@ -4627,7 +4663,7 @@
               <w:jc w:val="center"/>
             </w:pPr>
             <w:r>
-              <w:t xml:space="preserve">22</w:t>
+              <w:t xml:space="preserve">23</w:t>
             </w:r>
           </w:p>
         </w:tc>
@@ -4639,29 +4675,29 @@
               <w:jc w:val="right"/>
             </w:pPr>
             <w:r>
-              <w:t xml:space="preserve">20</w:t>
-            </w:r>
-          </w:p>
-        </w:tc>
-        <w:tc>
-          <w:tcPr/>
-          <w:p>
-            <w:pPr>
-              <w:pStyle w:val="Compact"/>
-            </w:pPr>
-            <w:r>
-              <w:t xml:space="preserve">Secure Workload &amp; Firewall Integration (Part 3)</w:t>
-            </w:r>
-          </w:p>
-        </w:tc>
-        <w:tc>
-          <w:tcPr/>
-          <w:p>
-            <w:pPr>
-              <w:pStyle w:val="Compact"/>
-            </w:pPr>
-            <w:r>
-              <w:t xml:space="preserve">Enforcement, telemetry, operations.</w:t>
+              <w:t xml:space="preserve">21</w:t>
+            </w:r>
+          </w:p>
+        </w:tc>
+        <w:tc>
+          <w:tcPr/>
+          <w:p>
+            <w:pPr>
+              <w:pStyle w:val="Compact"/>
+            </w:pPr>
+            <w:r>
+              <w:t xml:space="preserve">Secure Firewall White Paper</w:t>
+            </w:r>
+          </w:p>
+        </w:tc>
+        <w:tc>
+          <w:tcPr/>
+          <w:p>
+            <w:pPr>
+              <w:pStyle w:val="Compact"/>
+            </w:pPr>
+            <w:r>
+              <w:t xml:space="preserve">Joint architecture (Cisco.com).</w:t>
             </w:r>
           </w:p>
         </w:tc>
@@ -4677,7 +4713,7 @@
                 <w:rPr>
                   <w:rStyle w:val="Hyperlink"/>
                 </w:rPr>
-                <w:t xml:space="preserve">Watch</w:t>
+                <w:t xml:space="preserve">Read</w:t>
               </w:r>
             </w:hyperlink>
           </w:p>
@@ -4692,7 +4728,7 @@
               <w:jc w:val="center"/>
             </w:pPr>
             <w:r>
-              <w:t xml:space="preserve">23</w:t>
+              <w:t xml:space="preserve">24</w:t>
             </w:r>
           </w:p>
         </w:tc>
@@ -4704,29 +4740,29 @@
               <w:jc w:val="right"/>
             </w:pPr>
             <w:r>
-              <w:t xml:space="preserve">21</w:t>
-            </w:r>
-          </w:p>
-        </w:tc>
-        <w:tc>
-          <w:tcPr/>
-          <w:p>
-            <w:pPr>
-              <w:pStyle w:val="Compact"/>
-            </w:pPr>
-            <w:r>
-              <w:t xml:space="preserve">Secure Firewall White Paper</w:t>
-            </w:r>
-          </w:p>
-        </w:tc>
-        <w:tc>
-          <w:tcPr/>
-          <w:p>
-            <w:pPr>
-              <w:pStyle w:val="Compact"/>
-            </w:pPr>
-            <w:r>
-              <w:t xml:space="preserve">Joint architecture (Cisco.com).</w:t>
+              <w:t xml:space="preserve">22</w:t>
+            </w:r>
+          </w:p>
+        </w:tc>
+        <w:tc>
+          <w:tcPr/>
+          <w:p>
+            <w:pPr>
+              <w:pStyle w:val="Compact"/>
+            </w:pPr>
+            <w:r>
+              <w:t xml:space="preserve">Firewall Integration Deep Dive</w:t>
+            </w:r>
+          </w:p>
+        </w:tc>
+        <w:tc>
+          <w:tcPr/>
+          <w:p>
+            <w:pPr>
+              <w:pStyle w:val="Compact"/>
+            </w:pPr>
+            <w:r>
+              <w:t xml:space="preserve">Design principles and use cases.</w:t>
             </w:r>
           </w:p>
         </w:tc>
@@ -4757,7 +4793,7 @@
               <w:jc w:val="center"/>
             </w:pPr>
             <w:r>
-              <w:t xml:space="preserve">24</w:t>
+              <w:t xml:space="preserve">25</w:t>
             </w:r>
           </w:p>
         </w:tc>
@@ -4769,29 +4805,29 @@
               <w:jc w:val="right"/>
             </w:pPr>
             <w:r>
-              <w:t xml:space="preserve">22</w:t>
-            </w:r>
-          </w:p>
-        </w:tc>
-        <w:tc>
-          <w:tcPr/>
-          <w:p>
-            <w:pPr>
-              <w:pStyle w:val="Compact"/>
-            </w:pPr>
-            <w:r>
-              <w:t xml:space="preserve">Firewall Integration Deep Dive</w:t>
-            </w:r>
-          </w:p>
-        </w:tc>
-        <w:tc>
-          <w:tcPr/>
-          <w:p>
-            <w:pPr>
-              <w:pStyle w:val="Compact"/>
-            </w:pPr>
-            <w:r>
-              <w:t xml:space="preserve">Design principles and use cases.</w:t>
+              <w:t xml:space="preserve">23</w:t>
+            </w:r>
+          </w:p>
+        </w:tc>
+        <w:tc>
+          <w:tcPr/>
+          <w:p>
+            <w:pPr>
+              <w:pStyle w:val="Compact"/>
+            </w:pPr>
+            <w:r>
+              <w:t xml:space="preserve">F5 BIG-IP: APM Visibility</w:t>
+            </w:r>
+          </w:p>
+        </w:tc>
+        <w:tc>
+          <w:tcPr/>
+          <w:p>
+            <w:pPr>
+              <w:pStyle w:val="Compact"/>
+            </w:pPr>
+            <w:r>
+              <w:t xml:space="preserve">F5 APM application visibility.</w:t>
             </w:r>
           </w:p>
         </w:tc>
@@ -4807,7 +4843,7 @@
                 <w:rPr>
                   <w:rStyle w:val="Hyperlink"/>
                 </w:rPr>
-                <w:t xml:space="preserve">Read</w:t>
+                <w:t xml:space="preserve">Watch</w:t>
               </w:r>
             </w:hyperlink>
           </w:p>
@@ -4822,7 +4858,7 @@
               <w:jc w:val="center"/>
             </w:pPr>
             <w:r>
-              <w:t xml:space="preserve">25</w:t>
+              <w:t xml:space="preserve">26</w:t>
             </w:r>
           </w:p>
         </w:tc>
@@ -4834,29 +4870,29 @@
               <w:jc w:val="right"/>
             </w:pPr>
             <w:r>
-              <w:t xml:space="preserve">23</w:t>
-            </w:r>
-          </w:p>
-        </w:tc>
-        <w:tc>
-          <w:tcPr/>
-          <w:p>
-            <w:pPr>
-              <w:pStyle w:val="Compact"/>
-            </w:pPr>
-            <w:r>
-              <w:t xml:space="preserve">F5 BIG-IP: APM Visibility</w:t>
-            </w:r>
-          </w:p>
-        </w:tc>
-        <w:tc>
-          <w:tcPr/>
-          <w:p>
-            <w:pPr>
-              <w:pStyle w:val="Compact"/>
-            </w:pPr>
-            <w:r>
-              <w:t xml:space="preserve">F5 APM application visibility.</w:t>
+              <w:t xml:space="preserve">24</w:t>
+            </w:r>
+          </w:p>
+        </w:tc>
+        <w:tc>
+          <w:tcPr/>
+          <w:p>
+            <w:pPr>
+              <w:pStyle w:val="Compact"/>
+            </w:pPr>
+            <w:r>
+              <w:t xml:space="preserve">F5 BIG-IP AFM</w:t>
+            </w:r>
+          </w:p>
+        </w:tc>
+        <w:tc>
+          <w:tcPr/>
+          <w:p>
+            <w:pPr>
+              <w:pStyle w:val="Compact"/>
+            </w:pPr>
+            <w:r>
+              <w:t xml:space="preserve">AFM flow context.</w:t>
             </w:r>
           </w:p>
         </w:tc>
@@ -4887,7 +4923,7 @@
               <w:jc w:val="center"/>
             </w:pPr>
             <w:r>
-              <w:t xml:space="preserve">26</w:t>
+              <w:t xml:space="preserve">27</w:t>
             </w:r>
           </w:p>
         </w:tc>
@@ -4899,29 +4935,29 @@
               <w:jc w:val="right"/>
             </w:pPr>
             <w:r>
-              <w:t xml:space="preserve">24</w:t>
-            </w:r>
-          </w:p>
-        </w:tc>
-        <w:tc>
-          <w:tcPr/>
-          <w:p>
-            <w:pPr>
-              <w:pStyle w:val="Compact"/>
-            </w:pPr>
-            <w:r>
-              <w:t xml:space="preserve">F5 BIG-IP AFM</w:t>
-            </w:r>
-          </w:p>
-        </w:tc>
-        <w:tc>
-          <w:tcPr/>
-          <w:p>
-            <w:pPr>
-              <w:pStyle w:val="Compact"/>
-            </w:pPr>
-            <w:r>
-              <w:t xml:space="preserve">AFM flow context.</w:t>
+              <w:t xml:space="preserve">25</w:t>
+            </w:r>
+          </w:p>
+        </w:tc>
+        <w:tc>
+          <w:tcPr/>
+          <w:p>
+            <w:pPr>
+              <w:pStyle w:val="Compact"/>
+            </w:pPr>
+            <w:r>
+              <w:t xml:space="preserve">F5 BIG-IP IPFIX Configuration</w:t>
+            </w:r>
+          </w:p>
+        </w:tc>
+        <w:tc>
+          <w:tcPr/>
+          <w:p>
+            <w:pPr>
+              <w:pStyle w:val="Compact"/>
+            </w:pPr>
+            <w:r>
+              <w:t xml:space="preserve">IPFIX into Secure Workload.</w:t>
             </w:r>
           </w:p>
         </w:tc>
@@ -4952,7 +4988,7 @@
               <w:jc w:val="center"/>
             </w:pPr>
             <w:r>
-              <w:t xml:space="preserve">27</w:t>
+              <w:t xml:space="preserve">28</w:t>
             </w:r>
           </w:p>
         </w:tc>
@@ -4964,29 +5000,29 @@
               <w:jc w:val="right"/>
             </w:pPr>
             <w:r>
-              <w:t xml:space="preserve">25</w:t>
-            </w:r>
-          </w:p>
-        </w:tc>
-        <w:tc>
-          <w:tcPr/>
-          <w:p>
-            <w:pPr>
-              <w:pStyle w:val="Compact"/>
-            </w:pPr>
-            <w:r>
-              <w:t xml:space="preserve">F5 BIG-IP IPFIX Configuration</w:t>
-            </w:r>
-          </w:p>
-        </w:tc>
-        <w:tc>
-          <w:tcPr/>
-          <w:p>
-            <w:pPr>
-              <w:pStyle w:val="Compact"/>
-            </w:pPr>
-            <w:r>
-              <w:t xml:space="preserve">IPFIX into Secure Workload.</w:t>
+              <w:t xml:space="preserve">26</w:t>
+            </w:r>
+          </w:p>
+        </w:tc>
+        <w:tc>
+          <w:tcPr/>
+          <w:p>
+            <w:pPr>
+              <w:pStyle w:val="Compact"/>
+            </w:pPr>
+            <w:r>
+              <w:t xml:space="preserve">DNS Server Integration</w:t>
+            </w:r>
+          </w:p>
+        </w:tc>
+        <w:tc>
+          <w:tcPr/>
+          <w:p>
+            <w:pPr>
+              <w:pStyle w:val="Compact"/>
+            </w:pPr>
+            <w:r>
+              <w:t xml:space="preserve">DNS context for flows and policy.</w:t>
             </w:r>
           </w:p>
         </w:tc>
@@ -5017,7 +5053,7 @@
               <w:jc w:val="center"/>
             </w:pPr>
             <w:r>
-              <w:t xml:space="preserve">28</w:t>
+              <w:t xml:space="preserve">29</w:t>
             </w:r>
           </w:p>
         </w:tc>
@@ -5029,29 +5065,29 @@
               <w:jc w:val="right"/>
             </w:pPr>
             <w:r>
-              <w:t xml:space="preserve">26</w:t>
-            </w:r>
-          </w:p>
-        </w:tc>
-        <w:tc>
-          <w:tcPr/>
-          <w:p>
-            <w:pPr>
-              <w:pStyle w:val="Compact"/>
-            </w:pPr>
-            <w:r>
-              <w:t xml:space="preserve">DNS Server Integration</w:t>
-            </w:r>
-          </w:p>
-        </w:tc>
-        <w:tc>
-          <w:tcPr/>
-          <w:p>
-            <w:pPr>
-              <w:pStyle w:val="Compact"/>
-            </w:pPr>
-            <w:r>
-              <w:t xml:space="preserve">DNS context for flows and policy.</w:t>
+              <w:t xml:space="preserve">27</w:t>
+            </w:r>
+          </w:p>
+        </w:tc>
+        <w:tc>
+          <w:tcPr/>
+          <w:p>
+            <w:pPr>
+              <w:pStyle w:val="Compact"/>
+            </w:pPr>
+            <w:r>
+              <w:t xml:space="preserve">Infoblox Integration</w:t>
+            </w:r>
+          </w:p>
+        </w:tc>
+        <w:tc>
+          <w:tcPr/>
+          <w:p>
+            <w:pPr>
+              <w:pStyle w:val="Compact"/>
+            </w:pPr>
+            <w:r>
+              <w:t xml:space="preserve">DNS / IPAM context.</w:t>
             </w:r>
           </w:p>
         </w:tc>
@@ -5082,7 +5118,7 @@
               <w:jc w:val="center"/>
             </w:pPr>
             <w:r>
-              <w:t xml:space="preserve">29</w:t>
+              <w:t xml:space="preserve">30</w:t>
             </w:r>
           </w:p>
         </w:tc>
@@ -5094,29 +5130,29 @@
               <w:jc w:val="right"/>
             </w:pPr>
             <w:r>
-              <w:t xml:space="preserve">27</w:t>
-            </w:r>
-          </w:p>
-        </w:tc>
-        <w:tc>
-          <w:tcPr/>
-          <w:p>
-            <w:pPr>
-              <w:pStyle w:val="Compact"/>
-            </w:pPr>
-            <w:r>
-              <w:t xml:space="preserve">Infoblox Integration</w:t>
-            </w:r>
-          </w:p>
-        </w:tc>
-        <w:tc>
-          <w:tcPr/>
-          <w:p>
-            <w:pPr>
-              <w:pStyle w:val="Compact"/>
-            </w:pPr>
-            <w:r>
-              <w:t xml:space="preserve">DNS / IPAM context.</w:t>
+              <w:t xml:space="preserve">28</w:t>
+            </w:r>
+          </w:p>
+        </w:tc>
+        <w:tc>
+          <w:tcPr/>
+          <w:p>
+            <w:pPr>
+              <w:pStyle w:val="Compact"/>
+            </w:pPr>
+            <w:r>
+              <w:t xml:space="preserve">Algosec Integration</w:t>
+            </w:r>
+          </w:p>
+        </w:tc>
+        <w:tc>
+          <w:tcPr/>
+          <w:p>
+            <w:pPr>
+              <w:pStyle w:val="Compact"/>
+            </w:pPr>
+            <w:r>
+              <w:t xml:space="preserve">Firewall-policy lifecycle.</w:t>
             </w:r>
           </w:p>
         </w:tc>
@@ -5147,7 +5183,7 @@
               <w:jc w:val="center"/>
             </w:pPr>
             <w:r>
-              <w:t xml:space="preserve">30</w:t>
+              <w:t xml:space="preserve">31</w:t>
             </w:r>
           </w:p>
         </w:tc>
@@ -5159,29 +5195,29 @@
               <w:jc w:val="right"/>
             </w:pPr>
             <w:r>
-              <w:t xml:space="preserve">28</w:t>
-            </w:r>
-          </w:p>
-        </w:tc>
-        <w:tc>
-          <w:tcPr/>
-          <w:p>
-            <w:pPr>
-              <w:pStyle w:val="Compact"/>
-            </w:pPr>
-            <w:r>
-              <w:t xml:space="preserve">Algosec Integration</w:t>
-            </w:r>
-          </w:p>
-        </w:tc>
-        <w:tc>
-          <w:tcPr/>
-          <w:p>
-            <w:pPr>
-              <w:pStyle w:val="Compact"/>
-            </w:pPr>
-            <w:r>
-              <w:t xml:space="preserve">Firewall-policy lifecycle.</w:t>
+              <w:t xml:space="preserve">29</w:t>
+            </w:r>
+          </w:p>
+        </w:tc>
+        <w:tc>
+          <w:tcPr/>
+          <w:p>
+            <w:pPr>
+              <w:pStyle w:val="Compact"/>
+            </w:pPr>
+            <w:r>
+              <w:t xml:space="preserve">ISE (In Action)</w:t>
+            </w:r>
+          </w:p>
+        </w:tc>
+        <w:tc>
+          <w:tcPr/>
+          <w:p>
+            <w:pPr>
+              <w:pStyle w:val="Compact"/>
+            </w:pPr>
+            <w:r>
+              <w:t xml:space="preserve">Identity from Cisco ISE.</w:t>
             </w:r>
           </w:p>
         </w:tc>
@@ -5212,7 +5248,7 @@
               <w:jc w:val="center"/>
             </w:pPr>
             <w:r>
-              <w:t xml:space="preserve">31</w:t>
+              <w:t xml:space="preserve">32</w:t>
             </w:r>
           </w:p>
         </w:tc>
@@ -5224,29 +5260,29 @@
               <w:jc w:val="right"/>
             </w:pPr>
             <w:r>
-              <w:t xml:space="preserve">29</w:t>
-            </w:r>
-          </w:p>
-        </w:tc>
-        <w:tc>
-          <w:tcPr/>
-          <w:p>
-            <w:pPr>
-              <w:pStyle w:val="Compact"/>
-            </w:pPr>
-            <w:r>
-              <w:t xml:space="preserve">ISE (In Action)</w:t>
-            </w:r>
-          </w:p>
-        </w:tc>
-        <w:tc>
-          <w:tcPr/>
-          <w:p>
-            <w:pPr>
-              <w:pStyle w:val="Compact"/>
-            </w:pPr>
-            <w:r>
-              <w:t xml:space="preserve">Identity from Cisco ISE.</w:t>
+              <w:t xml:space="preserve">30</w:t>
+            </w:r>
+          </w:p>
+        </w:tc>
+        <w:tc>
+          <w:tcPr/>
+          <w:p>
+            <w:pPr>
+              <w:pStyle w:val="Compact"/>
+            </w:pPr>
+            <w:r>
+              <w:t xml:space="preserve">FMC / Edge / Ingest / Appliance</w:t>
+            </w:r>
+          </w:p>
+        </w:tc>
+        <w:tc>
+          <w:tcPr/>
+          <w:p>
+            <w:pPr>
+              <w:pStyle w:val="Compact"/>
+            </w:pPr>
+            <w:r>
+              <w:t xml:space="preserve">FMC integration paths.</w:t>
             </w:r>
           </w:p>
         </w:tc>
@@ -5277,7 +5313,7 @@
               <w:jc w:val="center"/>
             </w:pPr>
             <w:r>
-              <w:t xml:space="preserve">32</w:t>
+              <w:t xml:space="preserve">33</w:t>
             </w:r>
           </w:p>
         </w:tc>
@@ -5289,29 +5325,29 @@
               <w:jc w:val="right"/>
             </w:pPr>
             <w:r>
-              <w:t xml:space="preserve">30</w:t>
-            </w:r>
-          </w:p>
-        </w:tc>
-        <w:tc>
-          <w:tcPr/>
-          <w:p>
-            <w:pPr>
-              <w:pStyle w:val="Compact"/>
-            </w:pPr>
-            <w:r>
-              <w:t xml:space="preserve">FMC / Edge / Ingest / Appliance</w:t>
-            </w:r>
-          </w:p>
-        </w:tc>
-        <w:tc>
-          <w:tcPr/>
-          <w:p>
-            <w:pPr>
-              <w:pStyle w:val="Compact"/>
-            </w:pPr>
-            <w:r>
-              <w:t xml:space="preserve">FMC integration paths.</w:t>
+              <w:t xml:space="preserve">31</w:t>
+            </w:r>
+          </w:p>
+        </w:tc>
+        <w:tc>
+          <w:tcPr/>
+          <w:p>
+            <w:pPr>
+              <w:pStyle w:val="Compact"/>
+            </w:pPr>
+            <w:r>
+              <w:t xml:space="preserve">ACI and CSW Integration</w:t>
+            </w:r>
+          </w:p>
+        </w:tc>
+        <w:tc>
+          <w:tcPr/>
+          <w:p>
+            <w:pPr>
+              <w:pStyle w:val="Compact"/>
+            </w:pPr>
+            <w:r>
+              <w:t xml:space="preserve">ACI + workload segmentation.</w:t>
             </w:r>
           </w:p>
         </w:tc>
@@ -5342,7 +5378,7 @@
               <w:jc w:val="center"/>
             </w:pPr>
             <w:r>
-              <w:t xml:space="preserve">33</w:t>
+              <w:t xml:space="preserve">34</w:t>
             </w:r>
           </w:p>
         </w:tc>
@@ -5354,29 +5390,29 @@
               <w:jc w:val="right"/>
             </w:pPr>
             <w:r>
-              <w:t xml:space="preserve">31</w:t>
-            </w:r>
-          </w:p>
-        </w:tc>
-        <w:tc>
-          <w:tcPr/>
-          <w:p>
-            <w:pPr>
-              <w:pStyle w:val="Compact"/>
-            </w:pPr>
-            <w:r>
-              <w:t xml:space="preserve">ACI and CSW Integration</w:t>
-            </w:r>
-          </w:p>
-        </w:tc>
-        <w:tc>
-          <w:tcPr/>
-          <w:p>
-            <w:pPr>
-              <w:pStyle w:val="Compact"/>
-            </w:pPr>
-            <w:r>
-              <w:t xml:space="preserve">ACI + workload segmentation.</w:t>
+              <w:t xml:space="preserve">35</w:t>
+            </w:r>
+          </w:p>
+        </w:tc>
+        <w:tc>
+          <w:tcPr/>
+          <w:p>
+            <w:pPr>
+              <w:pStyle w:val="Compact"/>
+            </w:pPr>
+            <w:r>
+              <w:t xml:space="preserve">Splunk Integration (SIEM)</w:t>
+            </w:r>
+          </w:p>
+        </w:tc>
+        <w:tc>
+          <w:tcPr/>
+          <w:p>
+            <w:pPr>
+              <w:pStyle w:val="Compact"/>
+            </w:pPr>
+            <w:r>
+              <w:t xml:space="preserve">Cisco Security Cloud App for baseline datasets, CSW → Splunk Syslog alerts, plus Splunk-driven Python against the CSW API.</w:t>
             </w:r>
           </w:p>
         </w:tc>
@@ -5407,7 +5443,7 @@
               <w:jc w:val="center"/>
             </w:pPr>
             <w:r>
-              <w:t xml:space="preserve">34</w:t>
+              <w:t xml:space="preserve">35</w:t>
             </w:r>
           </w:p>
         </w:tc>
@@ -5419,29 +5455,29 @@
               <w:jc w:val="right"/>
             </w:pPr>
             <w:r>
-              <w:t xml:space="preserve">35</w:t>
-            </w:r>
-          </w:p>
-        </w:tc>
-        <w:tc>
-          <w:tcPr/>
-          <w:p>
-            <w:pPr>
-              <w:pStyle w:val="Compact"/>
-            </w:pPr>
-            <w:r>
-              <w:t xml:space="preserve">Splunk Integration (SIEM)</w:t>
-            </w:r>
-          </w:p>
-        </w:tc>
-        <w:tc>
-          <w:tcPr/>
-          <w:p>
-            <w:pPr>
-              <w:pStyle w:val="Compact"/>
-            </w:pPr>
-            <w:r>
-              <w:t xml:space="preserve">Cisco Security Cloud App for baseline datasets, CSW → Splunk Syslog alerts, plus Splunk-driven Python against the CSW API.</w:t>
+              <w:t xml:space="preserve">36</w:t>
+            </w:r>
+          </w:p>
+        </w:tc>
+        <w:tc>
+          <w:tcPr/>
+          <w:p>
+            <w:pPr>
+              <w:pStyle w:val="Compact"/>
+            </w:pPr>
+            <w:r>
+              <w:t xml:space="preserve">CI/CD Pipeline Integration</w:t>
+            </w:r>
+          </w:p>
+        </w:tc>
+        <w:tc>
+          <w:tcPr/>
+          <w:p>
+            <w:pPr>
+              <w:pStyle w:val="Compact"/>
+            </w:pPr>
+            <w:r>
+              <w:t xml:space="preserve">Labels, scopes, and policies as code in git; pipeline-driven API calls keep the CSW tenant in sync.</w:t>
             </w:r>
           </w:p>
         </w:tc>
@@ -5453,71 +5489,6 @@
               <w:jc w:val="center"/>
             </w:pPr>
             <w:hyperlink r:id="rId61">
-              <w:r>
-                <w:rPr>
-                  <w:rStyle w:val="Hyperlink"/>
-                </w:rPr>
-                <w:t xml:space="preserve">Watch</w:t>
-              </w:r>
-            </w:hyperlink>
-          </w:p>
-        </w:tc>
-      </w:tr>
-      <w:tr>
-        <w:tc>
-          <w:tcPr/>
-          <w:p>
-            <w:pPr>
-              <w:pStyle w:val="Compact"/>
-              <w:jc w:val="center"/>
-            </w:pPr>
-            <w:r>
-              <w:t xml:space="preserve">35</w:t>
-            </w:r>
-          </w:p>
-        </w:tc>
-        <w:tc>
-          <w:tcPr/>
-          <w:p>
-            <w:pPr>
-              <w:pStyle w:val="Compact"/>
-              <w:jc w:val="right"/>
-            </w:pPr>
-            <w:r>
-              <w:t xml:space="preserve">36</w:t>
-            </w:r>
-          </w:p>
-        </w:tc>
-        <w:tc>
-          <w:tcPr/>
-          <w:p>
-            <w:pPr>
-              <w:pStyle w:val="Compact"/>
-            </w:pPr>
-            <w:r>
-              <w:t xml:space="preserve">CI/CD Pipeline Integration</w:t>
-            </w:r>
-          </w:p>
-        </w:tc>
-        <w:tc>
-          <w:tcPr/>
-          <w:p>
-            <w:pPr>
-              <w:pStyle w:val="Compact"/>
-            </w:pPr>
-            <w:r>
-              <w:t xml:space="preserve">Labels, scopes, and policies as code in git; pipeline-driven API calls keep the CSW tenant in sync.</w:t>
-            </w:r>
-          </w:p>
-        </w:tc>
-        <w:tc>
-          <w:tcPr/>
-          <w:p>
-            <w:pPr>
-              <w:pStyle w:val="Compact"/>
-              <w:jc w:val="center"/>
-            </w:pPr>
-            <w:hyperlink r:id="rId62">
               <w:r>
                 <w:rPr>
                   <w:rStyle w:val="Hyperlink"/>
@@ -6089,8 +6060,8 @@
         <w:t xml:space="preserve">the CI/CD story usually lands well with cloud / platform teams who already manage everything else as code and bristle at "click here in the console" instructions. Start with policy-as-code for one application scope from the POV — it pairs naturally with the Phase 3 ADM → policy modeling output, since the modeled policy is already structured data.</w:t>
       </w:r>
     </w:p>
-    <w:bookmarkEnd w:id="63"/>
-    <w:bookmarkStart w:id="65" w:name="X075da46d2c2e8e62f26dd0dd2b1479576f22a39"/>
+    <w:bookmarkEnd w:id="62"/>
+    <w:bookmarkStart w:id="64" w:name="X075da46d2c2e8e62f26dd0dd2b1479576f22a39"/>
     <w:p>
       <w:pPr>
         <w:pStyle w:val="Heading3"/>
@@ -6229,7 +6200,7 @@
               <w:pStyle w:val="Compact"/>
               <w:jc w:val="center"/>
             </w:pPr>
-            <w:hyperlink r:id="rId64">
+            <w:hyperlink r:id="rId63">
               <w:r>
                 <w:rPr>
                   <w:rStyle w:val="Hyperlink"/>
@@ -6248,24 +6219,42 @@
         </w:pict>
       </w:r>
     </w:p>
+    <w:bookmarkEnd w:id="64"/>
     <w:bookmarkEnd w:id="65"/>
+    <w:bookmarkStart w:id="69" w:name="Xb9f64f467495bd55447e9bc3c7ae8dd7dbb3895"/>
+    <w:p>
+      <w:pPr>
+        <w:pStyle w:val="Heading2"/>
+      </w:pPr>
+      <w:r>
+        <w:t xml:space="preserve">7. How to Explain CSW in a Customer Meeting</w:t>
+      </w:r>
+    </w:p>
+    <w:bookmarkStart w:id="66" w:name="X02667f004e9d93967c02b53649e8d7704fae290"/>
+    <w:p>
+      <w:pPr>
+        <w:pStyle w:val="Heading3"/>
+      </w:pPr>
+      <w:r>
+        <w:t xml:space="preserve">30-second version</w:t>
+      </w:r>
+    </w:p>
+    <w:p>
+      <w:pPr>
+        <w:pStyle w:val="FirstParagraph"/>
+      </w:pPr>
+      <w:r>
+        <w:t xml:space="preserve">Cisco Secure Workload helps customers discover how applications communicate and then safely enforce least-privilege segmentation policies around those applications. It starts with visibility and dependency mapping, uses labels and observed behavior to create policy, and supports staged enforcement so teams can reduce lateral movement risk without breaking applications.</w:t>
+      </w:r>
+    </w:p>
     <w:bookmarkEnd w:id="66"/>
-    <w:bookmarkStart w:id="70" w:name="Xb9f64f467495bd55447e9bc3c7ae8dd7dbb3895"/>
-    <w:p>
-      <w:pPr>
-        <w:pStyle w:val="Heading2"/>
-      </w:pPr>
-      <w:r>
-        <w:t xml:space="preserve">7. How to Explain CSW in a Customer Meeting</w:t>
-      </w:r>
-    </w:p>
-    <w:bookmarkStart w:id="67" w:name="X02667f004e9d93967c02b53649e8d7704fae290"/>
+    <w:bookmarkStart w:id="67" w:name="X245c304b430f838300b4e5d227cae86dea678fa"/>
     <w:p>
       <w:pPr>
         <w:pStyle w:val="Heading3"/>
       </w:pPr>
       <w:r>
-        <w:t xml:space="preserve">30-second version</w:t>
+        <w:t xml:space="preserve">2-minute version</w:t>
       </w:r>
     </w:p>
     <w:p>
@@ -6273,29 +6262,11 @@
         <w:pStyle w:val="FirstParagraph"/>
       </w:pPr>
       <w:r>
-        <w:t xml:space="preserve">Cisco Secure Workload helps customers discover how applications communicate and then safely enforce least-privilege segmentation policies around those applications. It starts with visibility and dependency mapping, uses labels and observed behavior to create policy, and supports staged enforcement so teams can reduce lateral movement risk without breaking applications.</w:t>
+        <w:t xml:space="preserve">Most enterprises want micro-segmentation, but they hesitate because they do not fully know what their applications depend on. CSW starts by collecting workload telemetry, flow visibility, process context, cloud metadata, and CMDB labels. That data helps application teams understand real dependencies. From there, teams can model policy, see what would be blocked, tune the rules, and move selected workloads from monitor mode to enforcement. CSW is especially useful when customers need consistent segmentation across data center and cloud environments.</w:t>
       </w:r>
     </w:p>
     <w:bookmarkEnd w:id="67"/>
-    <w:bookmarkStart w:id="68" w:name="X245c304b430f838300b4e5d227cae86dea678fa"/>
-    <w:p>
-      <w:pPr>
-        <w:pStyle w:val="Heading3"/>
-      </w:pPr>
-      <w:r>
-        <w:t xml:space="preserve">2-minute version</w:t>
-      </w:r>
-    </w:p>
-    <w:p>
-      <w:pPr>
-        <w:pStyle w:val="FirstParagraph"/>
-      </w:pPr>
-      <w:r>
-        <w:t xml:space="preserve">Most enterprises want micro-segmentation, but they hesitate because they do not fully know what their applications depend on. CSW starts by collecting workload telemetry, flow visibility, process context, cloud metadata, and CMDB labels. That data helps application teams understand real dependencies. From there, teams can model policy, see what would be blocked, tune the rules, and move selected workloads from monitor mode to enforcement. CSW is especially useful when customers need consistent segmentation across data center and cloud environments.</w:t>
-      </w:r>
-    </w:p>
-    <w:bookmarkEnd w:id="68"/>
-    <w:bookmarkStart w:id="69" w:name="common-positioning"/>
+    <w:bookmarkStart w:id="68" w:name="common-positioning"/>
     <w:p>
       <w:pPr>
         <w:pStyle w:val="Heading3"/>
@@ -6421,9 +6392,9 @@
         </w:pict>
       </w:r>
     </w:p>
+    <w:bookmarkEnd w:id="68"/>
     <w:bookmarkEnd w:id="69"/>
-    <w:bookmarkEnd w:id="70"/>
-    <w:bookmarkStart w:id="80" w:name="X861afc8e8f3d3fa2cbc4317cb6150d80f9f9ccf"/>
+    <w:bookmarkStart w:id="79" w:name="X861afc8e8f3d3fa2cbc4317cb6150d80f9f9ccf"/>
     <w:p>
       <w:pPr>
         <w:pStyle w:val="Heading2"/>
@@ -6432,7 +6403,7 @@
         <w:t xml:space="preserve">8. CSW Onboarding Runbook</w:t>
       </w:r>
     </w:p>
-    <w:bookmarkStart w:id="71" w:name="phase-0---confirm-scope-and-outcomes"/>
+    <w:bookmarkStart w:id="70" w:name="phase-0---confirm-scope-and-outcomes"/>
     <w:p>
       <w:pPr>
         <w:pStyle w:val="Heading3"/>
@@ -6616,8 +6587,8 @@
         </w:pict>
       </w:r>
     </w:p>
-    <w:bookmarkEnd w:id="71"/>
-    <w:bookmarkStart w:id="72" w:name="phase-1---prepare-the-tenant-and-access"/>
+    <w:bookmarkEnd w:id="70"/>
+    <w:bookmarkStart w:id="71" w:name="phase-1---prepare-the-tenant-and-access"/>
     <w:p>
       <w:pPr>
         <w:pStyle w:val="Heading3"/>
@@ -6741,8 +6712,8 @@
         </w:pict>
       </w:r>
     </w:p>
-    <w:bookmarkEnd w:id="72"/>
-    <w:bookmarkStart w:id="73" w:name="phase-2---build-the-label-strategy"/>
+    <w:bookmarkEnd w:id="71"/>
+    <w:bookmarkStart w:id="72" w:name="phase-2---build-the-label-strategy"/>
     <w:p>
       <w:pPr>
         <w:pStyle w:val="Heading3"/>
@@ -7308,8 +7279,8 @@
         </w:pict>
       </w:r>
     </w:p>
-    <w:bookmarkEnd w:id="73"/>
-    <w:bookmarkStart w:id="74" w:name="phase-3---deploy-agents-and-connectors"/>
+    <w:bookmarkEnd w:id="72"/>
+    <w:bookmarkStart w:id="73" w:name="phase-3---deploy-agents-and-connectors"/>
     <w:p>
       <w:pPr>
         <w:pStyle w:val="Heading3"/>
@@ -7445,8 +7416,8 @@
         </w:pict>
       </w:r>
     </w:p>
-    <w:bookmarkEnd w:id="74"/>
-    <w:bookmarkStart w:id="75" w:name="X85d4e4be5891f720f2552e26364a87ec66b02af"/>
+    <w:bookmarkEnd w:id="73"/>
+    <w:bookmarkStart w:id="74" w:name="X85d4e4be5891f720f2552e26364a87ec66b02af"/>
     <w:p>
       <w:pPr>
         <w:pStyle w:val="Heading3"/>
@@ -7582,8 +7553,8 @@
         </w:pict>
       </w:r>
     </w:p>
-    <w:bookmarkEnd w:id="75"/>
-    <w:bookmarkStart w:id="76" w:name="phase-5---model-policy"/>
+    <w:bookmarkEnd w:id="74"/>
+    <w:bookmarkStart w:id="75" w:name="phase-5---model-policy"/>
     <w:p>
       <w:pPr>
         <w:pStyle w:val="Heading3"/>
@@ -7719,8 +7690,8 @@
         </w:pict>
       </w:r>
     </w:p>
-    <w:bookmarkEnd w:id="76"/>
-    <w:bookmarkStart w:id="77" w:name="phase-6---start-in-monitor-mode"/>
+    <w:bookmarkEnd w:id="75"/>
+    <w:bookmarkStart w:id="76" w:name="phase-6---start-in-monitor-mode"/>
     <w:p>
       <w:pPr>
         <w:pStyle w:val="Heading3"/>
@@ -7844,8 +7815,8 @@
         </w:pict>
       </w:r>
     </w:p>
-    <w:bookmarkEnd w:id="77"/>
-    <w:bookmarkStart w:id="78" w:name="phase-7---enforce-in-a-controlled-scope"/>
+    <w:bookmarkEnd w:id="76"/>
+    <w:bookmarkStart w:id="77" w:name="phase-7---enforce-in-a-controlled-scope"/>
     <w:p>
       <w:pPr>
         <w:pStyle w:val="Heading3"/>
@@ -8005,8 +7976,8 @@
         </w:pict>
       </w:r>
     </w:p>
-    <w:bookmarkEnd w:id="78"/>
-    <w:bookmarkStart w:id="79" w:name="phase-8---operationalize"/>
+    <w:bookmarkEnd w:id="77"/>
+    <w:bookmarkStart w:id="78" w:name="phase-8---operationalize"/>
     <w:p>
       <w:pPr>
         <w:pStyle w:val="Heading3"/>
@@ -8164,9 +8135,9 @@
         </w:pict>
       </w:r>
     </w:p>
+    <w:bookmarkEnd w:id="78"/>
     <w:bookmarkEnd w:id="79"/>
-    <w:bookmarkEnd w:id="80"/>
-    <w:bookmarkStart w:id="81" w:name="X67792f16bd81b6e95001d9627ef1e2127c941c5"/>
+    <w:bookmarkStart w:id="80" w:name="X67792f16bd81b6e95001d9627ef1e2127c941c5"/>
     <w:p>
       <w:pPr>
         <w:pStyle w:val="Heading2"/>
@@ -8380,8 +8351,8 @@
         </w:pict>
       </w:r>
     </w:p>
-    <w:bookmarkEnd w:id="81"/>
-    <w:bookmarkStart w:id="82" w:name="Xe3d4887c83d95160b9d75f09aebe5899dbbe065"/>
+    <w:bookmarkEnd w:id="80"/>
+    <w:bookmarkStart w:id="81" w:name="Xe3d4887c83d95160b9d75f09aebe5899dbbe065"/>
     <w:p>
       <w:pPr>
         <w:pStyle w:val="Heading2"/>
@@ -8819,8 +8790,8 @@
         </w:pict>
       </w:r>
     </w:p>
-    <w:bookmarkEnd w:id="82"/>
-    <w:bookmarkStart w:id="83" w:name="X3a0851872a13412add7784181f5bc7c74c6084b"/>
+    <w:bookmarkEnd w:id="81"/>
+    <w:bookmarkStart w:id="82" w:name="X3a0851872a13412add7784181f5bc7c74c6084b"/>
     <w:p>
       <w:pPr>
         <w:pStyle w:val="Heading2"/>
@@ -9042,8 +9013,8 @@
         </w:pict>
       </w:r>
     </w:p>
-    <w:bookmarkEnd w:id="83"/>
-    <w:bookmarkStart w:id="84" w:name="Xfed9d69b88147d94e8bc0dfd5dae9f34760df84"/>
+    <w:bookmarkEnd w:id="82"/>
+    <w:bookmarkStart w:id="83" w:name="Xfed9d69b88147d94e8bc0dfd5dae9f34760df84"/>
     <w:p>
       <w:pPr>
         <w:pStyle w:val="Heading2"/>
@@ -9177,8 +9148,8 @@
         </w:pict>
       </w:r>
     </w:p>
-    <w:bookmarkEnd w:id="84"/>
-    <w:bookmarkStart w:id="88" w:name="X79e47e825b80098b108f07de62e27975790b823"/>
+    <w:bookmarkEnd w:id="83"/>
+    <w:bookmarkStart w:id="87" w:name="X79e47e825b80098b108f07de62e27975790b823"/>
     <w:p>
       <w:pPr>
         <w:pStyle w:val="Heading2"/>
@@ -9239,7 +9210,7 @@
             <w:pPr>
               <w:pStyle w:val="Compact"/>
             </w:pPr>
-            <w:hyperlink r:id="rId85">
+            <w:hyperlink r:id="rId84">
               <w:r>
                 <w:rPr>
                   <w:rStyle w:val="Hyperlink"/>
@@ -9268,7 +9239,7 @@
             <w:pPr>
               <w:pStyle w:val="Compact"/>
             </w:pPr>
-            <w:hyperlink r:id="rId86">
+            <w:hyperlink r:id="rId85">
               <w:r>
                 <w:rPr>
                   <w:rStyle w:val="Hyperlink"/>
@@ -9346,7 +9317,7 @@
       <w:r>
         <w:t xml:space="preserve"> </w:t>
       </w:r>
-      <w:hyperlink r:id="rId87">
+      <w:hyperlink r:id="rId86">
         <w:r>
           <w:rPr>
             <w:rStyle w:val="Hyperlink"/>
@@ -9365,8 +9336,8 @@
         </w:pict>
       </w:r>
     </w:p>
+    <w:bookmarkEnd w:id="87"/>
     <w:bookmarkEnd w:id="88"/>
-    <w:bookmarkEnd w:id="89"/>
     <w:sectPr>
       <w:footnotePr>
         <w:numRestart w:val="eachSect"/>

</xml_diff>